<commit_message>
Rewrite cascade prompt, drop node icon, resizable assistant sidebar
Co-Authored-By: Claude Sonnet 5.5 <noreply@anthropic.com>
Claude-Session: https://claude.ai/code/session_01BwGpqARRukchuVN39hPaRP
</commit_message>
<xml_diff>
--- a/docs/PRD-workspace-doctor.docx
+++ b/docs/PRD-workspace-doctor.docx
@@ -63,7 +63,7 @@
         <w:pStyle w:val="Subtitle"/>
       </w:pPr>
       <w:r>
-        <w:t xml:space="preserve">v1.0</w:t>
+        <w:t xml:space="preserve">v1.1</w:t>
       </w:r>
       <w:r>
         <w:t xml:space="preserve"> </w:t>
@@ -140,10 +140,10 @@
           <w:bCs/>
           <w:b/>
         </w:rPr>
-        <w:t xml:space="preserve">每个创作区块右上角的三枚交互图标</w:t>
-      </w:r>
-      <w:r>
-        <w:t xml:space="preserve">：总节点 / 评估 / 重写（取代原先放在页面右上角的「剧本医生」大按钮，AI 助手输入框里的「剧本医生」同步删除）。</w:t>
+        <w:t xml:space="preserve">每个创作区块右上角的两枚交互图标</w:t>
+      </w:r>
+      <w:r>
+        <w:t xml:space="preserve">：评估 / 重写（取代原先放在页面右上角的「剧本医生」大按钮，AI 助手输入框里的「剧本医生」同步删除）。</w:t>
       </w:r>
     </w:p>
     <w:p>
@@ -159,10 +159,29 @@
           <w:bCs/>
           <w:b/>
         </w:rPr>
-        <w:t xml:space="preserve">非全屏时 AI 助手自动收起</w:t>
-      </w:r>
-      <w:r>
-        <w:t xml:space="preserve">，用「小机器人图标」呼出，鼠标悬停提示「AI助手」。</w:t>
+        <w:t xml:space="preserve">重写的联动提醒</w:t>
+      </w:r>
+      <w:r>
+        <w:t xml:space="preserve">：改上游内容可能影响下游，重写前弹窗询问是否全部重写。</w:t>
+      </w:r>
+    </w:p>
+    <w:p>
+      <w:pPr>
+        <w:numPr>
+          <w:ilvl w:val="0"/>
+          <w:numId w:val="1001"/>
+        </w:numPr>
+        <w:pStyle w:val="Compact"/>
+      </w:pPr>
+      <w:r>
+        <w:rPr>
+          <w:bCs/>
+          <w:b/>
+        </w:rPr>
+        <w:t xml:space="preserve">AI 助手</w:t>
+      </w:r>
+      <w:r>
+        <w:t xml:space="preserve">：非全屏时自动收起，用「小机器人图标」呼出，悬停提示「AI助手」；侧栏宽度可拖动调整。</w:t>
       </w:r>
     </w:p>
     <w:p>
@@ -183,13 +202,13 @@
       </w:r>
     </w:p>
     <w:bookmarkEnd w:id="20"/>
-    <w:bookmarkStart w:id="37" w:name="区块右上角三图标"/>
+    <w:bookmarkStart w:id="33" w:name="区块右上角两图标"/>
     <w:p>
       <w:pPr>
         <w:pStyle w:val="Heading1"/>
       </w:pPr>
       <w:r>
-        <w:t xml:space="preserve">1. 区块右上角三图标</w:t>
+        <w:t xml:space="preserve">1. 区块右上角两图标</w:t>
       </w:r>
     </w:p>
     <w:bookmarkStart w:id="27" w:name="位置与形态"/>
@@ -216,7 +235,7 @@
         <w:t xml:space="preserve">区块标题行的右侧</w:t>
       </w:r>
       <w:r>
-        <w:t xml:space="preserve">（即页面截图中红框的位置）放一个小工具条，从左到右三枚图标，纯图标 + 悬停文字：</w:t>
+        <w:t xml:space="preserve">（即页面截图中红框的位置）放一个小工具条，从左到右两枚图标，纯图标 + 悬停文字：</w:t>
       </w:r>
     </w:p>
     <w:tbl>
@@ -306,63 +325,6 @@
               <w:jc w:val="left"/>
             </w:pPr>
             <w:r>
-              <w:t xml:space="preserve">叠层</w:t>
-            </w:r>
-          </w:p>
-        </w:tc>
-        <w:tc>
-          <w:tcPr/>
-          <w:p>
-            <w:pPr>
-              <w:pStyle w:val="Compact"/>
-              <w:jc w:val="left"/>
-            </w:pPr>
-            <w:r>
-              <w:t xml:space="preserve">总节点（后续开放）</w:t>
-            </w:r>
-          </w:p>
-        </w:tc>
-        <w:tc>
-          <w:tcPr/>
-          <w:p>
-            <w:pPr>
-              <w:pStyle w:val="Compact"/>
-              <w:jc w:val="left"/>
-            </w:pPr>
-            <w:r>
-              <w:t xml:space="preserve">点开可选择不同阶段（创意 / 策划案 / 集纲 / 剧本）。</w:t>
-            </w:r>
-            <w:r>
-              <w:rPr>
-                <w:bCs/>
-                <w:b/>
-              </w:rPr>
-              <w:t xml:space="preserve">本期只放入口与弹层，选项置灰，标「后续开放」</w:t>
-            </w:r>
-          </w:p>
-        </w:tc>
-      </w:tr>
-      <w:tr>
-        <w:tc>
-          <w:tcPr/>
-          <w:p>
-            <w:pPr>
-              <w:pStyle w:val="Compact"/>
-              <w:jc w:val="left"/>
-            </w:pPr>
-            <w:r>
-              <w:t xml:space="preserve">2</w:t>
-            </w:r>
-          </w:p>
-        </w:tc>
-        <w:tc>
-          <w:tcPr/>
-          <w:p>
-            <w:pPr>
-              <w:pStyle w:val="Compact"/>
-              <w:jc w:val="left"/>
-            </w:pPr>
-            <w:r>
               <w:t xml:space="preserve">清单打勾</w:t>
             </w:r>
           </w:p>
@@ -411,7 +373,7 @@
               <w:jc w:val="left"/>
             </w:pPr>
             <w:r>
-              <w:t xml:space="preserve">3</w:t>
+              <w:t xml:space="preserve">2</w:t>
             </w:r>
           </w:p>
         </w:tc>
@@ -465,6 +427,14 @@
     </w:tbl>
     <w:p>
       <w:pPr>
+        <w:pStyle w:val="BlockText"/>
+      </w:pPr>
+      <w:r>
+        <w:t xml:space="preserve">「总节点」入口已取消，只保留评估与重写。</w:t>
+      </w:r>
+    </w:p>
+    <w:p>
+      <w:pPr>
         <w:pStyle w:val="CaptionedFigure"/>
       </w:pPr>
       <w:r>
@@ -472,7 +442,7 @@
           <wp:inline>
             <wp:extent cx="5334000" cy="3200400"/>
             <wp:effectExtent b="0" l="0" r="0" t="0"/>
-            <wp:docPr descr="创意阶段：区块右上角三图标" title="" id="22" name="Picture"/>
+            <wp:docPr descr="创意阶段：区块右上角两图标" title="" id="22" name="Picture"/>
             <a:graphic>
               <a:graphicData uri="http://schemas.openxmlformats.org/drawingml/2006/picture">
                 <pic:pic>
@@ -515,7 +485,7 @@
         <w:pStyle w:val="ImageCaption"/>
       </w:pPr>
       <w:r>
-        <w:t xml:space="preserve">创意阶段：区块右上角三图标</w:t>
+        <w:t xml:space="preserve">创意阶段：区块右上角两图标</w:t>
       </w:r>
     </w:p>
     <w:p>
@@ -695,19 +665,26 @@
               <w:jc w:val="left"/>
             </w:pPr>
             <w:r>
-              <w:t xml:space="preserve">「策划案」一个区块</w:t>
-            </w:r>
-          </w:p>
-        </w:tc>
-        <w:tc>
-          <w:tcPr/>
-          <w:p>
-            <w:pPr>
-              <w:pStyle w:val="Compact"/>
-              <w:jc w:val="left"/>
-            </w:pPr>
-            <w:r>
-              <w:t xml:space="preserve">整份策划案</w:t>
+              <w:rPr>
+                <w:bCs/>
+                <w:b/>
+              </w:rPr>
+              <w:t xml:space="preserve">「人物小传」「策划案」两个区块</w:t>
+            </w:r>
+            <w:r>
+              <w:t xml:space="preserve">（各自有图标）</w:t>
+            </w:r>
+          </w:p>
+        </w:tc>
+        <w:tc>
+          <w:tcPr/>
+          <w:p>
+            <w:pPr>
+              <w:pStyle w:val="Compact"/>
+              <w:jc w:val="left"/>
+            </w:pPr>
+            <w:r>
+              <w:t xml:space="preserve">对应区块</w:t>
             </w:r>
           </w:p>
         </w:tc>
@@ -812,21 +789,57 @@
       </w:r>
     </w:p>
     <w:bookmarkEnd w:id="28"/>
-    <w:bookmarkStart w:id="32" w:name="总节点弹层"/>
+    <w:bookmarkStart w:id="32" w:name="与其它入口的关系"/>
     <w:p>
       <w:pPr>
         <w:pStyle w:val="Heading2"/>
       </w:pPr>
       <w:r>
-        <w:t xml:space="preserve">1.3 总节点弹层</w:t>
-      </w:r>
-    </w:p>
-    <w:p>
-      <w:pPr>
-        <w:pStyle w:val="FirstParagraph"/>
-      </w:pPr>
-      <w:r>
-        <w:t xml:space="preserve">点击第 1 枚图标，在图标下方弹出小弹层：列出 创意 / 策划案 / 集纲 / 剧本，当前阶段高亮标「当前」，其余标「后续开放」，不可点。点空白或按 Esc 关闭。后续迭代再做跨阶段的一键评估 / 重写。</w:t>
+        <w:t xml:space="preserve">1.3 与其它入口的关系</w:t>
+      </w:r>
+    </w:p>
+    <w:p>
+      <w:pPr>
+        <w:numPr>
+          <w:ilvl w:val="0"/>
+          <w:numId w:val="1002"/>
+        </w:numPr>
+        <w:pStyle w:val="Compact"/>
+      </w:pPr>
+      <w:r>
+        <w:t xml:space="preserve">原「页面右上角剧本医生」按钮：</w:t>
+      </w:r>
+      <w:r>
+        <w:rPr>
+          <w:bCs/>
+          <w:b/>
+        </w:rPr>
+        <w:t xml:space="preserve">取消</w:t>
+      </w:r>
+      <w:r>
+        <w:t xml:space="preserve">。</w:t>
+      </w:r>
+    </w:p>
+    <w:p>
+      <w:pPr>
+        <w:numPr>
+          <w:ilvl w:val="0"/>
+          <w:numId w:val="1002"/>
+        </w:numPr>
+        <w:pStyle w:val="Compact"/>
+      </w:pPr>
+      <w:r>
+        <w:t xml:space="preserve">AI 助手输入框里的「剧本医生」：</w:t>
+      </w:r>
+      <w:r>
+        <w:rPr>
+          <w:bCs/>
+          <w:b/>
+        </w:rPr>
+        <w:t xml:space="preserve">删除</w:t>
+      </w:r>
+      <w:r>
+        <w:t xml:space="preserve">。输入框只保留「作用于：当前阶段」与发送。</w:t>
       </w:r>
     </w:p>
     <w:p>
@@ -838,12 +851,12 @@
           <wp:inline>
             <wp:extent cx="5334000" cy="3200400"/>
             <wp:effectExtent b="0" l="0" r="0" t="0"/>
-            <wp:docPr descr="总节点弹层" title="" id="30" name="Picture"/>
+            <wp:docPr descr="AI 助手中已无剧本医生" title="" id="30" name="Picture"/>
             <a:graphic>
               <a:graphicData uri="http://schemas.openxmlformats.org/drawingml/2006/picture">
                 <pic:pic>
                   <pic:nvPicPr>
-                    <pic:cNvPr descr="wd-img/w03-nodes.jpg" id="31" name="Picture"/>
+                    <pic:cNvPr descr="wd-img/w12-assistant-no-doctor.jpg" id="31" name="Picture"/>
                     <pic:cNvPicPr>
                       <a:picLocks noChangeArrowheads="1" noChangeAspect="1"/>
                     </pic:cNvPicPr>
@@ -881,61 +894,171 @@
         <w:pStyle w:val="ImageCaption"/>
       </w:pPr>
       <w:r>
-        <w:t xml:space="preserve">总节点弹层</w:t>
+        <w:t xml:space="preserve">AI 助手中已无剧本医生</w:t>
       </w:r>
     </w:p>
     <w:bookmarkEnd w:id="32"/>
-    <w:bookmarkStart w:id="36" w:name="与其它入口的关系"/>
-    <w:p>
-      <w:pPr>
-        <w:pStyle w:val="Heading2"/>
-      </w:pPr>
-      <w:r>
-        <w:t xml:space="preserve">1.4 与其它入口的关系</w:t>
-      </w:r>
-    </w:p>
-    <w:p>
-      <w:pPr>
-        <w:numPr>
-          <w:ilvl w:val="0"/>
-          <w:numId w:val="1002"/>
-        </w:numPr>
-        <w:pStyle w:val="Compact"/>
-      </w:pPr>
-      <w:r>
-        <w:t xml:space="preserve">原「页面右上角剧本医生」按钮：</w:t>
-      </w:r>
+    <w:bookmarkEnd w:id="33"/>
+    <w:bookmarkStart w:id="53" w:name="评估只出报告不改原文"/>
+    <w:p>
+      <w:pPr>
+        <w:pStyle w:val="Heading1"/>
+      </w:pPr>
+      <w:r>
+        <w:t xml:space="preserve">2. 评估（只出报告，不改原文）</w:t>
+      </w:r>
+    </w:p>
+    <w:p>
+      <w:pPr>
+        <w:pStyle w:val="FirstParagraph"/>
+      </w:pPr>
       <w:r>
         <w:rPr>
           <w:bCs/>
           <w:b/>
         </w:rPr>
-        <w:t xml:space="preserve">取消</w:t>
-      </w:r>
-      <w:r>
-        <w:t xml:space="preserve">。</w:t>
+        <w:t xml:space="preserve">原则：评估只输出报告和意见，不帮写、不重写、不修改任何原文。</w:t>
+      </w:r>
+    </w:p>
+    <w:bookmarkStart w:id="43" w:name="流程"/>
+    <w:p>
+      <w:pPr>
+        <w:pStyle w:val="Heading2"/>
+      </w:pPr>
+      <w:r>
+        <w:t xml:space="preserve">2.1 流程</w:t>
       </w:r>
     </w:p>
     <w:p>
       <w:pPr>
         <w:numPr>
           <w:ilvl w:val="0"/>
-          <w:numId w:val="1002"/>
+          <w:numId w:val="1003"/>
         </w:numPr>
         <w:pStyle w:val="Compact"/>
       </w:pPr>
       <w:r>
-        <w:t xml:space="preserve">AI 助手输入框里的「剧本医生」：</w:t>
+        <w:t xml:space="preserve">点击区块的「评估」→ 右侧栏切到「评估报告」页签，显示扫描进度（约 2 秒）。</w:t>
+      </w:r>
+    </w:p>
+    <w:p>
+      <w:pPr>
+        <w:numPr>
+          <w:ilvl w:val="0"/>
+          <w:numId w:val="1003"/>
+        </w:numPr>
+        <w:pStyle w:val="Compact"/>
+      </w:pPr>
+      <w:r>
+        <w:t xml:space="preserve">出报告：</w:t>
+      </w:r>
+    </w:p>
+    <w:p>
+      <w:pPr>
+        <w:numPr>
+          <w:ilvl w:val="1"/>
+          <w:numId w:val="1004"/>
+        </w:numPr>
+        <w:pStyle w:val="Compact"/>
+      </w:pPr>
+      <w:r>
+        <w:t xml:space="preserve">总分环 + 状态（✓ 良好 ≥75 / ! 一般 60–74 / ✕ 待加强 &lt;60，</w:t>
       </w:r>
       <w:r>
         <w:rPr>
           <w:bCs/>
           <w:b/>
         </w:rPr>
-        <w:t xml:space="preserve">删除</w:t>
-      </w:r>
-      <w:r>
-        <w:t xml:space="preserve">。输入框只保留「作用于：当前阶段」与发送。</w:t>
+        <w:t xml:space="preserve">状态一律“图标 + 文字”，不只靠颜色</w:t>
+      </w:r>
+      <w:r>
+        <w:t xml:space="preserve">）；</w:t>
+      </w:r>
+    </w:p>
+    <w:p>
+      <w:pPr>
+        <w:numPr>
+          <w:ilvl w:val="1"/>
+          <w:numId w:val="1004"/>
+        </w:numPr>
+        <w:pStyle w:val="Compact"/>
+      </w:pPr>
+      <w:r>
+        <w:t xml:space="preserve">分项条形（每个阶段 4 个维度，见 2.3）；</w:t>
+      </w:r>
+    </w:p>
+    <w:p>
+      <w:pPr>
+        <w:numPr>
+          <w:ilvl w:val="1"/>
+          <w:numId w:val="1004"/>
+        </w:numPr>
+        <w:pStyle w:val="Compact"/>
+      </w:pPr>
+      <w:r>
+        <w:t xml:space="preserve">修改意见列表，编号 1、2、3……；</w:t>
+      </w:r>
+    </w:p>
+    <w:p>
+      <w:pPr>
+        <w:numPr>
+          <w:ilvl w:val="0"/>
+          <w:numId w:val="1003"/>
+        </w:numPr>
+        <w:pStyle w:val="Compact"/>
+      </w:pPr>
+      <w:r>
+        <w:rPr>
+          <w:bCs/>
+          <w:b/>
+        </w:rPr>
+        <w:t xml:space="preserve">同步在原文里标注</w:t>
+      </w:r>
+      <w:r>
+        <w:t xml:space="preserve">：有问题的原句加波浪下划线与底色（红 = 需修改、黄 = 建议），句尾带同编号的小圆标。</w:t>
+      </w:r>
+    </w:p>
+    <w:p>
+      <w:pPr>
+        <w:numPr>
+          <w:ilvl w:val="0"/>
+          <w:numId w:val="1003"/>
+        </w:numPr>
+        <w:pStyle w:val="Compact"/>
+      </w:pPr>
+      <w:r>
+        <w:t xml:space="preserve">点击报告里的某条意见 → 原文滚动到该句并高亮；反向，点原文里的圆标 → 右侧对应意见高亮。</w:t>
+      </w:r>
+    </w:p>
+    <w:p>
+      <w:pPr>
+        <w:numPr>
+          <w:ilvl w:val="0"/>
+          <w:numId w:val="1003"/>
+        </w:numPr>
+        <w:pStyle w:val="Compact"/>
+      </w:pPr>
+      <w:r>
+        <w:t xml:space="preserve">区块的「评估」图标右上角出现红色数字角标（意见数）；左侧树对应节点同步显示总数。</w:t>
+      </w:r>
+    </w:p>
+    <w:p>
+      <w:pPr>
+        <w:numPr>
+          <w:ilvl w:val="0"/>
+          <w:numId w:val="1003"/>
+        </w:numPr>
+        <w:pStyle w:val="Compact"/>
+      </w:pPr>
+      <w:r>
+        <w:t xml:space="preserve">报告底部固定提示：「评估只给意见，不改动、不重写原文。需要修改请点该区块右上角的『重写』」。</w:t>
+      </w:r>
+      <w:r>
+        <w:rPr>
+          <w:bCs/>
+          <w:b/>
+        </w:rPr>
+        <w:t xml:space="preserve">报告里没有任何修改类按钮。</w:t>
       </w:r>
     </w:p>
     <w:p>
@@ -947,18 +1070,18 @@
           <wp:inline>
             <wp:extent cx="5334000" cy="3200400"/>
             <wp:effectExtent b="0" l="0" r="0" t="0"/>
-            <wp:docPr descr="AI 助手中已无剧本医生" title="" id="34" name="Picture"/>
+            <wp:docPr descr="扫描中" title="" id="35" name="Picture"/>
             <a:graphic>
               <a:graphicData uri="http://schemas.openxmlformats.org/drawingml/2006/picture">
                 <pic:pic>
                   <pic:nvPicPr>
-                    <pic:cNvPr descr="wd-img/w12-assistant-no-doctor.jpg" id="35" name="Picture"/>
+                    <pic:cNvPr descr="wd-img/w04-scan.jpg" id="36" name="Picture"/>
                     <pic:cNvPicPr>
                       <a:picLocks noChangeArrowheads="1" noChangeAspect="1"/>
                     </pic:cNvPicPr>
                   </pic:nvPicPr>
                   <pic:blipFill>
-                    <a:blip r:embed="rId33"/>
+                    <a:blip r:embed="rId34"/>
                     <a:stretch>
                       <a:fillRect/>
                     </a:stretch>
@@ -990,171 +1113,7 @@
         <w:pStyle w:val="ImageCaption"/>
       </w:pPr>
       <w:r>
-        <w:t xml:space="preserve">AI 助手中已无剧本医生</w:t>
-      </w:r>
-    </w:p>
-    <w:bookmarkEnd w:id="36"/>
-    <w:bookmarkEnd w:id="37"/>
-    <w:bookmarkStart w:id="57" w:name="评估只出报告不改原文"/>
-    <w:p>
-      <w:pPr>
-        <w:pStyle w:val="Heading1"/>
-      </w:pPr>
-      <w:r>
-        <w:t xml:space="preserve">2. 评估（只出报告，不改原文）</w:t>
-      </w:r>
-    </w:p>
-    <w:p>
-      <w:pPr>
-        <w:pStyle w:val="FirstParagraph"/>
-      </w:pPr>
-      <w:r>
-        <w:rPr>
-          <w:bCs/>
-          <w:b/>
-        </w:rPr>
-        <w:t xml:space="preserve">原则：评估只输出报告和意见，不帮写、不重写、不修改任何原文。</w:t>
-      </w:r>
-    </w:p>
-    <w:bookmarkStart w:id="47" w:name="流程"/>
-    <w:p>
-      <w:pPr>
-        <w:pStyle w:val="Heading2"/>
-      </w:pPr>
-      <w:r>
-        <w:t xml:space="preserve">2.1 流程</w:t>
-      </w:r>
-    </w:p>
-    <w:p>
-      <w:pPr>
-        <w:numPr>
-          <w:ilvl w:val="0"/>
-          <w:numId w:val="1003"/>
-        </w:numPr>
-        <w:pStyle w:val="Compact"/>
-      </w:pPr>
-      <w:r>
-        <w:t xml:space="preserve">点击区块的「评估」→ 右侧栏切到「评估报告」页签，显示扫描进度（约 2 秒）。</w:t>
-      </w:r>
-    </w:p>
-    <w:p>
-      <w:pPr>
-        <w:numPr>
-          <w:ilvl w:val="0"/>
-          <w:numId w:val="1003"/>
-        </w:numPr>
-        <w:pStyle w:val="Compact"/>
-      </w:pPr>
-      <w:r>
-        <w:t xml:space="preserve">出报告：</w:t>
-      </w:r>
-    </w:p>
-    <w:p>
-      <w:pPr>
-        <w:numPr>
-          <w:ilvl w:val="1"/>
-          <w:numId w:val="1004"/>
-        </w:numPr>
-        <w:pStyle w:val="Compact"/>
-      </w:pPr>
-      <w:r>
-        <w:t xml:space="preserve">总分环 + 状态（✓ 良好 ≥75 / ! 一般 60–74 / ✕ 待加强 &lt;60，</w:t>
-      </w:r>
-      <w:r>
-        <w:rPr>
-          <w:bCs/>
-          <w:b/>
-        </w:rPr>
-        <w:t xml:space="preserve">状态一律“图标 + 文字”，不只靠颜色</w:t>
-      </w:r>
-      <w:r>
-        <w:t xml:space="preserve">）；</w:t>
-      </w:r>
-    </w:p>
-    <w:p>
-      <w:pPr>
-        <w:numPr>
-          <w:ilvl w:val="1"/>
-          <w:numId w:val="1004"/>
-        </w:numPr>
-        <w:pStyle w:val="Compact"/>
-      </w:pPr>
-      <w:r>
-        <w:t xml:space="preserve">分项条形（每个阶段 4 个维度，见 2.3）；</w:t>
-      </w:r>
-    </w:p>
-    <w:p>
-      <w:pPr>
-        <w:numPr>
-          <w:ilvl w:val="1"/>
-          <w:numId w:val="1004"/>
-        </w:numPr>
-        <w:pStyle w:val="Compact"/>
-      </w:pPr>
-      <w:r>
-        <w:t xml:space="preserve">修改意见列表，编号 1、2、3……；</w:t>
-      </w:r>
-    </w:p>
-    <w:p>
-      <w:pPr>
-        <w:numPr>
-          <w:ilvl w:val="0"/>
-          <w:numId w:val="1003"/>
-        </w:numPr>
-        <w:pStyle w:val="Compact"/>
-      </w:pPr>
-      <w:r>
-        <w:rPr>
-          <w:bCs/>
-          <w:b/>
-        </w:rPr>
-        <w:t xml:space="preserve">同步在原文里标注</w:t>
-      </w:r>
-      <w:r>
-        <w:t xml:space="preserve">：有问题的原句加波浪下划线与底色（红 = 需修改、黄 = 建议），句尾带同编号的小圆标。</w:t>
-      </w:r>
-    </w:p>
-    <w:p>
-      <w:pPr>
-        <w:numPr>
-          <w:ilvl w:val="0"/>
-          <w:numId w:val="1003"/>
-        </w:numPr>
-        <w:pStyle w:val="Compact"/>
-      </w:pPr>
-      <w:r>
-        <w:t xml:space="preserve">点击报告里的某条意见 → 原文滚动到该句并高亮；反向，点原文里的圆标 → 右侧对应意见高亮。</w:t>
-      </w:r>
-    </w:p>
-    <w:p>
-      <w:pPr>
-        <w:numPr>
-          <w:ilvl w:val="0"/>
-          <w:numId w:val="1003"/>
-        </w:numPr>
-        <w:pStyle w:val="Compact"/>
-      </w:pPr>
-      <w:r>
-        <w:t xml:space="preserve">区块的「评估」图标右上角出现红色数字角标（意见数）；左侧树对应节点同步显示总数。</w:t>
-      </w:r>
-    </w:p>
-    <w:p>
-      <w:pPr>
-        <w:numPr>
-          <w:ilvl w:val="0"/>
-          <w:numId w:val="1003"/>
-        </w:numPr>
-        <w:pStyle w:val="Compact"/>
-      </w:pPr>
-      <w:r>
-        <w:t xml:space="preserve">报告底部固定提示：「评估只给意见，不改动、不重写原文。需要修改请点该区块右上角的『重写』」。</w:t>
-      </w:r>
-      <w:r>
-        <w:rPr>
-          <w:bCs/>
-          <w:b/>
-        </w:rPr>
-        <w:t xml:space="preserve">报告里没有任何修改类按钮。</w:t>
+        <w:t xml:space="preserve">扫描中</w:t>
       </w:r>
     </w:p>
     <w:p>
@@ -1166,18 +1125,18 @@
           <wp:inline>
             <wp:extent cx="5334000" cy="3200400"/>
             <wp:effectExtent b="0" l="0" r="0" t="0"/>
-            <wp:docPr descr="扫描中" title="" id="39" name="Picture"/>
+            <wp:docPr descr="评估报告 + 原文标红编号" title="" id="38" name="Picture"/>
             <a:graphic>
               <a:graphicData uri="http://schemas.openxmlformats.org/drawingml/2006/picture">
                 <pic:pic>
                   <pic:nvPicPr>
-                    <pic:cNvPr descr="wd-img/w04-scan.jpg" id="40" name="Picture"/>
+                    <pic:cNvPr descr="wd-img/w05-report.jpg" id="39" name="Picture"/>
                     <pic:cNvPicPr>
                       <a:picLocks noChangeArrowheads="1" noChangeAspect="1"/>
                     </pic:cNvPicPr>
                   </pic:nvPicPr>
                   <pic:blipFill>
-                    <a:blip r:embed="rId38"/>
+                    <a:blip r:embed="rId37"/>
                     <a:stretch>
                       <a:fillRect/>
                     </a:stretch>
@@ -1209,7 +1168,7 @@
         <w:pStyle w:val="ImageCaption"/>
       </w:pPr>
       <w:r>
-        <w:t xml:space="preserve">扫描中</w:t>
+        <w:t xml:space="preserve">评估报告 + 原文标红编号</w:t>
       </w:r>
     </w:p>
     <w:p>
@@ -1221,18 +1180,18 @@
           <wp:inline>
             <wp:extent cx="5334000" cy="3200400"/>
             <wp:effectExtent b="0" l="0" r="0" t="0"/>
-            <wp:docPr descr="评估报告 + 原文标红编号" title="" id="42" name="Picture"/>
+            <wp:docPr descr="点击意见 4，跳转并高亮原文" title="" id="41" name="Picture"/>
             <a:graphic>
               <a:graphicData uri="http://schemas.openxmlformats.org/drawingml/2006/picture">
                 <pic:pic>
                   <pic:nvPicPr>
-                    <pic:cNvPr descr="wd-img/w05-report.jpg" id="43" name="Picture"/>
+                    <pic:cNvPr descr="wd-img/w06-jump.jpg" id="42" name="Picture"/>
                     <pic:cNvPicPr>
                       <a:picLocks noChangeArrowheads="1" noChangeAspect="1"/>
                     </pic:cNvPicPr>
                   </pic:nvPicPr>
                   <pic:blipFill>
-                    <a:blip r:embed="rId41"/>
+                    <a:blip r:embed="rId40"/>
                     <a:stretch>
                       <a:fillRect/>
                     </a:stretch>
@@ -1264,7 +1223,387 @@
         <w:pStyle w:val="ImageCaption"/>
       </w:pPr>
       <w:r>
-        <w:t xml:space="preserve">评估报告 + 原文标红编号</w:t>
+        <w:t xml:space="preserve">点击意见 4，跳转并高亮原文</w:t>
+      </w:r>
+    </w:p>
+    <w:bookmarkEnd w:id="43"/>
+    <w:bookmarkStart w:id="44" w:name="意见条目字段"/>
+    <w:p>
+      <w:pPr>
+        <w:pStyle w:val="Heading2"/>
+      </w:pPr>
+      <w:r>
+        <w:t xml:space="preserve">2.2 意见条目字段</w:t>
+      </w:r>
+    </w:p>
+    <w:tbl>
+      <w:tblPr>
+        <w:tblStyle w:val="Table"/>
+        <w:tblW w:type="auto" w:w="0"/>
+        <w:tblLook w:firstRow="1" w:lastRow="0" w:firstColumn="0" w:lastColumn="0" w:noHBand="0" w:noVBand="0" w:val="0020"/>
+        <w:jc w:val="start"/>
+      </w:tblPr>
+      <w:tblGrid>
+        <w:gridCol w:w="3960"/>
+        <w:gridCol w:w="3960"/>
+      </w:tblGrid>
+      <w:tr>
+        <w:trPr>
+          <w:tblHeader w:val="true"/>
+        </w:trPr>
+        <w:tc>
+          <w:tcPr/>
+          <w:p>
+            <w:pPr>
+              <w:pStyle w:val="Compact"/>
+              <w:jc w:val="left"/>
+            </w:pPr>
+            <w:r>
+              <w:t xml:space="preserve">字段</w:t>
+            </w:r>
+          </w:p>
+        </w:tc>
+        <w:tc>
+          <w:tcPr/>
+          <w:p>
+            <w:pPr>
+              <w:pStyle w:val="Compact"/>
+              <w:jc w:val="left"/>
+            </w:pPr>
+            <w:r>
+              <w:t xml:space="preserve">说明</w:t>
+            </w:r>
+          </w:p>
+        </w:tc>
+      </w:tr>
+      <w:tr>
+        <w:tc>
+          <w:tcPr/>
+          <w:p>
+            <w:pPr>
+              <w:pStyle w:val="Compact"/>
+              <w:jc w:val="left"/>
+            </w:pPr>
+            <w:r>
+              <w:t xml:space="preserve">编号</w:t>
+            </w:r>
+          </w:p>
+        </w:tc>
+        <w:tc>
+          <w:tcPr/>
+          <w:p>
+            <w:pPr>
+              <w:pStyle w:val="Compact"/>
+              <w:jc w:val="left"/>
+            </w:pPr>
+            <w:r>
+              <w:t xml:space="preserve">按原文出现顺序 1、2、3…</w:t>
+            </w:r>
+          </w:p>
+        </w:tc>
+      </w:tr>
+      <w:tr>
+        <w:tc>
+          <w:tcPr/>
+          <w:p>
+            <w:pPr>
+              <w:pStyle w:val="Compact"/>
+              <w:jc w:val="left"/>
+            </w:pPr>
+            <w:r>
+              <w:t xml:space="preserve">严重度</w:t>
+            </w:r>
+          </w:p>
+        </w:tc>
+        <w:tc>
+          <w:tcPr/>
+          <w:p>
+            <w:pPr>
+              <w:pStyle w:val="Compact"/>
+              <w:jc w:val="left"/>
+            </w:pPr>
+            <w:r>
+              <w:t xml:space="preserve">✕ 需修改（红）/ ! 建议（黄）</w:t>
+            </w:r>
+          </w:p>
+        </w:tc>
+      </w:tr>
+      <w:tr>
+        <w:tc>
+          <w:tcPr/>
+          <w:p>
+            <w:pPr>
+              <w:pStyle w:val="Compact"/>
+              <w:jc w:val="left"/>
+            </w:pPr>
+            <w:r>
+              <w:t xml:space="preserve">标题</w:t>
+            </w:r>
+          </w:p>
+        </w:tc>
+        <w:tc>
+          <w:tcPr/>
+          <w:p>
+            <w:pPr>
+              <w:pStyle w:val="Compact"/>
+              <w:jc w:val="left"/>
+            </w:pPr>
+            <w:r>
+              <w:t xml:space="preserve">一句话概括问题</w:t>
+            </w:r>
+          </w:p>
+        </w:tc>
+      </w:tr>
+      <w:tr>
+        <w:tc>
+          <w:tcPr/>
+          <w:p>
+            <w:pPr>
+              <w:pStyle w:val="Compact"/>
+              <w:jc w:val="left"/>
+            </w:pPr>
+            <w:r>
+              <w:t xml:space="preserve">原文引用</w:t>
+            </w:r>
+          </w:p>
+        </w:tc>
+        <w:tc>
+          <w:tcPr/>
+          <w:p>
+            <w:pPr>
+              <w:pStyle w:val="Compact"/>
+              <w:jc w:val="left"/>
+            </w:pPr>
+            <w:r>
+              <w:t xml:space="preserve">命中的原句（过长截断）</w:t>
+            </w:r>
+          </w:p>
+        </w:tc>
+      </w:tr>
+      <w:tr>
+        <w:tc>
+          <w:tcPr/>
+          <w:p>
+            <w:pPr>
+              <w:pStyle w:val="Compact"/>
+              <w:jc w:val="left"/>
+            </w:pPr>
+            <w:r>
+              <w:t xml:space="preserve">评估意见</w:t>
+            </w:r>
+          </w:p>
+        </w:tc>
+        <w:tc>
+          <w:tcPr/>
+          <w:p>
+            <w:pPr>
+              <w:pStyle w:val="Compact"/>
+              <w:jc w:val="left"/>
+            </w:pPr>
+            <w:r>
+              <w:t xml:space="preserve">为什么是问题、往哪个方向改（</w:t>
+            </w:r>
+            <w:r>
+              <w:rPr>
+                <w:bCs/>
+                <w:b/>
+              </w:rPr>
+              <w:t xml:space="preserve">不给改好的文本</w:t>
+            </w:r>
+            <w:r>
+              <w:t xml:space="preserve">）</w:t>
+            </w:r>
+          </w:p>
+        </w:tc>
+      </w:tr>
+      <w:tr>
+        <w:tc>
+          <w:tcPr/>
+          <w:p>
+            <w:pPr>
+              <w:pStyle w:val="Compact"/>
+              <w:jc w:val="left"/>
+            </w:pPr>
+            <w:r>
+              <w:t xml:space="preserve">定位</w:t>
+            </w:r>
+          </w:p>
+        </w:tc>
+        <w:tc>
+          <w:tcPr/>
+          <w:p>
+            <w:pPr>
+              <w:pStyle w:val="Compact"/>
+              <w:jc w:val="left"/>
+            </w:pPr>
+            <w:r>
+              <w:t xml:space="preserve">「↗ 定位到原文」</w:t>
+            </w:r>
+          </w:p>
+        </w:tc>
+      </w:tr>
+    </w:tbl>
+    <w:bookmarkEnd w:id="44"/>
+    <w:bookmarkStart w:id="51" w:name="各阶段评估维度"/>
+    <w:p>
+      <w:pPr>
+        <w:pStyle w:val="Heading2"/>
+      </w:pPr>
+      <w:r>
+        <w:t xml:space="preserve">2.3 各阶段评估维度</w:t>
+      </w:r>
+    </w:p>
+    <w:tbl>
+      <w:tblPr>
+        <w:tblStyle w:val="Table"/>
+        <w:tblW w:type="auto" w:w="0"/>
+        <w:tblLook w:firstRow="1" w:lastRow="0" w:firstColumn="0" w:lastColumn="0" w:noHBand="0" w:noVBand="0" w:val="0020"/>
+        <w:jc w:val="start"/>
+      </w:tblPr>
+      <w:tblGrid>
+        <w:gridCol w:w="3960"/>
+        <w:gridCol w:w="3960"/>
+      </w:tblGrid>
+      <w:tr>
+        <w:trPr>
+          <w:tblHeader w:val="true"/>
+        </w:trPr>
+        <w:tc>
+          <w:tcPr/>
+          <w:p>
+            <w:pPr>
+              <w:pStyle w:val="Compact"/>
+              <w:jc w:val="left"/>
+            </w:pPr>
+            <w:r>
+              <w:t xml:space="preserve">阶段</w:t>
+            </w:r>
+          </w:p>
+        </w:tc>
+        <w:tc>
+          <w:tcPr/>
+          <w:p>
+            <w:pPr>
+              <w:pStyle w:val="Compact"/>
+              <w:jc w:val="left"/>
+            </w:pPr>
+            <w:r>
+              <w:t xml:space="preserve">维度</w:t>
+            </w:r>
+          </w:p>
+        </w:tc>
+      </w:tr>
+      <w:tr>
+        <w:tc>
+          <w:tcPr/>
+          <w:p>
+            <w:pPr>
+              <w:pStyle w:val="Compact"/>
+              <w:jc w:val="left"/>
+            </w:pPr>
+            <w:r>
+              <w:t xml:space="preserve">创意</w:t>
+            </w:r>
+          </w:p>
+        </w:tc>
+        <w:tc>
+          <w:tcPr/>
+          <w:p>
+            <w:pPr>
+              <w:pStyle w:val="Compact"/>
+              <w:jc w:val="left"/>
+            </w:pPr>
+            <w:r>
+              <w:t xml:space="preserve">设定新鲜度 / 人物动机 / 结构节奏 / 落地具体</w:t>
+            </w:r>
+          </w:p>
+        </w:tc>
+      </w:tr>
+      <w:tr>
+        <w:tc>
+          <w:tcPr/>
+          <w:p>
+            <w:pPr>
+              <w:pStyle w:val="Compact"/>
+              <w:jc w:val="left"/>
+            </w:pPr>
+            <w:r>
+              <w:t xml:space="preserve">策划案</w:t>
+            </w:r>
+          </w:p>
+        </w:tc>
+        <w:tc>
+          <w:tcPr/>
+          <w:p>
+            <w:pPr>
+              <w:pStyle w:val="Compact"/>
+              <w:jc w:val="left"/>
+            </w:pPr>
+            <w:r>
+              <w:t xml:space="preserve">人物立体 / 关系张力 / 主线推进 / 风险把控</w:t>
+            </w:r>
+          </w:p>
+        </w:tc>
+      </w:tr>
+      <w:tr>
+        <w:tc>
+          <w:tcPr/>
+          <w:p>
+            <w:pPr>
+              <w:pStyle w:val="Compact"/>
+              <w:jc w:val="left"/>
+            </w:pPr>
+            <w:r>
+              <w:t xml:space="preserve">集纲（单集）</w:t>
+            </w:r>
+          </w:p>
+        </w:tc>
+        <w:tc>
+          <w:tcPr/>
+          <w:p>
+            <w:pPr>
+              <w:pStyle w:val="Compact"/>
+              <w:jc w:val="left"/>
+            </w:pPr>
+            <w:r>
+              <w:t xml:space="preserve">冲突强度 / 期待点 / 转折 / 结尾钩子</w:t>
+            </w:r>
+          </w:p>
+        </w:tc>
+      </w:tr>
+      <w:tr>
+        <w:tc>
+          <w:tcPr/>
+          <w:p>
+            <w:pPr>
+              <w:pStyle w:val="Compact"/>
+              <w:jc w:val="left"/>
+            </w:pPr>
+            <w:r>
+              <w:t xml:space="preserve">剧本（单集）</w:t>
+            </w:r>
+          </w:p>
+        </w:tc>
+        <w:tc>
+          <w:tcPr/>
+          <w:p>
+            <w:pPr>
+              <w:pStyle w:val="Compact"/>
+              <w:jc w:val="left"/>
+            </w:pPr>
+            <w:r>
+              <w:t xml:space="preserve">台词口语 / 动作可拍 / 对白交锋 / 结尾钩子</w:t>
+            </w:r>
+          </w:p>
+        </w:tc>
+      </w:tr>
+    </w:tbl>
+    <w:p>
+      <w:pPr>
+        <w:pStyle w:val="BodyText"/>
+      </w:pPr>
+      <w:r>
+        <w:t xml:space="preserve">示例：集纲第 2 集、剧本 EP01 的评估：</w:t>
       </w:r>
     </w:p>
     <w:p>
@@ -1276,18 +1615,18 @@
           <wp:inline>
             <wp:extent cx="5334000" cy="3200400"/>
             <wp:effectExtent b="0" l="0" r="0" t="0"/>
-            <wp:docPr descr="点击意见 4，跳转并高亮原文" title="" id="45" name="Picture"/>
+            <wp:docPr descr="集纲单集评估" title="" id="46" name="Picture"/>
             <a:graphic>
               <a:graphicData uri="http://schemas.openxmlformats.org/drawingml/2006/picture">
                 <pic:pic>
                   <pic:nvPicPr>
-                    <pic:cNvPr descr="wd-img/w06-jump.jpg" id="46" name="Picture"/>
+                    <pic:cNvPr descr="wd-img/w10-outline-ep.jpg" id="47" name="Picture"/>
                     <pic:cNvPicPr>
                       <a:picLocks noChangeArrowheads="1" noChangeAspect="1"/>
                     </pic:cNvPicPr>
                   </pic:nvPicPr>
                   <pic:blipFill>
-                    <a:blip r:embed="rId44"/>
+                    <a:blip r:embed="rId45"/>
                     <a:stretch>
                       <a:fillRect/>
                     </a:stretch>
@@ -1319,387 +1658,7 @@
         <w:pStyle w:val="ImageCaption"/>
       </w:pPr>
       <w:r>
-        <w:t xml:space="preserve">点击意见 4，跳转并高亮原文</w:t>
-      </w:r>
-    </w:p>
-    <w:bookmarkEnd w:id="47"/>
-    <w:bookmarkStart w:id="48" w:name="意见条目字段"/>
-    <w:p>
-      <w:pPr>
-        <w:pStyle w:val="Heading2"/>
-      </w:pPr>
-      <w:r>
-        <w:t xml:space="preserve">2.2 意见条目字段</w:t>
-      </w:r>
-    </w:p>
-    <w:tbl>
-      <w:tblPr>
-        <w:tblStyle w:val="Table"/>
-        <w:tblW w:type="auto" w:w="0"/>
-        <w:tblLook w:firstRow="1" w:lastRow="0" w:firstColumn="0" w:lastColumn="0" w:noHBand="0" w:noVBand="0" w:val="0020"/>
-        <w:jc w:val="start"/>
-      </w:tblPr>
-      <w:tblGrid>
-        <w:gridCol w:w="3960"/>
-        <w:gridCol w:w="3960"/>
-      </w:tblGrid>
-      <w:tr>
-        <w:trPr>
-          <w:tblHeader w:val="true"/>
-        </w:trPr>
-        <w:tc>
-          <w:tcPr/>
-          <w:p>
-            <w:pPr>
-              <w:pStyle w:val="Compact"/>
-              <w:jc w:val="left"/>
-            </w:pPr>
-            <w:r>
-              <w:t xml:space="preserve">字段</w:t>
-            </w:r>
-          </w:p>
-        </w:tc>
-        <w:tc>
-          <w:tcPr/>
-          <w:p>
-            <w:pPr>
-              <w:pStyle w:val="Compact"/>
-              <w:jc w:val="left"/>
-            </w:pPr>
-            <w:r>
-              <w:t xml:space="preserve">说明</w:t>
-            </w:r>
-          </w:p>
-        </w:tc>
-      </w:tr>
-      <w:tr>
-        <w:tc>
-          <w:tcPr/>
-          <w:p>
-            <w:pPr>
-              <w:pStyle w:val="Compact"/>
-              <w:jc w:val="left"/>
-            </w:pPr>
-            <w:r>
-              <w:t xml:space="preserve">编号</w:t>
-            </w:r>
-          </w:p>
-        </w:tc>
-        <w:tc>
-          <w:tcPr/>
-          <w:p>
-            <w:pPr>
-              <w:pStyle w:val="Compact"/>
-              <w:jc w:val="left"/>
-            </w:pPr>
-            <w:r>
-              <w:t xml:space="preserve">按原文出现顺序 1、2、3…</w:t>
-            </w:r>
-          </w:p>
-        </w:tc>
-      </w:tr>
-      <w:tr>
-        <w:tc>
-          <w:tcPr/>
-          <w:p>
-            <w:pPr>
-              <w:pStyle w:val="Compact"/>
-              <w:jc w:val="left"/>
-            </w:pPr>
-            <w:r>
-              <w:t xml:space="preserve">严重度</w:t>
-            </w:r>
-          </w:p>
-        </w:tc>
-        <w:tc>
-          <w:tcPr/>
-          <w:p>
-            <w:pPr>
-              <w:pStyle w:val="Compact"/>
-              <w:jc w:val="left"/>
-            </w:pPr>
-            <w:r>
-              <w:t xml:space="preserve">✕ 需修改（红）/ ! 建议（黄）</w:t>
-            </w:r>
-          </w:p>
-        </w:tc>
-      </w:tr>
-      <w:tr>
-        <w:tc>
-          <w:tcPr/>
-          <w:p>
-            <w:pPr>
-              <w:pStyle w:val="Compact"/>
-              <w:jc w:val="left"/>
-            </w:pPr>
-            <w:r>
-              <w:t xml:space="preserve">标题</w:t>
-            </w:r>
-          </w:p>
-        </w:tc>
-        <w:tc>
-          <w:tcPr/>
-          <w:p>
-            <w:pPr>
-              <w:pStyle w:val="Compact"/>
-              <w:jc w:val="left"/>
-            </w:pPr>
-            <w:r>
-              <w:t xml:space="preserve">一句话概括问题</w:t>
-            </w:r>
-          </w:p>
-        </w:tc>
-      </w:tr>
-      <w:tr>
-        <w:tc>
-          <w:tcPr/>
-          <w:p>
-            <w:pPr>
-              <w:pStyle w:val="Compact"/>
-              <w:jc w:val="left"/>
-            </w:pPr>
-            <w:r>
-              <w:t xml:space="preserve">原文引用</w:t>
-            </w:r>
-          </w:p>
-        </w:tc>
-        <w:tc>
-          <w:tcPr/>
-          <w:p>
-            <w:pPr>
-              <w:pStyle w:val="Compact"/>
-              <w:jc w:val="left"/>
-            </w:pPr>
-            <w:r>
-              <w:t xml:space="preserve">命中的原句（过长截断）</w:t>
-            </w:r>
-          </w:p>
-        </w:tc>
-      </w:tr>
-      <w:tr>
-        <w:tc>
-          <w:tcPr/>
-          <w:p>
-            <w:pPr>
-              <w:pStyle w:val="Compact"/>
-              <w:jc w:val="left"/>
-            </w:pPr>
-            <w:r>
-              <w:t xml:space="preserve">评估意见</w:t>
-            </w:r>
-          </w:p>
-        </w:tc>
-        <w:tc>
-          <w:tcPr/>
-          <w:p>
-            <w:pPr>
-              <w:pStyle w:val="Compact"/>
-              <w:jc w:val="left"/>
-            </w:pPr>
-            <w:r>
-              <w:t xml:space="preserve">为什么是问题、往哪个方向改（</w:t>
-            </w:r>
-            <w:r>
-              <w:rPr>
-                <w:bCs/>
-                <w:b/>
-              </w:rPr>
-              <w:t xml:space="preserve">不给改好的文本</w:t>
-            </w:r>
-            <w:r>
-              <w:t xml:space="preserve">）</w:t>
-            </w:r>
-          </w:p>
-        </w:tc>
-      </w:tr>
-      <w:tr>
-        <w:tc>
-          <w:tcPr/>
-          <w:p>
-            <w:pPr>
-              <w:pStyle w:val="Compact"/>
-              <w:jc w:val="left"/>
-            </w:pPr>
-            <w:r>
-              <w:t xml:space="preserve">定位</w:t>
-            </w:r>
-          </w:p>
-        </w:tc>
-        <w:tc>
-          <w:tcPr/>
-          <w:p>
-            <w:pPr>
-              <w:pStyle w:val="Compact"/>
-              <w:jc w:val="left"/>
-            </w:pPr>
-            <w:r>
-              <w:t xml:space="preserve">「↗ 定位到原文」</w:t>
-            </w:r>
-          </w:p>
-        </w:tc>
-      </w:tr>
-    </w:tbl>
-    <w:bookmarkEnd w:id="48"/>
-    <w:bookmarkStart w:id="55" w:name="各阶段评估维度"/>
-    <w:p>
-      <w:pPr>
-        <w:pStyle w:val="Heading2"/>
-      </w:pPr>
-      <w:r>
-        <w:t xml:space="preserve">2.3 各阶段评估维度</w:t>
-      </w:r>
-    </w:p>
-    <w:tbl>
-      <w:tblPr>
-        <w:tblStyle w:val="Table"/>
-        <w:tblW w:type="auto" w:w="0"/>
-        <w:tblLook w:firstRow="1" w:lastRow="0" w:firstColumn="0" w:lastColumn="0" w:noHBand="0" w:noVBand="0" w:val="0020"/>
-        <w:jc w:val="start"/>
-      </w:tblPr>
-      <w:tblGrid>
-        <w:gridCol w:w="3960"/>
-        <w:gridCol w:w="3960"/>
-      </w:tblGrid>
-      <w:tr>
-        <w:trPr>
-          <w:tblHeader w:val="true"/>
-        </w:trPr>
-        <w:tc>
-          <w:tcPr/>
-          <w:p>
-            <w:pPr>
-              <w:pStyle w:val="Compact"/>
-              <w:jc w:val="left"/>
-            </w:pPr>
-            <w:r>
-              <w:t xml:space="preserve">阶段</w:t>
-            </w:r>
-          </w:p>
-        </w:tc>
-        <w:tc>
-          <w:tcPr/>
-          <w:p>
-            <w:pPr>
-              <w:pStyle w:val="Compact"/>
-              <w:jc w:val="left"/>
-            </w:pPr>
-            <w:r>
-              <w:t xml:space="preserve">维度</w:t>
-            </w:r>
-          </w:p>
-        </w:tc>
-      </w:tr>
-      <w:tr>
-        <w:tc>
-          <w:tcPr/>
-          <w:p>
-            <w:pPr>
-              <w:pStyle w:val="Compact"/>
-              <w:jc w:val="left"/>
-            </w:pPr>
-            <w:r>
-              <w:t xml:space="preserve">创意</w:t>
-            </w:r>
-          </w:p>
-        </w:tc>
-        <w:tc>
-          <w:tcPr/>
-          <w:p>
-            <w:pPr>
-              <w:pStyle w:val="Compact"/>
-              <w:jc w:val="left"/>
-            </w:pPr>
-            <w:r>
-              <w:t xml:space="preserve">设定新鲜度 / 人物动机 / 结构节奏 / 落地具体</w:t>
-            </w:r>
-          </w:p>
-        </w:tc>
-      </w:tr>
-      <w:tr>
-        <w:tc>
-          <w:tcPr/>
-          <w:p>
-            <w:pPr>
-              <w:pStyle w:val="Compact"/>
-              <w:jc w:val="left"/>
-            </w:pPr>
-            <w:r>
-              <w:t xml:space="preserve">策划案</w:t>
-            </w:r>
-          </w:p>
-        </w:tc>
-        <w:tc>
-          <w:tcPr/>
-          <w:p>
-            <w:pPr>
-              <w:pStyle w:val="Compact"/>
-              <w:jc w:val="left"/>
-            </w:pPr>
-            <w:r>
-              <w:t xml:space="preserve">人物立体 / 关系张力 / 主线推进 / 风险把控</w:t>
-            </w:r>
-          </w:p>
-        </w:tc>
-      </w:tr>
-      <w:tr>
-        <w:tc>
-          <w:tcPr/>
-          <w:p>
-            <w:pPr>
-              <w:pStyle w:val="Compact"/>
-              <w:jc w:val="left"/>
-            </w:pPr>
-            <w:r>
-              <w:t xml:space="preserve">集纲（单集）</w:t>
-            </w:r>
-          </w:p>
-        </w:tc>
-        <w:tc>
-          <w:tcPr/>
-          <w:p>
-            <w:pPr>
-              <w:pStyle w:val="Compact"/>
-              <w:jc w:val="left"/>
-            </w:pPr>
-            <w:r>
-              <w:t xml:space="preserve">冲突强度 / 期待点 / 转折 / 结尾钩子</w:t>
-            </w:r>
-          </w:p>
-        </w:tc>
-      </w:tr>
-      <w:tr>
-        <w:tc>
-          <w:tcPr/>
-          <w:p>
-            <w:pPr>
-              <w:pStyle w:val="Compact"/>
-              <w:jc w:val="left"/>
-            </w:pPr>
-            <w:r>
-              <w:t xml:space="preserve">剧本（单集）</w:t>
-            </w:r>
-          </w:p>
-        </w:tc>
-        <w:tc>
-          <w:tcPr/>
-          <w:p>
-            <w:pPr>
-              <w:pStyle w:val="Compact"/>
-              <w:jc w:val="left"/>
-            </w:pPr>
-            <w:r>
-              <w:t xml:space="preserve">台词口语 / 动作可拍 / 对白交锋 / 结尾钩子</w:t>
-            </w:r>
-          </w:p>
-        </w:tc>
-      </w:tr>
-    </w:tbl>
-    <w:p>
-      <w:pPr>
-        <w:pStyle w:val="BodyText"/>
-      </w:pPr>
-      <w:r>
-        <w:t xml:space="preserve">示例：集纲第 2 集、剧本 EP01 的评估：</w:t>
+        <w:t xml:space="preserve">集纲单集评估</w:t>
       </w:r>
     </w:p>
     <w:p>
@@ -1711,18 +1670,18 @@
           <wp:inline>
             <wp:extent cx="5334000" cy="3200400"/>
             <wp:effectExtent b="0" l="0" r="0" t="0"/>
-            <wp:docPr descr="集纲单集评估" title="" id="50" name="Picture"/>
+            <wp:docPr descr="剧本单集评估" title="" id="49" name="Picture"/>
             <a:graphic>
               <a:graphicData uri="http://schemas.openxmlformats.org/drawingml/2006/picture">
                 <pic:pic>
                   <pic:nvPicPr>
-                    <pic:cNvPr descr="wd-img/w10-outline-ep.jpg" id="51" name="Picture"/>
+                    <pic:cNvPr descr="wd-img/w11-script-ep.jpg" id="50" name="Picture"/>
                     <pic:cNvPicPr>
                       <a:picLocks noChangeArrowheads="1" noChangeAspect="1"/>
                     </pic:cNvPicPr>
                   </pic:nvPicPr>
                   <pic:blipFill>
-                    <a:blip r:embed="rId49"/>
+                    <a:blip r:embed="rId48"/>
                     <a:stretch>
                       <a:fillRect/>
                     </a:stretch>
@@ -1754,7 +1713,144 @@
         <w:pStyle w:val="ImageCaption"/>
       </w:pPr>
       <w:r>
-        <w:t xml:space="preserve">集纲单集评估</w:t>
+        <w:t xml:space="preserve">剧本单集评估</w:t>
+      </w:r>
+    </w:p>
+    <w:bookmarkEnd w:id="51"/>
+    <w:bookmarkStart w:id="52" w:name="状态规则"/>
+    <w:p>
+      <w:pPr>
+        <w:pStyle w:val="Heading2"/>
+      </w:pPr>
+      <w:r>
+        <w:t xml:space="preserve">2.4 状态规则</w:t>
+      </w:r>
+    </w:p>
+    <w:p>
+      <w:pPr>
+        <w:numPr>
+          <w:ilvl w:val="0"/>
+          <w:numId w:val="1005"/>
+        </w:numPr>
+        <w:pStyle w:val="Compact"/>
+      </w:pPr>
+      <w:r>
+        <w:t xml:space="preserve">已有报告且原文未变：再次点「评估」直接打开已有报告；</w:t>
+      </w:r>
+    </w:p>
+    <w:p>
+      <w:pPr>
+        <w:numPr>
+          <w:ilvl w:val="0"/>
+          <w:numId w:val="1005"/>
+        </w:numPr>
+        <w:pStyle w:val="Compact"/>
+      </w:pPr>
+      <w:r>
+        <w:t xml:space="preserve">区块被重写后：该区块的报告与原文标注</w:t>
+      </w:r>
+      <w:r>
+        <w:rPr>
+          <w:bCs/>
+          <w:b/>
+        </w:rPr>
+        <w:t xml:space="preserve">全部清除</w:t>
+      </w:r>
+      <w:r>
+        <w:t xml:space="preserve">（报告已过期），需重新评估；</w:t>
+      </w:r>
+    </w:p>
+    <w:p>
+      <w:pPr>
+        <w:numPr>
+          <w:ilvl w:val="0"/>
+          <w:numId w:val="1005"/>
+        </w:numPr>
+        <w:pStyle w:val="Compact"/>
+      </w:pPr>
+      <w:r>
+        <w:t xml:space="preserve">区块之间互不影响：评估集纲第 2 集不会触碰其它集。</w:t>
+      </w:r>
+    </w:p>
+    <w:p>
+      <w:pPr>
+        <w:numPr>
+          <w:ilvl w:val="0"/>
+          <w:numId w:val="1005"/>
+        </w:numPr>
+        <w:pStyle w:val="Compact"/>
+      </w:pPr>
+      <w:r>
+        <w:t xml:space="preserve">Demo 说明：评估为规则 / 模板演示，正式版由模型按上表维度评分；意见条数与分数随原文变化。</w:t>
+      </w:r>
+    </w:p>
+    <w:bookmarkEnd w:id="52"/>
+    <w:bookmarkEnd w:id="53"/>
+    <w:bookmarkStart w:id="73" w:name="重写"/>
+    <w:p>
+      <w:pPr>
+        <w:pStyle w:val="Heading1"/>
+      </w:pPr>
+      <w:r>
+        <w:t xml:space="preserve">3. 重写</w:t>
+      </w:r>
+    </w:p>
+    <w:p>
+      <w:pPr>
+        <w:numPr>
+          <w:ilvl w:val="0"/>
+          <w:numId w:val="1006"/>
+        </w:numPr>
+        <w:pStyle w:val="Compact"/>
+      </w:pPr>
+      <w:r>
+        <w:t xml:space="preserve">点「重写」→（有下游时先见 3.1 的提示）居中弹窗：标题「重写 · 区块名」，可选补充要求（输入框 + 快捷词：台词更口语 / 结尾钩子更狠 / 冲突再强一点），按钮「取消 / 开始重写」。</w:t>
+      </w:r>
+    </w:p>
+    <w:p>
+      <w:pPr>
+        <w:numPr>
+          <w:ilvl w:val="0"/>
+          <w:numId w:val="1006"/>
+        </w:numPr>
+        <w:pStyle w:val="Compact"/>
+      </w:pPr>
+      <w:r>
+        <w:t xml:space="preserve">点「开始重写」→ toast「正在重写…」→ 区块文字被替换，并在区块标题下出现绿色提示条：</w:t>
+      </w:r>
+      <w:r>
+        <w:rPr>
+          <w:bCs/>
+          <w:b/>
+        </w:rPr>
+        <w:t xml:space="preserve">「✓ 已重写 · 红标已清除，可再点『评估』复查　[撤销重写]」</w:t>
+      </w:r>
+      <w:r>
+        <w:t xml:space="preserve">。</w:t>
+      </w:r>
+    </w:p>
+    <w:p>
+      <w:pPr>
+        <w:numPr>
+          <w:ilvl w:val="0"/>
+          <w:numId w:val="1006"/>
+        </w:numPr>
+        <w:pStyle w:val="Compact"/>
+      </w:pPr>
+      <w:r>
+        <w:t xml:space="preserve">「撤销重写」恢复重写前的原文。</w:t>
+      </w:r>
+    </w:p>
+    <w:p>
+      <w:pPr>
+        <w:numPr>
+          <w:ilvl w:val="0"/>
+          <w:numId w:val="1006"/>
+        </w:numPr>
+        <w:pStyle w:val="Compact"/>
+      </w:pPr>
+      <w:r>
+        <w:t xml:space="preserve">重写后再评估，可看到分数提升、意见减少，形成「评估 → 重写 → 复评」的闭环。</w:t>
       </w:r>
     </w:p>
     <w:p>
@@ -1766,18 +1862,18 @@
           <wp:inline>
             <wp:extent cx="5334000" cy="3200400"/>
             <wp:effectExtent b="0" l="0" r="0" t="0"/>
-            <wp:docPr descr="剧本单集评估" title="" id="53" name="Picture"/>
+            <wp:docPr descr="重写弹窗" title="" id="55" name="Picture"/>
             <a:graphic>
               <a:graphicData uri="http://schemas.openxmlformats.org/drawingml/2006/picture">
                 <pic:pic>
                   <pic:nvPicPr>
-                    <pic:cNvPr descr="wd-img/w11-script-ep.jpg" id="54" name="Picture"/>
+                    <pic:cNvPr descr="wd-img/w07-rewrite-dlg.jpg" id="56" name="Picture"/>
                     <pic:cNvPicPr>
                       <a:picLocks noChangeArrowheads="1" noChangeAspect="1"/>
                     </pic:cNvPicPr>
                   </pic:nvPicPr>
                   <pic:blipFill>
-                    <a:blip r:embed="rId52"/>
+                    <a:blip r:embed="rId54"/>
                     <a:stretch>
                       <a:fillRect/>
                     </a:stretch>
@@ -1809,144 +1905,7 @@
         <w:pStyle w:val="ImageCaption"/>
       </w:pPr>
       <w:r>
-        <w:t xml:space="preserve">剧本单集评估</w:t>
-      </w:r>
-    </w:p>
-    <w:bookmarkEnd w:id="55"/>
-    <w:bookmarkStart w:id="56" w:name="状态规则"/>
-    <w:p>
-      <w:pPr>
-        <w:pStyle w:val="Heading2"/>
-      </w:pPr>
-      <w:r>
-        <w:t xml:space="preserve">2.4 状态规则</w:t>
-      </w:r>
-    </w:p>
-    <w:p>
-      <w:pPr>
-        <w:numPr>
-          <w:ilvl w:val="0"/>
-          <w:numId w:val="1005"/>
-        </w:numPr>
-        <w:pStyle w:val="Compact"/>
-      </w:pPr>
-      <w:r>
-        <w:t xml:space="preserve">已有报告且原文未变：再次点「评估」直接打开已有报告；</w:t>
-      </w:r>
-    </w:p>
-    <w:p>
-      <w:pPr>
-        <w:numPr>
-          <w:ilvl w:val="0"/>
-          <w:numId w:val="1005"/>
-        </w:numPr>
-        <w:pStyle w:val="Compact"/>
-      </w:pPr>
-      <w:r>
-        <w:t xml:space="preserve">区块被重写后：该区块的报告与原文标注</w:t>
-      </w:r>
-      <w:r>
-        <w:rPr>
-          <w:bCs/>
-          <w:b/>
-        </w:rPr>
-        <w:t xml:space="preserve">全部清除</w:t>
-      </w:r>
-      <w:r>
-        <w:t xml:space="preserve">（报告已过期），需重新评估；</w:t>
-      </w:r>
-    </w:p>
-    <w:p>
-      <w:pPr>
-        <w:numPr>
-          <w:ilvl w:val="0"/>
-          <w:numId w:val="1005"/>
-        </w:numPr>
-        <w:pStyle w:val="Compact"/>
-      </w:pPr>
-      <w:r>
-        <w:t xml:space="preserve">区块之间互不影响：评估集纲第 2 集不会触碰其它集。</w:t>
-      </w:r>
-    </w:p>
-    <w:p>
-      <w:pPr>
-        <w:numPr>
-          <w:ilvl w:val="0"/>
-          <w:numId w:val="1005"/>
-        </w:numPr>
-        <w:pStyle w:val="Compact"/>
-      </w:pPr>
-      <w:r>
-        <w:t xml:space="preserve">Demo 说明：评估为规则 / 模板演示，正式版由模型按上表维度评分；意见条数与分数随原文变化。</w:t>
-      </w:r>
-    </w:p>
-    <w:bookmarkEnd w:id="56"/>
-    <w:bookmarkEnd w:id="57"/>
-    <w:bookmarkStart w:id="67" w:name="重写只动当前区块"/>
-    <w:p>
-      <w:pPr>
-        <w:pStyle w:val="Heading1"/>
-      </w:pPr>
-      <w:r>
-        <w:t xml:space="preserve">3. 重写（只动当前区块）</w:t>
-      </w:r>
-    </w:p>
-    <w:p>
-      <w:pPr>
-        <w:numPr>
-          <w:ilvl w:val="0"/>
-          <w:numId w:val="1006"/>
-        </w:numPr>
-        <w:pStyle w:val="Compact"/>
-      </w:pPr>
-      <w:r>
-        <w:t xml:space="preserve">点「重写」→ 居中弹窗：标题「重写 · 区块名」，可选补充要求（输入框 + 快捷词：台词更口语 / 结尾钩子更狠 / 冲突再强一点），按钮「取消 / 开始重写」。</w:t>
-      </w:r>
-    </w:p>
-    <w:p>
-      <w:pPr>
-        <w:numPr>
-          <w:ilvl w:val="0"/>
-          <w:numId w:val="1006"/>
-        </w:numPr>
-        <w:pStyle w:val="Compact"/>
-      </w:pPr>
-      <w:r>
-        <w:t xml:space="preserve">点「开始重写」→ toast「正在重写…」→ 区块文字被替换，并在区块标题下出现绿色提示条：</w:t>
-      </w:r>
-      <w:r>
-        <w:rPr>
-          <w:bCs/>
-          <w:b/>
-        </w:rPr>
-        <w:t xml:space="preserve">「✓ 已重写 · 红标已清除，可再点『评估』复查　[撤销重写]」</w:t>
-      </w:r>
-      <w:r>
-        <w:t xml:space="preserve">。</w:t>
-      </w:r>
-    </w:p>
-    <w:p>
-      <w:pPr>
-        <w:numPr>
-          <w:ilvl w:val="0"/>
-          <w:numId w:val="1006"/>
-        </w:numPr>
-        <w:pStyle w:val="Compact"/>
-      </w:pPr>
-      <w:r>
-        <w:t xml:space="preserve">「撤销重写」恢复重写前的原文。</w:t>
-      </w:r>
-    </w:p>
-    <w:p>
-      <w:pPr>
-        <w:numPr>
-          <w:ilvl w:val="0"/>
-          <w:numId w:val="1006"/>
-        </w:numPr>
-        <w:pStyle w:val="Compact"/>
-      </w:pPr>
-      <w:r>
-        <w:t xml:space="preserve">重写后再评估，可看到分数提升、意见减少，形成「评估 → 重写 → 复评」的闭环。</w:t>
+        <w:t xml:space="preserve">重写弹窗</w:t>
       </w:r>
     </w:p>
     <w:p>
@@ -1958,18 +1917,18 @@
           <wp:inline>
             <wp:extent cx="5334000" cy="3200400"/>
             <wp:effectExtent b="0" l="0" r="0" t="0"/>
-            <wp:docPr descr="重写弹窗" title="" id="59" name="Picture"/>
+            <wp:docPr descr="重写完成，红标清除" title="" id="58" name="Picture"/>
             <a:graphic>
               <a:graphicData uri="http://schemas.openxmlformats.org/drawingml/2006/picture">
                 <pic:pic>
                   <pic:nvPicPr>
-                    <pic:cNvPr descr="wd-img/w07-rewrite-dlg.jpg" id="60" name="Picture"/>
+                    <pic:cNvPr descr="wd-img/w08-rewritten.jpg" id="59" name="Picture"/>
                     <pic:cNvPicPr>
                       <a:picLocks noChangeArrowheads="1" noChangeAspect="1"/>
                     </pic:cNvPicPr>
                   </pic:nvPicPr>
                   <pic:blipFill>
-                    <a:blip r:embed="rId58"/>
+                    <a:blip r:embed="rId57"/>
                     <a:stretch>
                       <a:fillRect/>
                     </a:stretch>
@@ -2001,7 +1960,7 @@
         <w:pStyle w:val="ImageCaption"/>
       </w:pPr>
       <w:r>
-        <w:t xml:space="preserve">重写弹窗</w:t>
+        <w:t xml:space="preserve">重写完成，红标清除</w:t>
       </w:r>
     </w:p>
     <w:p>
@@ -2013,18 +1972,18 @@
           <wp:inline>
             <wp:extent cx="5334000" cy="3200400"/>
             <wp:effectExtent b="0" l="0" r="0" t="0"/>
-            <wp:docPr descr="重写完成，红标清除" title="" id="62" name="Picture"/>
+            <wp:docPr descr="复评：分数提升" title="" id="61" name="Picture"/>
             <a:graphic>
               <a:graphicData uri="http://schemas.openxmlformats.org/drawingml/2006/picture">
                 <pic:pic>
                   <pic:nvPicPr>
-                    <pic:cNvPr descr="wd-img/w08-rewritten.jpg" id="63" name="Picture"/>
+                    <pic:cNvPr descr="wd-img/w09-reeval.jpg" id="62" name="Picture"/>
                     <pic:cNvPicPr>
                       <a:picLocks noChangeArrowheads="1" noChangeAspect="1"/>
                     </pic:cNvPicPr>
                   </pic:nvPicPr>
                   <pic:blipFill>
-                    <a:blip r:embed="rId61"/>
+                    <a:blip r:embed="rId60"/>
                     <a:stretch>
                       <a:fillRect/>
                     </a:stretch>
@@ -2056,7 +2015,293 @@
         <w:pStyle w:val="ImageCaption"/>
       </w:pPr>
       <w:r>
-        <w:t xml:space="preserve">重写完成，红标清除</w:t>
+        <w:t xml:space="preserve">复评：分数提升</w:t>
+      </w:r>
+    </w:p>
+    <w:p>
+      <w:pPr>
+        <w:pStyle w:val="BlockText"/>
+      </w:pPr>
+      <w:r>
+        <w:t xml:space="preserve">评估与重写</w:t>
+      </w:r>
+      <w:r>
+        <w:rPr>
+          <w:bCs/>
+          <w:b/>
+        </w:rPr>
+        <w:t xml:space="preserve">相互独立</w:t>
+      </w:r>
+      <w:r>
+        <w:t xml:space="preserve">：评估不会自动触发重写；重写也不依赖先评估。重写时若已存在评估意见，建议模型把意见作为参考（正式版实现）。</w:t>
+      </w:r>
+    </w:p>
+    <w:bookmarkStart w:id="72" w:name="上游重写的联动提醒新增"/>
+    <w:p>
+      <w:pPr>
+        <w:pStyle w:val="Heading2"/>
+      </w:pPr>
+      <w:r>
+        <w:t xml:space="preserve">3.1 上游重写的联动提醒（新增）</w:t>
+      </w:r>
+    </w:p>
+    <w:p>
+      <w:pPr>
+        <w:pStyle w:val="FirstParagraph"/>
+      </w:pPr>
+      <w:r>
+        <w:t xml:space="preserve">内容有上下游依赖：</w:t>
+      </w:r>
+    </w:p>
+    <w:tbl>
+      <w:tblPr>
+        <w:tblStyle w:val="Table"/>
+        <w:tblW w:type="auto" w:w="0"/>
+        <w:tblLook w:firstRow="1" w:lastRow="0" w:firstColumn="0" w:lastColumn="0" w:noHBand="0" w:noVBand="0" w:val="0020"/>
+        <w:jc w:val="start"/>
+      </w:tblPr>
+      <w:tblGrid>
+        <w:gridCol w:w="3960"/>
+        <w:gridCol w:w="3960"/>
+      </w:tblGrid>
+      <w:tr>
+        <w:trPr>
+          <w:tblHeader w:val="true"/>
+        </w:trPr>
+        <w:tc>
+          <w:tcPr/>
+          <w:p>
+            <w:pPr>
+              <w:pStyle w:val="Compact"/>
+              <w:jc w:val="left"/>
+            </w:pPr>
+            <w:r>
+              <w:t xml:space="preserve">重写的区块</w:t>
+            </w:r>
+          </w:p>
+        </w:tc>
+        <w:tc>
+          <w:tcPr/>
+          <w:p>
+            <w:pPr>
+              <w:pStyle w:val="Compact"/>
+              <w:jc w:val="left"/>
+            </w:pPr>
+            <w:r>
+              <w:t xml:space="preserve">可能受影响的下游</w:t>
+            </w:r>
+          </w:p>
+        </w:tc>
+      </w:tr>
+      <w:tr>
+        <w:tc>
+          <w:tcPr/>
+          <w:p>
+            <w:pPr>
+              <w:pStyle w:val="Compact"/>
+              <w:jc w:val="left"/>
+            </w:pPr>
+            <w:r>
+              <w:t xml:space="preserve">核心创意</w:t>
+            </w:r>
+          </w:p>
+        </w:tc>
+        <w:tc>
+          <w:tcPr/>
+          <w:p>
+            <w:pPr>
+              <w:pStyle w:val="Compact"/>
+              <w:jc w:val="left"/>
+            </w:pPr>
+            <w:r>
+              <w:t xml:space="preserve">人物小传、策划案、全部集纲、全部剧本</w:t>
+            </w:r>
+          </w:p>
+        </w:tc>
+      </w:tr>
+      <w:tr>
+        <w:tc>
+          <w:tcPr/>
+          <w:p>
+            <w:pPr>
+              <w:pStyle w:val="Compact"/>
+              <w:jc w:val="left"/>
+            </w:pPr>
+            <w:r>
+              <w:t xml:space="preserve">人物小传 / 策划案</w:t>
+            </w:r>
+          </w:p>
+        </w:tc>
+        <w:tc>
+          <w:tcPr/>
+          <w:p>
+            <w:pPr>
+              <w:pStyle w:val="Compact"/>
+              <w:jc w:val="left"/>
+            </w:pPr>
+            <w:r>
+              <w:t xml:space="preserve">全部集纲、全部剧本</w:t>
+            </w:r>
+          </w:p>
+        </w:tc>
+      </w:tr>
+      <w:tr>
+        <w:tc>
+          <w:tcPr/>
+          <w:p>
+            <w:pPr>
+              <w:pStyle w:val="Compact"/>
+              <w:jc w:val="left"/>
+            </w:pPr>
+            <w:r>
+              <w:t xml:space="preserve">集纲第 N 集</w:t>
+            </w:r>
+          </w:p>
+        </w:tc>
+        <w:tc>
+          <w:tcPr/>
+          <w:p>
+            <w:pPr>
+              <w:pStyle w:val="Compact"/>
+              <w:jc w:val="left"/>
+            </w:pPr>
+            <w:r>
+              <w:t xml:space="preserve">对应的剧本第 N 集</w:t>
+            </w:r>
+          </w:p>
+        </w:tc>
+      </w:tr>
+      <w:tr>
+        <w:tc>
+          <w:tcPr/>
+          <w:p>
+            <w:pPr>
+              <w:pStyle w:val="Compact"/>
+              <w:jc w:val="left"/>
+            </w:pPr>
+            <w:r>
+              <w:t xml:space="preserve">剧本第 N 集</w:t>
+            </w:r>
+          </w:p>
+        </w:tc>
+        <w:tc>
+          <w:tcPr/>
+          <w:p>
+            <w:pPr>
+              <w:pStyle w:val="Compact"/>
+              <w:jc w:val="left"/>
+            </w:pPr>
+            <w:r>
+              <w:t xml:space="preserve">无，直接重写</w:t>
+            </w:r>
+          </w:p>
+        </w:tc>
+      </w:tr>
+    </w:tbl>
+    <w:p>
+      <w:pPr>
+        <w:pStyle w:val="BodyText"/>
+      </w:pPr>
+      <w:r>
+        <w:rPr>
+          <w:bCs/>
+          <w:b/>
+        </w:rPr>
+        <w:t xml:space="preserve">规则</w:t>
+      </w:r>
+      <w:r>
+        <w:t xml:space="preserve">：点击有下游的区块的「重写」，弹窗顶部出现黄色提示</w:t>
+      </w:r>
+      <w:r>
+        <w:t xml:space="preserve"> </w:t>
+      </w:r>
+      <w:r>
+        <w:rPr>
+          <w:bCs/>
+          <w:b/>
+        </w:rPr>
+        <w:t xml:space="preserve">「⚠ 可能会影响其他部分」</w:t>
+      </w:r>
+      <w:r>
+        <w:t xml:space="preserve">，列出受影响的下游区块（标签）与数量，并询问是否连同下游一起重写。三个按钮：</w:t>
+      </w:r>
+    </w:p>
+    <w:p>
+      <w:pPr>
+        <w:numPr>
+          <w:ilvl w:val="0"/>
+          <w:numId w:val="1007"/>
+        </w:numPr>
+        <w:pStyle w:val="Compact"/>
+      </w:pPr>
+      <w:r>
+        <w:rPr>
+          <w:bCs/>
+          <w:b/>
+        </w:rPr>
+        <w:t xml:space="preserve">取消</w:t>
+      </w:r>
+      <w:r>
+        <w:t xml:space="preserve">：不做任何事；</w:t>
+      </w:r>
+    </w:p>
+    <w:p>
+      <w:pPr>
+        <w:numPr>
+          <w:ilvl w:val="0"/>
+          <w:numId w:val="1007"/>
+        </w:numPr>
+        <w:pStyle w:val="Compact"/>
+      </w:pPr>
+      <w:r>
+        <w:rPr>
+          <w:bCs/>
+          <w:b/>
+        </w:rPr>
+        <w:t xml:space="preserve">只重写本区块</w:t>
+      </w:r>
+      <w:r>
+        <w:t xml:space="preserve">：仅重写当前区块；受影响的下游区块标题下出现黄色提示</w:t>
+      </w:r>
+      <w:r>
+        <w:t xml:space="preserve"> </w:t>
+      </w:r>
+      <w:r>
+        <w:rPr>
+          <w:bCs/>
+          <w:b/>
+        </w:rPr>
+        <w:t xml:space="preserve">「⚠ 上游内容已改动，本区块可能需要同步　[去重写]」</w:t>
+      </w:r>
+      <w:r>
+        <w:t xml:space="preserve">，左侧不强制处理；</w:t>
+      </w:r>
+    </w:p>
+    <w:p>
+      <w:pPr>
+        <w:numPr>
+          <w:ilvl w:val="0"/>
+          <w:numId w:val="1007"/>
+        </w:numPr>
+        <w:pStyle w:val="Compact"/>
+      </w:pPr>
+      <w:r>
+        <w:rPr>
+          <w:bCs/>
+          <w:b/>
+        </w:rPr>
+        <w:t xml:space="preserve">全部重写（共 N 处）</w:t>
+      </w:r>
+      <w:r>
+        <w:t xml:space="preserve">：依次重写当前区块 + 全部下游（进度 toast「正在同步重写 k/N…」），完成后 toast「已全部重写，共 N 处」；下游旧报告与标红一并清除。</w:t>
+      </w:r>
+    </w:p>
+    <w:p>
+      <w:pPr>
+        <w:pStyle w:val="FirstParagraph"/>
+      </w:pPr>
+      <w:r>
+        <w:t xml:space="preserve">没有下游的区块（如剧本单集）弹窗里不出现提示，按钮为「取消 / 开始重写」。「补充要求」输入框对所有被重写的区块生效。</w:t>
       </w:r>
     </w:p>
     <w:p>
@@ -2068,18 +2313,18 @@
           <wp:inline>
             <wp:extent cx="5334000" cy="3200400"/>
             <wp:effectExtent b="0" l="0" r="0" t="0"/>
-            <wp:docPr descr="复评：分数提升" title="" id="65" name="Picture"/>
+            <wp:docPr descr="人物小传重写：提示会影响下游" title="" id="64" name="Picture"/>
             <a:graphic>
               <a:graphicData uri="http://schemas.openxmlformats.org/drawingml/2006/picture">
                 <pic:pic>
                   <pic:nvPicPr>
-                    <pic:cNvPr descr="wd-img/w09-reeval.jpg" id="66" name="Picture"/>
+                    <pic:cNvPr descr="wd-img/x03-cascade-dlg.jpg" id="65" name="Picture"/>
                     <pic:cNvPicPr>
                       <a:picLocks noChangeArrowheads="1" noChangeAspect="1"/>
                     </pic:cNvPicPr>
                   </pic:nvPicPr>
                   <pic:blipFill>
-                    <a:blip r:embed="rId64"/>
+                    <a:blip r:embed="rId63"/>
                     <a:stretch>
                       <a:fillRect/>
                     </a:stretch>
@@ -2111,29 +2356,122 @@
         <w:pStyle w:val="ImageCaption"/>
       </w:pPr>
       <w:r>
-        <w:t xml:space="preserve">复评：分数提升</w:t>
-      </w:r>
-    </w:p>
-    <w:p>
-      <w:pPr>
-        <w:pStyle w:val="BlockText"/>
-      </w:pPr>
-      <w:r>
-        <w:t xml:space="preserve">评估与重写</w:t>
-      </w:r>
-      <w:r>
-        <w:rPr>
-          <w:bCs/>
-          <w:b/>
-        </w:rPr>
-        <w:t xml:space="preserve">相互独立</w:t>
-      </w:r>
-      <w:r>
-        <w:t xml:space="preserve">：评估不会自动触发重写；重写也不依赖先评估。重写时若已存在评估意见，建议模型把意见作为参考（正式版实现）。</w:t>
-      </w:r>
-    </w:p>
-    <w:bookmarkEnd w:id="67"/>
-    <w:bookmarkStart w:id="83" w:name="ai-助手非全屏自动收起-机器人图标"/>
+        <w:t xml:space="preserve">人物小传重写：提示会影响下游</w:t>
+      </w:r>
+    </w:p>
+    <w:p>
+      <w:pPr>
+        <w:pStyle w:val="CaptionedFigure"/>
+      </w:pPr>
+      <w:r>
+        <w:drawing>
+          <wp:inline>
+            <wp:extent cx="5334000" cy="3200400"/>
+            <wp:effectExtent b="0" l="0" r="0" t="0"/>
+            <wp:docPr descr="只重写本区块后，集纲各集出现「上游已改动」提示" title="" id="67" name="Picture"/>
+            <a:graphic>
+              <a:graphicData uri="http://schemas.openxmlformats.org/drawingml/2006/picture">
+                <pic:pic>
+                  <pic:nvPicPr>
+                    <pic:cNvPr descr="wd-img/x05-stale-outline.jpg" id="68" name="Picture"/>
+                    <pic:cNvPicPr>
+                      <a:picLocks noChangeArrowheads="1" noChangeAspect="1"/>
+                    </pic:cNvPicPr>
+                  </pic:nvPicPr>
+                  <pic:blipFill>
+                    <a:blip r:embed="rId66"/>
+                    <a:stretch>
+                      <a:fillRect/>
+                    </a:stretch>
+                  </pic:blipFill>
+                  <pic:spPr bwMode="auto">
+                    <a:xfrm>
+                      <a:off x="0" y="0"/>
+                      <a:ext cx="5334000" cy="3200400"/>
+                    </a:xfrm>
+                    <a:prstGeom prst="rect">
+                      <a:avLst/>
+                    </a:prstGeom>
+                    <a:noFill/>
+                    <a:ln w="9525">
+                      <a:noFill/>
+                      <a:headEnd/>
+                      <a:tailEnd/>
+                    </a:ln>
+                  </pic:spPr>
+                </pic:pic>
+              </a:graphicData>
+            </a:graphic>
+          </wp:inline>
+        </w:drawing>
+      </w:r>
+    </w:p>
+    <w:p>
+      <w:pPr>
+        <w:pStyle w:val="ImageCaption"/>
+      </w:pPr>
+      <w:r>
+        <w:t xml:space="preserve">只重写本区块后，集纲各集出现「上游已改动」提示</w:t>
+      </w:r>
+    </w:p>
+    <w:p>
+      <w:pPr>
+        <w:pStyle w:val="CaptionedFigure"/>
+      </w:pPr>
+      <w:r>
+        <w:drawing>
+          <wp:inline>
+            <wp:extent cx="5334000" cy="3200400"/>
+            <wp:effectExtent b="0" l="0" r="0" t="0"/>
+            <wp:docPr descr="集纲单集重写：影响对应剧本 EP01" title="" id="70" name="Picture"/>
+            <a:graphic>
+              <a:graphicData uri="http://schemas.openxmlformats.org/drawingml/2006/picture">
+                <pic:pic>
+                  <pic:nvPicPr>
+                    <pic:cNvPr descr="wd-img/x06-ol-dlg.jpg" id="71" name="Picture"/>
+                    <pic:cNvPicPr>
+                      <a:picLocks noChangeArrowheads="1" noChangeAspect="1"/>
+                    </pic:cNvPicPr>
+                  </pic:nvPicPr>
+                  <pic:blipFill>
+                    <a:blip r:embed="rId69"/>
+                    <a:stretch>
+                      <a:fillRect/>
+                    </a:stretch>
+                  </pic:blipFill>
+                  <pic:spPr bwMode="auto">
+                    <a:xfrm>
+                      <a:off x="0" y="0"/>
+                      <a:ext cx="5334000" cy="3200400"/>
+                    </a:xfrm>
+                    <a:prstGeom prst="rect">
+                      <a:avLst/>
+                    </a:prstGeom>
+                    <a:noFill/>
+                    <a:ln w="9525">
+                      <a:noFill/>
+                      <a:headEnd/>
+                      <a:tailEnd/>
+                    </a:ln>
+                  </pic:spPr>
+                </pic:pic>
+              </a:graphicData>
+            </a:graphic>
+          </wp:inline>
+        </w:drawing>
+      </w:r>
+    </w:p>
+    <w:p>
+      <w:pPr>
+        <w:pStyle w:val="ImageCaption"/>
+      </w:pPr>
+      <w:r>
+        <w:t xml:space="preserve">集纲单集重写：影响对应剧本 EP01</w:t>
+      </w:r>
+    </w:p>
+    <w:bookmarkEnd w:id="72"/>
+    <w:bookmarkEnd w:id="73"/>
+    <w:bookmarkStart w:id="93" w:name="ai-助手非全屏自动收起-机器人图标"/>
     <w:p>
       <w:pPr>
         <w:pStyle w:val="Heading1"/>
@@ -2142,7 +2480,7 @@
         <w:t xml:space="preserve">4. AI 助手：非全屏自动收起 + 机器人图标</w:t>
       </w:r>
     </w:p>
-    <w:bookmarkStart w:id="71" w:name="响应规则"/>
+    <w:bookmarkStart w:id="77" w:name="响应规则"/>
     <w:p>
       <w:pPr>
         <w:pStyle w:val="Heading2"/>
@@ -2297,18 +2635,18 @@
           <wp:inline>
             <wp:extent cx="5334000" cy="3879272"/>
             <wp:effectExtent b="0" l="0" r="0" t="0"/>
-            <wp:docPr descr="窄屏：AI 助手自动隐藏，右下角浮动机器人" title="" id="69" name="Picture"/>
+            <wp:docPr descr="窄屏：AI 助手自动隐藏，右下角浮动机器人" title="" id="75" name="Picture"/>
             <a:graphic>
               <a:graphicData uri="http://schemas.openxmlformats.org/drawingml/2006/picture">
                 <pic:pic>
                   <pic:nvPicPr>
-                    <pic:cNvPr descr="wd-img/w13-narrow-hidden.jpg" id="70" name="Picture"/>
+                    <pic:cNvPr descr="wd-img/w13-narrow-hidden.jpg" id="76" name="Picture"/>
                     <pic:cNvPicPr>
                       <a:picLocks noChangeArrowheads="1" noChangeAspect="1"/>
                     </pic:cNvPicPr>
                   </pic:nvPicPr>
                   <pic:blipFill>
-                    <a:blip r:embed="rId68"/>
+                    <a:blip r:embed="rId74"/>
                     <a:stretch>
                       <a:fillRect/>
                     </a:stretch>
@@ -2343,8 +2681,8 @@
         <w:t xml:space="preserve">窄屏：AI 助手自动隐藏，右下角浮动机器人</w:t>
       </w:r>
     </w:p>
-    <w:bookmarkEnd w:id="71"/>
-    <w:bookmarkStart w:id="78" w:name="机器人图标"/>
+    <w:bookmarkEnd w:id="77"/>
+    <w:bookmarkStart w:id="84" w:name="机器人图标"/>
     <w:p>
       <w:pPr>
         <w:pStyle w:val="Heading2"/>
@@ -2357,7 +2695,7 @@
       <w:pPr>
         <w:numPr>
           <w:ilvl w:val="0"/>
-          <w:numId w:val="1007"/>
+          <w:numId w:val="1008"/>
         </w:numPr>
         <w:pStyle w:val="Compact"/>
       </w:pPr>
@@ -2379,7 +2717,7 @@
       <w:pPr>
         <w:numPr>
           <w:ilvl w:val="0"/>
-          <w:numId w:val="1007"/>
+          <w:numId w:val="1008"/>
         </w:numPr>
         <w:pStyle w:val="Compact"/>
       </w:pPr>
@@ -2391,7 +2729,7 @@
       <w:pPr>
         <w:numPr>
           <w:ilvl w:val="0"/>
-          <w:numId w:val="1007"/>
+          <w:numId w:val="1008"/>
         </w:numPr>
         <w:pStyle w:val="Compact"/>
       </w:pPr>
@@ -2410,7 +2748,7 @@
       <w:pPr>
         <w:numPr>
           <w:ilvl w:val="0"/>
-          <w:numId w:val="1007"/>
+          <w:numId w:val="1008"/>
         </w:numPr>
         <w:pStyle w:val="Compact"/>
       </w:pPr>
@@ -2427,18 +2765,18 @@
           <wp:inline>
             <wp:extent cx="5334000" cy="3879272"/>
             <wp:effectExtent b="0" l="0" r="0" t="0"/>
-            <wp:docPr descr="悬停显示「AI助手」" title="" id="73" name="Picture"/>
+            <wp:docPr descr="悬停显示「AI助手」" title="" id="79" name="Picture"/>
             <a:graphic>
               <a:graphicData uri="http://schemas.openxmlformats.org/drawingml/2006/picture">
                 <pic:pic>
                   <pic:nvPicPr>
-                    <pic:cNvPr descr="wd-img/w14-robot-tip.jpg" id="74" name="Picture"/>
+                    <pic:cNvPr descr="wd-img/w14-robot-tip.jpg" id="80" name="Picture"/>
                     <pic:cNvPicPr>
                       <a:picLocks noChangeArrowheads="1" noChangeAspect="1"/>
                     </pic:cNvPicPr>
                   </pic:nvPicPr>
                   <pic:blipFill>
-                    <a:blip r:embed="rId72"/>
+                    <a:blip r:embed="rId78"/>
                     <a:stretch>
                       <a:fillRect/>
                     </a:stretch>
@@ -2482,18 +2820,18 @@
           <wp:inline>
             <wp:extent cx="5334000" cy="3879272"/>
             <wp:effectExtent b="0" l="0" r="0" t="0"/>
-            <wp:docPr descr="点击后右侧滑出 AI 助手" title="" id="76" name="Picture"/>
+            <wp:docPr descr="点击后右侧滑出 AI 助手" title="" id="82" name="Picture"/>
             <a:graphic>
               <a:graphicData uri="http://schemas.openxmlformats.org/drawingml/2006/picture">
                 <pic:pic>
                   <pic:nvPicPr>
-                    <pic:cNvPr descr="wd-img/w15-narrow-open.jpg" id="77" name="Picture"/>
+                    <pic:cNvPr descr="wd-img/w15-narrow-open.jpg" id="83" name="Picture"/>
                     <pic:cNvPicPr>
                       <a:picLocks noChangeArrowheads="1" noChangeAspect="1"/>
                     </pic:cNvPicPr>
                   </pic:nvPicPr>
                   <pic:blipFill>
-                    <a:blip r:embed="rId75"/>
+                    <a:blip r:embed="rId81"/>
                     <a:stretch>
                       <a:fillRect/>
                     </a:stretch>
@@ -2528,8 +2866,8 @@
         <w:t xml:space="preserve">点击后右侧滑出 AI 助手</w:t>
       </w:r>
     </w:p>
-    <w:bookmarkEnd w:id="78"/>
-    <w:bookmarkStart w:id="82" w:name="评估报告与-ai-助手共用右侧栏"/>
+    <w:bookmarkEnd w:id="84"/>
+    <w:bookmarkStart w:id="88" w:name="评估报告与-ai-助手共用右侧栏"/>
     <w:p>
       <w:pPr>
         <w:pStyle w:val="Heading2"/>
@@ -2542,7 +2880,7 @@
       <w:pPr>
         <w:numPr>
           <w:ilvl w:val="0"/>
-          <w:numId w:val="1008"/>
+          <w:numId w:val="1009"/>
         </w:numPr>
         <w:pStyle w:val="Compact"/>
       </w:pPr>
@@ -2554,7 +2892,7 @@
       <w:pPr>
         <w:numPr>
           <w:ilvl w:val="0"/>
-          <w:numId w:val="1008"/>
+          <w:numId w:val="1009"/>
         </w:numPr>
         <w:pStyle w:val="Compact"/>
       </w:pPr>
@@ -2566,7 +2904,7 @@
       <w:pPr>
         <w:numPr>
           <w:ilvl w:val="0"/>
-          <w:numId w:val="1008"/>
+          <w:numId w:val="1009"/>
         </w:numPr>
         <w:pStyle w:val="Compact"/>
       </w:pPr>
@@ -2583,18 +2921,18 @@
           <wp:inline>
             <wp:extent cx="5334000" cy="3879272"/>
             <wp:effectExtent b="0" l="0" r="0" t="0"/>
-            <wp:docPr descr="窄屏下评估报告浮层" title="" id="80" name="Picture"/>
+            <wp:docPr descr="窄屏下评估报告浮层" title="" id="86" name="Picture"/>
             <a:graphic>
               <a:graphicData uri="http://schemas.openxmlformats.org/drawingml/2006/picture">
                 <pic:pic>
                   <pic:nvPicPr>
-                    <pic:cNvPr descr="wd-img/w16-narrow-report.jpg" id="81" name="Picture"/>
+                    <pic:cNvPr descr="wd-img/w16-narrow-report.jpg" id="87" name="Picture"/>
                     <pic:cNvPicPr>
                       <a:picLocks noChangeArrowheads="1" noChangeAspect="1"/>
                     </pic:cNvPicPr>
                   </pic:nvPicPr>
                   <pic:blipFill>
-                    <a:blip r:embed="rId79"/>
+                    <a:blip r:embed="rId85"/>
                     <a:stretch>
                       <a:fillRect/>
                     </a:stretch>
@@ -2629,97 +2967,14 @@
         <w:t xml:space="preserve">窄屏下评估报告浮层</w:t>
       </w:r>
     </w:p>
-    <w:bookmarkEnd w:id="82"/>
-    <w:bookmarkEnd w:id="83"/>
-    <w:bookmarkStart w:id="84" w:name="验收要点"/>
-    <w:p>
-      <w:pPr>
-        <w:pStyle w:val="Heading1"/>
-      </w:pPr>
-      <w:r>
-        <w:t xml:space="preserve">5. 验收要点</w:t>
-      </w:r>
-    </w:p>
-    <w:p>
-      <w:pPr>
-        <w:numPr>
-          <w:ilvl w:val="0"/>
-          <w:numId w:val="1009"/>
-        </w:numPr>
-        <w:pStyle w:val="Compact"/>
-      </w:pPr>
-      <w:r>
-        <w:t xml:space="preserve">创意 / 策划案各 1 组三图标；集纲每集、剧本每集各 1 组。</w:t>
-      </w:r>
-    </w:p>
-    <w:p>
-      <w:pPr>
-        <w:numPr>
-          <w:ilvl w:val="0"/>
-          <w:numId w:val="1009"/>
-        </w:numPr>
-        <w:pStyle w:val="Compact"/>
-      </w:pPr>
-      <w:r>
-        <w:t xml:space="preserve">评估只出报告，报告里无任何「修改」类按钮；原文被标红并带编号，双向跳转可用。</w:t>
-      </w:r>
-    </w:p>
-    <w:p>
-      <w:pPr>
-        <w:numPr>
-          <w:ilvl w:val="0"/>
-          <w:numId w:val="1009"/>
-        </w:numPr>
-        <w:pStyle w:val="Compact"/>
-      </w:pPr>
-      <w:r>
-        <w:t xml:space="preserve">重写只影响当前区块，可撤销，重写后旧报告清除。</w:t>
-      </w:r>
-    </w:p>
-    <w:p>
-      <w:pPr>
-        <w:numPr>
-          <w:ilvl w:val="0"/>
-          <w:numId w:val="1009"/>
-        </w:numPr>
-        <w:pStyle w:val="Compact"/>
-      </w:pPr>
-      <w:r>
-        <w:t xml:space="preserve">AI 助手输入框内无「剧本医生」。</w:t>
-      </w:r>
-    </w:p>
-    <w:p>
-      <w:pPr>
-        <w:numPr>
-          <w:ilvl w:val="0"/>
-          <w:numId w:val="1009"/>
-        </w:numPr>
-        <w:pStyle w:val="Compact"/>
-      </w:pPr>
-      <w:r>
-        <w:t xml:space="preserve">宽 &lt; 1280px 时 AI 助手默认隐藏；机器人图标可呼出；悬停显示「AI助手」。</w:t>
-      </w:r>
-    </w:p>
-    <w:p>
-      <w:pPr>
-        <w:numPr>
-          <w:ilvl w:val="0"/>
-          <w:numId w:val="1009"/>
-        </w:numPr>
-        <w:pStyle w:val="Compact"/>
-      </w:pPr>
-      <w:r>
-        <w:t xml:space="preserve">状态表达不只靠颜色（有 ✓ ! ✕ 与文字）。</w:t>
-      </w:r>
-    </w:p>
-    <w:bookmarkEnd w:id="84"/>
-    <w:bookmarkStart w:id="85" w:name="附录demo-使用"/>
-    <w:p>
-      <w:pPr>
-        <w:pStyle w:val="Heading1"/>
-      </w:pPr>
-      <w:r>
-        <w:t xml:space="preserve">附录：Demo 使用</w:t>
+    <w:bookmarkEnd w:id="88"/>
+    <w:bookmarkStart w:id="92" w:name="侧栏宽度可调整新增"/>
+    <w:p>
+      <w:pPr>
+        <w:pStyle w:val="Heading2"/>
+      </w:pPr>
+      <w:r>
+        <w:t xml:space="preserve">4.4 侧栏宽度可调整（新增）</w:t>
       </w:r>
     </w:p>
     <w:p>
@@ -2731,19 +2986,7 @@
         <w:pStyle w:val="Compact"/>
       </w:pPr>
       <w:r>
-        <w:t xml:space="preserve">打开</w:t>
-      </w:r>
-      <w:r>
-        <w:t xml:space="preserve"> </w:t>
-      </w:r>
-      <w:r>
-        <w:rPr>
-          <w:rStyle w:val="VerbatimChar"/>
-        </w:rPr>
-        <w:t xml:space="preserve">demo/workspace-doctor.html</w:t>
-      </w:r>
-      <w:r>
-        <w:t xml:space="preserve">，左侧可切换 创意 / 策划案 / 集纲 / 剧本。</w:t>
+        <w:t xml:space="preserve">侧栏左边缘有一条竖向拖动条（悬停变青色，光标为左右箭头）；</w:t>
       </w:r>
     </w:p>
     <w:p>
@@ -2755,7 +2998,20 @@
         <w:pStyle w:val="Compact"/>
       </w:pPr>
       <w:r>
-        <w:t xml:space="preserve">在任一区块右上角点第 2 枚图标评估；点意见或原文圆标互相跳转。</w:t>
+        <w:t xml:space="preserve">向左拖变宽、向右拖变窄，范围</w:t>
+      </w:r>
+      <w:r>
+        <w:t xml:space="preserve"> </w:t>
+      </w:r>
+      <w:r>
+        <w:rPr>
+          <w:bCs/>
+          <w:b/>
+        </w:rPr>
+        <w:t xml:space="preserve">300–680px</w:t>
+      </w:r>
+      <w:r>
+        <w:t xml:space="preserve">，默认 380px；</w:t>
       </w:r>
     </w:p>
     <w:p>
@@ -2767,7 +3023,14 @@
         <w:pStyle w:val="Compact"/>
       </w:pPr>
       <w:r>
-        <w:t xml:space="preserve">点第 3 枚图标重写，再评估对比。</w:t>
+        <w:rPr>
+          <w:bCs/>
+          <w:b/>
+        </w:rPr>
+        <w:t xml:space="preserve">双击拖动条恢复默认宽度</w:t>
+      </w:r>
+      <w:r>
+        <w:t xml:space="preserve">；</w:t>
       </w:r>
     </w:p>
     <w:p>
@@ -2779,10 +3042,230 @@
         <w:pStyle w:val="Compact"/>
       </w:pPr>
       <w:r>
+        <w:t xml:space="preserve">宽度会被记住（浏览器本地），下次打开沿用；窄屏浮层同样可拖，最宽不超过屏幕 92%；</w:t>
+      </w:r>
+    </w:p>
+    <w:p>
+      <w:pPr>
+        <w:numPr>
+          <w:ilvl w:val="0"/>
+          <w:numId w:val="1010"/>
+        </w:numPr>
+        <w:pStyle w:val="Compact"/>
+      </w:pPr>
+      <w:r>
+        <w:t xml:space="preserve">拖动过程中正文区域实时让位（宽屏停靠模式）。</w:t>
+      </w:r>
+    </w:p>
+    <w:p>
+      <w:pPr>
+        <w:pStyle w:val="CaptionedFigure"/>
+      </w:pPr>
+      <w:r>
+        <w:drawing>
+          <wp:inline>
+            <wp:extent cx="5334000" cy="3200400"/>
+            <wp:effectExtent b="0" l="0" r="0" t="0"/>
+            <wp:docPr descr="拖宽后的 AI 助手侧栏" title="" id="90" name="Picture"/>
+            <a:graphic>
+              <a:graphicData uri="http://schemas.openxmlformats.org/drawingml/2006/picture">
+                <pic:pic>
+                  <pic:nvPicPr>
+                    <pic:cNvPr descr="wd-img/x07-resized.jpg" id="91" name="Picture"/>
+                    <pic:cNvPicPr>
+                      <a:picLocks noChangeArrowheads="1" noChangeAspect="1"/>
+                    </pic:cNvPicPr>
+                  </pic:nvPicPr>
+                  <pic:blipFill>
+                    <a:blip r:embed="rId89"/>
+                    <a:stretch>
+                      <a:fillRect/>
+                    </a:stretch>
+                  </pic:blipFill>
+                  <pic:spPr bwMode="auto">
+                    <a:xfrm>
+                      <a:off x="0" y="0"/>
+                      <a:ext cx="5334000" cy="3200400"/>
+                    </a:xfrm>
+                    <a:prstGeom prst="rect">
+                      <a:avLst/>
+                    </a:prstGeom>
+                    <a:noFill/>
+                    <a:ln w="9525">
+                      <a:noFill/>
+                      <a:headEnd/>
+                      <a:tailEnd/>
+                    </a:ln>
+                  </pic:spPr>
+                </pic:pic>
+              </a:graphicData>
+            </a:graphic>
+          </wp:inline>
+        </w:drawing>
+      </w:r>
+    </w:p>
+    <w:p>
+      <w:pPr>
+        <w:pStyle w:val="ImageCaption"/>
+      </w:pPr>
+      <w:r>
+        <w:t xml:space="preserve">拖宽后的 AI 助手侧栏</w:t>
+      </w:r>
+    </w:p>
+    <w:bookmarkEnd w:id="92"/>
+    <w:bookmarkEnd w:id="93"/>
+    <w:bookmarkStart w:id="94" w:name="验收要点"/>
+    <w:p>
+      <w:pPr>
+        <w:pStyle w:val="Heading1"/>
+      </w:pPr>
+      <w:r>
+        <w:t xml:space="preserve">5. 验收要点</w:t>
+      </w:r>
+    </w:p>
+    <w:p>
+      <w:pPr>
+        <w:numPr>
+          <w:ilvl w:val="0"/>
+          <w:numId w:val="1011"/>
+        </w:numPr>
+        <w:pStyle w:val="Compact"/>
+      </w:pPr>
+      <w:r>
+        <w:t xml:space="preserve">创意 1 组、策划案 2 组（人物小传 / 策划案）、集纲每集、剧本每集各 1 组两图标；集纲每集、剧本每集各 1 组。</w:t>
+      </w:r>
+    </w:p>
+    <w:p>
+      <w:pPr>
+        <w:numPr>
+          <w:ilvl w:val="0"/>
+          <w:numId w:val="1011"/>
+        </w:numPr>
+        <w:pStyle w:val="Compact"/>
+      </w:pPr>
+      <w:r>
+        <w:t xml:space="preserve">评估只出报告，报告里无任何「修改」类按钮；原文被标红并带编号，双向跳转可用。</w:t>
+      </w:r>
+    </w:p>
+    <w:p>
+      <w:pPr>
+        <w:numPr>
+          <w:ilvl w:val="0"/>
+          <w:numId w:val="1011"/>
+        </w:numPr>
+        <w:pStyle w:val="Compact"/>
+      </w:pPr>
+      <w:r>
+        <w:t xml:space="preserve">重写默认只影响当前区块，可撤销，重写后旧报告清除；有下游的区块重写前弹出「可能会影响其他部分」，可选只重写本区块或全部重写。</w:t>
+      </w:r>
+    </w:p>
+    <w:p>
+      <w:pPr>
+        <w:numPr>
+          <w:ilvl w:val="0"/>
+          <w:numId w:val="1011"/>
+        </w:numPr>
+        <w:pStyle w:val="Compact"/>
+      </w:pPr>
+      <w:r>
+        <w:t xml:space="preserve">AI 助手输入框内无「剧本医生」；侧栏可拖动调宽（300–680px），双击恢复。</w:t>
+      </w:r>
+    </w:p>
+    <w:p>
+      <w:pPr>
+        <w:numPr>
+          <w:ilvl w:val="0"/>
+          <w:numId w:val="1011"/>
+        </w:numPr>
+        <w:pStyle w:val="Compact"/>
+      </w:pPr>
+      <w:r>
+        <w:t xml:space="preserve">宽 &lt; 1280px 时 AI 助手默认隐藏；机器人图标可呼出；悬停显示「AI助手」。</w:t>
+      </w:r>
+    </w:p>
+    <w:p>
+      <w:pPr>
+        <w:numPr>
+          <w:ilvl w:val="0"/>
+          <w:numId w:val="1011"/>
+        </w:numPr>
+        <w:pStyle w:val="Compact"/>
+      </w:pPr>
+      <w:r>
+        <w:t xml:space="preserve">状态表达不只靠颜色（有 ✓ ! ✕ 与文字）。</w:t>
+      </w:r>
+    </w:p>
+    <w:bookmarkEnd w:id="94"/>
+    <w:bookmarkStart w:id="95" w:name="附录demo-使用"/>
+    <w:p>
+      <w:pPr>
+        <w:pStyle w:val="Heading1"/>
+      </w:pPr>
+      <w:r>
+        <w:t xml:space="preserve">附录：Demo 使用</w:t>
+      </w:r>
+    </w:p>
+    <w:p>
+      <w:pPr>
+        <w:numPr>
+          <w:ilvl w:val="0"/>
+          <w:numId w:val="1012"/>
+        </w:numPr>
+        <w:pStyle w:val="Compact"/>
+      </w:pPr>
+      <w:r>
+        <w:t xml:space="preserve">打开</w:t>
+      </w:r>
+      <w:r>
+        <w:t xml:space="preserve"> </w:t>
+      </w:r>
+      <w:r>
+        <w:rPr>
+          <w:rStyle w:val="VerbatimChar"/>
+        </w:rPr>
+        <w:t xml:space="preserve">demo/workspace-doctor.html</w:t>
+      </w:r>
+      <w:r>
+        <w:t xml:space="preserve">，左侧可切换 创意 / 策划案 / 集纲 / 剧本。</w:t>
+      </w:r>
+    </w:p>
+    <w:p>
+      <w:pPr>
+        <w:numPr>
+          <w:ilvl w:val="0"/>
+          <w:numId w:val="1012"/>
+        </w:numPr>
+        <w:pStyle w:val="Compact"/>
+      </w:pPr>
+      <w:r>
+        <w:t xml:space="preserve">在任一区块右上角点第 1 枚图标评估；点意见或原文圆标互相跳转。</w:t>
+      </w:r>
+    </w:p>
+    <w:p>
+      <w:pPr>
+        <w:numPr>
+          <w:ilvl w:val="0"/>
+          <w:numId w:val="1012"/>
+        </w:numPr>
+        <w:pStyle w:val="Compact"/>
+      </w:pPr>
+      <w:r>
+        <w:t xml:space="preserve">点第 2 枚图标重写，再评估对比。</w:t>
+      </w:r>
+    </w:p>
+    <w:p>
+      <w:pPr>
+        <w:numPr>
+          <w:ilvl w:val="0"/>
+          <w:numId w:val="1012"/>
+        </w:numPr>
+        <w:pStyle w:val="Compact"/>
+      </w:pPr>
+      <w:r>
         <w:t xml:space="preserve">把浏览器窗口缩到 1280px 以下，观察 AI 助手自动收起，点机器人图标呼出。</w:t>
       </w:r>
     </w:p>
-    <w:bookmarkEnd w:id="85"/>
+    <w:bookmarkEnd w:id="95"/>
     <w:sectPr/>
   </w:body>
 </w:document>
@@ -3159,6 +3642,12 @@
     <w:abstractNumId w:val="991"/>
   </w:num>
   <w:num w:numId="1009">
+    <w:abstractNumId w:val="991"/>
+  </w:num>
+  <w:num w:numId="1010">
+    <w:abstractNumId w:val="991"/>
+  </w:num>
+  <w:num w:numId="1011">
     <w:abstractNumId w:val="99411"/>
     <w:lvlOverride w:ilvl="0">
       <w:startOverride w:val="1"/>
@@ -3188,7 +3677,7 @@
       <w:startOverride w:val="1"/>
     </w:lvlOverride>
   </w:num>
-  <w:num w:numId="1010">
+  <w:num w:numId="1012">
     <w:abstractNumId w:val="99411"/>
     <w:lvlOverride w:ilvl="0">
       <w:startOverride w:val="1"/>

</xml_diff>

<commit_message>
Inline evaluation report in block, labeled assess/rewrite buttons
Co-Authored-By: Claude Sonnet 5.5 <noreply@anthropic.com>
Claude-Session: https://claude.ai/code/session_01BwGpqARRukchuVN39hPaRP
</commit_message>
<xml_diff>
--- a/docs/PRD-workspace-doctor.docx
+++ b/docs/PRD-workspace-doctor.docx
@@ -63,7 +63,7 @@
         <w:pStyle w:val="Subtitle"/>
       </w:pPr>
       <w:r>
-        <w:t xml:space="preserve">v1.1</w:t>
+        <w:t xml:space="preserve">v1.2</w:t>
       </w:r>
       <w:r>
         <w:t xml:space="preserve"> </w:t>
@@ -202,7 +202,7 @@
       </w:r>
     </w:p>
     <w:bookmarkEnd w:id="20"/>
-    <w:bookmarkStart w:id="33" w:name="区块右上角两图标"/>
+    <w:bookmarkStart w:id="27" w:name="区块右上角两图标"/>
     <w:p>
       <w:pPr>
         <w:pStyle w:val="Heading1"/>
@@ -211,7 +211,7 @@
         <w:t xml:space="preserve">1. 区块右上角两图标</w:t>
       </w:r>
     </w:p>
-    <w:bookmarkStart w:id="27" w:name="位置与形态"/>
+    <w:bookmarkStart w:id="24" w:name="位置与形态"/>
     <w:p>
       <w:pPr>
         <w:pStyle w:val="Heading2"/>
@@ -235,7 +235,17 @@
         <w:t xml:space="preserve">区块标题行的右侧</w:t>
       </w:r>
       <w:r>
-        <w:t xml:space="preserve">（即页面截图中红框的位置）放一个小工具条，从左到右两枚图标，纯图标 + 悬停文字：</w:t>
+        <w:t xml:space="preserve">放一个小工具条，两个</w:t>
+      </w:r>
+      <w:r>
+        <w:rPr>
+          <w:bCs/>
+          <w:b/>
+        </w:rPr>
+        <w:t xml:space="preserve">「图标 + 文字」按钮</w:t>
+      </w:r>
+      <w:r>
+        <w:t xml:space="preserve">（不再只有图标，用户一眼看懂）：</w:t>
       </w:r>
     </w:p>
     <w:tbl>
@@ -246,10 +256,9 @@
         <w:jc w:val="start"/>
       </w:tblPr>
       <w:tblGrid>
-        <w:gridCol w:w="1980"/>
-        <w:gridCol w:w="1980"/>
-        <w:gridCol w:w="1980"/>
-        <w:gridCol w:w="1980"/>
+        <w:gridCol w:w="2640"/>
+        <w:gridCol w:w="2640"/>
+        <w:gridCol w:w="2640"/>
       </w:tblGrid>
       <w:tr>
         <w:trPr>
@@ -275,19 +284,7 @@
               <w:jc w:val="left"/>
             </w:pPr>
             <w:r>
-              <w:t xml:space="preserve">图标</w:t>
-            </w:r>
-          </w:p>
-        </w:tc>
-        <w:tc>
-          <w:tcPr/>
-          <w:p>
-            <w:pPr>
-              <w:pStyle w:val="Compact"/>
-              <w:jc w:val="left"/>
-            </w:pPr>
-            <w:r>
-              <w:t xml:space="preserve">悬停文字</w:t>
+              <w:t xml:space="preserve">按钮</w:t>
             </w:r>
           </w:p>
         </w:tc>
@@ -325,19 +322,17 @@
               <w:jc w:val="left"/>
             </w:pPr>
             <w:r>
-              <w:t xml:space="preserve">清单打勾</w:t>
-            </w:r>
-          </w:p>
-        </w:tc>
-        <w:tc>
-          <w:tcPr/>
-          <w:p>
-            <w:pPr>
-              <w:pStyle w:val="Compact"/>
-              <w:jc w:val="left"/>
-            </w:pPr>
-            <w:r>
-              <w:t xml:space="preserve">评估 / 评估本集</w:t>
+              <w:t xml:space="preserve">☑</w:t>
+            </w:r>
+            <w:r>
+              <w:t xml:space="preserve"> </w:t>
+            </w:r>
+            <w:r>
+              <w:rPr>
+                <w:bCs/>
+                <w:b/>
+              </w:rPr>
+              <w:t xml:space="preserve">评估</w:t>
             </w:r>
           </w:p>
         </w:tc>
@@ -359,7 +354,27 @@
               <w:t xml:space="preserve">当前区块</w:t>
             </w:r>
             <w:r>
-              <w:t xml:space="preserve">输出评估报告（见第 2 章）</w:t>
+              <w:t xml:space="preserve">生成评估报告，</w:t>
+            </w:r>
+            <w:r>
+              <w:rPr>
+                <w:bCs/>
+                <w:b/>
+              </w:rPr>
+              <w:t xml:space="preserve">报告直接显示在该区块内</w:t>
+            </w:r>
+            <w:r>
+              <w:t xml:space="preserve">（见第 2 章）。生成后按钮文字变为「</w:t>
+            </w:r>
+            <w:r>
+              <w:rPr>
+                <w:bCs/>
+                <w:b/>
+              </w:rPr>
+              <w:t xml:space="preserve">评估报告</w:t>
+            </w:r>
+            <w:r>
+              <w:t xml:space="preserve">」并带意见数角标</w:t>
             </w:r>
           </w:p>
         </w:tc>
@@ -385,19 +400,17 @@
               <w:jc w:val="left"/>
             </w:pPr>
             <w:r>
-              <w:t xml:space="preserve">循环箭头</w:t>
-            </w:r>
-          </w:p>
-        </w:tc>
-        <w:tc>
-          <w:tcPr/>
-          <w:p>
-            <w:pPr>
-              <w:pStyle w:val="Compact"/>
-              <w:jc w:val="left"/>
-            </w:pPr>
-            <w:r>
-              <w:t xml:space="preserve">重写 / 重写本集</w:t>
+              <w:t xml:space="preserve">↻</w:t>
+            </w:r>
+            <w:r>
+              <w:t xml:space="preserve"> </w:t>
+            </w:r>
+            <w:r>
+              <w:rPr>
+                <w:bCs/>
+                <w:b/>
+              </w:rPr>
+              <w:t xml:space="preserve">重写</w:t>
             </w:r>
           </w:p>
         </w:tc>
@@ -442,7 +455,7 @@
           <wp:inline>
             <wp:extent cx="5334000" cy="3200400"/>
             <wp:effectExtent b="0" l="0" r="0" t="0"/>
-            <wp:docPr descr="创意阶段：区块右上角两图标" title="" id="22" name="Picture"/>
+            <wp:docPr descr="创意阶段：区块右上角「评估」「重写」按钮" title="" id="22" name="Picture"/>
             <a:graphic>
               <a:graphicData uri="http://schemas.openxmlformats.org/drawingml/2006/picture">
                 <pic:pic>
@@ -485,7 +498,554 @@
         <w:pStyle w:val="ImageCaption"/>
       </w:pPr>
       <w:r>
-        <w:t xml:space="preserve">创意阶段：区块右上角两图标</w:t>
+        <w:t xml:space="preserve">创意阶段：区块右上角「评估」「重写」按钮</w:t>
+      </w:r>
+    </w:p>
+    <w:bookmarkEnd w:id="24"/>
+    <w:bookmarkStart w:id="25" w:name="各阶段的区块粒度"/>
+    <w:p>
+      <w:pPr>
+        <w:pStyle w:val="Heading2"/>
+      </w:pPr>
+      <w:r>
+        <w:t xml:space="preserve">1.2 各阶段的“区块”粒度</w:t>
+      </w:r>
+    </w:p>
+    <w:tbl>
+      <w:tblPr>
+        <w:tblStyle w:val="Table"/>
+        <w:tblW w:type="pct" w:w="5000"/>
+        <w:tblLook w:firstRow="1" w:lastRow="0" w:firstColumn="0" w:lastColumn="0" w:noHBand="0" w:noVBand="0" w:val="0020"/>
+        <w:jc w:val="start"/>
+      </w:tblPr>
+      <w:tblGrid>
+        <w:gridCol w:w="2640"/>
+        <w:gridCol w:w="2640"/>
+        <w:gridCol w:w="2640"/>
+      </w:tblGrid>
+      <w:tr>
+        <w:trPr>
+          <w:tblHeader w:val="true"/>
+        </w:trPr>
+        <w:tc>
+          <w:tcPr/>
+          <w:p>
+            <w:pPr>
+              <w:pStyle w:val="Compact"/>
+              <w:jc w:val="left"/>
+            </w:pPr>
+            <w:r>
+              <w:t xml:space="preserve">阶段</w:t>
+            </w:r>
+          </w:p>
+        </w:tc>
+        <w:tc>
+          <w:tcPr/>
+          <w:p>
+            <w:pPr>
+              <w:pStyle w:val="Compact"/>
+              <w:jc w:val="left"/>
+            </w:pPr>
+            <w:r>
+              <w:t xml:space="preserve">区块</w:t>
+            </w:r>
+          </w:p>
+        </w:tc>
+        <w:tc>
+          <w:tcPr/>
+          <w:p>
+            <w:pPr>
+              <w:pStyle w:val="Compact"/>
+              <w:jc w:val="left"/>
+            </w:pPr>
+            <w:r>
+              <w:t xml:space="preserve">评估 / 重写的对象</w:t>
+            </w:r>
+          </w:p>
+        </w:tc>
+      </w:tr>
+      <w:tr>
+        <w:tc>
+          <w:tcPr/>
+          <w:p>
+            <w:pPr>
+              <w:pStyle w:val="Compact"/>
+              <w:jc w:val="left"/>
+            </w:pPr>
+            <w:r>
+              <w:t xml:space="preserve">创意生成</w:t>
+            </w:r>
+          </w:p>
+        </w:tc>
+        <w:tc>
+          <w:tcPr/>
+          <w:p>
+            <w:pPr>
+              <w:pStyle w:val="Compact"/>
+              <w:jc w:val="left"/>
+            </w:pPr>
+            <w:r>
+              <w:t xml:space="preserve">「核心创意」一个区块</w:t>
+            </w:r>
+          </w:p>
+        </w:tc>
+        <w:tc>
+          <w:tcPr/>
+          <w:p>
+            <w:pPr>
+              <w:pStyle w:val="Compact"/>
+              <w:jc w:val="left"/>
+            </w:pPr>
+            <w:r>
+              <w:t xml:space="preserve">整个核心创意</w:t>
+            </w:r>
+          </w:p>
+        </w:tc>
+      </w:tr>
+      <w:tr>
+        <w:tc>
+          <w:tcPr/>
+          <w:p>
+            <w:pPr>
+              <w:pStyle w:val="Compact"/>
+              <w:jc w:val="left"/>
+            </w:pPr>
+            <w:r>
+              <w:t xml:space="preserve">策划案</w:t>
+            </w:r>
+          </w:p>
+        </w:tc>
+        <w:tc>
+          <w:tcPr/>
+          <w:p>
+            <w:pPr>
+              <w:pStyle w:val="Compact"/>
+              <w:jc w:val="left"/>
+            </w:pPr>
+            <w:r>
+              <w:rPr>
+                <w:bCs/>
+                <w:b/>
+              </w:rPr>
+              <w:t xml:space="preserve">「人物小传」「策划案」两个区块</w:t>
+            </w:r>
+            <w:r>
+              <w:t xml:space="preserve">（各自有图标）</w:t>
+            </w:r>
+          </w:p>
+        </w:tc>
+        <w:tc>
+          <w:tcPr/>
+          <w:p>
+            <w:pPr>
+              <w:pStyle w:val="Compact"/>
+              <w:jc w:val="left"/>
+            </w:pPr>
+            <w:r>
+              <w:t xml:space="preserve">对应区块</w:t>
+            </w:r>
+          </w:p>
+        </w:tc>
+      </w:tr>
+      <w:tr>
+        <w:tc>
+          <w:tcPr/>
+          <w:p>
+            <w:pPr>
+              <w:pStyle w:val="Compact"/>
+              <w:jc w:val="left"/>
+            </w:pPr>
+            <w:r>
+              <w:t xml:space="preserve">集纲</w:t>
+            </w:r>
+          </w:p>
+        </w:tc>
+        <w:tc>
+          <w:tcPr/>
+          <w:p>
+            <w:pPr>
+              <w:pStyle w:val="Compact"/>
+              <w:jc w:val="left"/>
+            </w:pPr>
+            <w:r>
+              <w:rPr>
+                <w:bCs/>
+                <w:b/>
+              </w:rPr>
+              <w:t xml:space="preserve">每一集一个区块</w:t>
+            </w:r>
+            <w:r>
+              <w:t xml:space="preserve">（标题行为「第 N 集 + 集名」）</w:t>
+            </w:r>
+          </w:p>
+        </w:tc>
+        <w:tc>
+          <w:tcPr/>
+          <w:p>
+            <w:pPr>
+              <w:pStyle w:val="Compact"/>
+              <w:jc w:val="left"/>
+            </w:pPr>
+            <w:r>
+              <w:t xml:space="preserve">仅当前这一集</w:t>
+            </w:r>
+          </w:p>
+        </w:tc>
+      </w:tr>
+      <w:tr>
+        <w:tc>
+          <w:tcPr/>
+          <w:p>
+            <w:pPr>
+              <w:pStyle w:val="Compact"/>
+              <w:jc w:val="left"/>
+            </w:pPr>
+            <w:r>
+              <w:t xml:space="preserve">剧本</w:t>
+            </w:r>
+          </w:p>
+        </w:tc>
+        <w:tc>
+          <w:tcPr/>
+          <w:p>
+            <w:pPr>
+              <w:pStyle w:val="Compact"/>
+              <w:jc w:val="left"/>
+            </w:pPr>
+            <w:r>
+              <w:rPr>
+                <w:bCs/>
+                <w:b/>
+              </w:rPr>
+              <w:t xml:space="preserve">每一集一个区块</w:t>
+            </w:r>
+            <w:r>
+              <w:t xml:space="preserve">（标题行为「EP0N + 集名」）</w:t>
+            </w:r>
+          </w:p>
+        </w:tc>
+        <w:tc>
+          <w:tcPr/>
+          <w:p>
+            <w:pPr>
+              <w:pStyle w:val="Compact"/>
+              <w:jc w:val="left"/>
+            </w:pPr>
+            <w:r>
+              <w:t xml:space="preserve">仅当前这一集</w:t>
+            </w:r>
+          </w:p>
+        </w:tc>
+      </w:tr>
+    </w:tbl>
+    <w:p>
+      <w:pPr>
+        <w:pStyle w:val="BodyText"/>
+      </w:pPr>
+      <w:r>
+        <w:t xml:space="preserve">集纲、剧本阶段的评估 / 重写都只作用于</w:t>
+      </w:r>
+      <w:r>
+        <w:rPr>
+          <w:bCs/>
+          <w:b/>
+        </w:rPr>
+        <w:t xml:space="preserve">当前这一集</w:t>
+      </w:r>
+      <w:r>
+        <w:t xml:space="preserve">（区块标题即集名），避免误以为作用于整卡。</w:t>
+      </w:r>
+    </w:p>
+    <w:bookmarkEnd w:id="25"/>
+    <w:bookmarkStart w:id="26" w:name="与其它入口的关系"/>
+    <w:p>
+      <w:pPr>
+        <w:pStyle w:val="Heading2"/>
+      </w:pPr>
+      <w:r>
+        <w:t xml:space="preserve">1.3 与其它入口的关系</w:t>
+      </w:r>
+    </w:p>
+    <w:p>
+      <w:pPr>
+        <w:numPr>
+          <w:ilvl w:val="0"/>
+          <w:numId w:val="1002"/>
+        </w:numPr>
+        <w:pStyle w:val="Compact"/>
+      </w:pPr>
+      <w:r>
+        <w:t xml:space="preserve">原「页面右上角剧本医生」按钮：</w:t>
+      </w:r>
+      <w:r>
+        <w:rPr>
+          <w:bCs/>
+          <w:b/>
+        </w:rPr>
+        <w:t xml:space="preserve">取消</w:t>
+      </w:r>
+      <w:r>
+        <w:t xml:space="preserve">。</w:t>
+      </w:r>
+    </w:p>
+    <w:p>
+      <w:pPr>
+        <w:numPr>
+          <w:ilvl w:val="0"/>
+          <w:numId w:val="1002"/>
+        </w:numPr>
+        <w:pStyle w:val="Compact"/>
+      </w:pPr>
+      <w:r>
+        <w:t xml:space="preserve">AI 助手输入框里的「剧本医生」：</w:t>
+      </w:r>
+      <w:r>
+        <w:rPr>
+          <w:bCs/>
+          <w:b/>
+        </w:rPr>
+        <w:t xml:space="preserve">删除</w:t>
+      </w:r>
+      <w:r>
+        <w:t xml:space="preserve">。输入框只保留「作用于：当前阶段」与发送。</w:t>
+      </w:r>
+    </w:p>
+    <w:bookmarkEnd w:id="26"/>
+    <w:bookmarkEnd w:id="27"/>
+    <w:bookmarkStart w:id="53" w:name="评估只出报告不改原文"/>
+    <w:p>
+      <w:pPr>
+        <w:pStyle w:val="Heading1"/>
+      </w:pPr>
+      <w:r>
+        <w:t xml:space="preserve">2. 评估（只出报告，不改原文）</w:t>
+      </w:r>
+    </w:p>
+    <w:p>
+      <w:pPr>
+        <w:pStyle w:val="FirstParagraph"/>
+      </w:pPr>
+      <w:r>
+        <w:rPr>
+          <w:bCs/>
+          <w:b/>
+        </w:rPr>
+        <w:t xml:space="preserve">原则：评估只输出报告和意见，不帮写、不重写、不修改任何原文。</w:t>
+      </w:r>
+    </w:p>
+    <w:bookmarkStart w:id="43" w:name="流程报告在区块内展示不进-ai-助手"/>
+    <w:p>
+      <w:pPr>
+        <w:pStyle w:val="Heading2"/>
+      </w:pPr>
+      <w:r>
+        <w:t xml:space="preserve">2.1 流程（报告在区块内展示，不进 AI 助手）</w:t>
+      </w:r>
+    </w:p>
+    <w:p>
+      <w:pPr>
+        <w:numPr>
+          <w:ilvl w:val="0"/>
+          <w:numId w:val="1003"/>
+        </w:numPr>
+        <w:pStyle w:val="Compact"/>
+      </w:pPr>
+      <w:r>
+        <w:t xml:space="preserve">点击区块的「评估」→ 区块内（标题行下方）出现扫描进度（约 2 秒）。</w:t>
+      </w:r>
+      <w:r>
+        <w:rPr>
+          <w:bCs/>
+          <w:b/>
+        </w:rPr>
+        <w:t xml:space="preserve">不会打开 AI 助手侧栏</w:t>
+      </w:r>
+      <w:r>
+        <w:t xml:space="preserve">。</w:t>
+      </w:r>
+    </w:p>
+    <w:p>
+      <w:pPr>
+        <w:numPr>
+          <w:ilvl w:val="0"/>
+          <w:numId w:val="1003"/>
+        </w:numPr>
+        <w:pStyle w:val="Compact"/>
+      </w:pPr>
+      <w:r>
+        <w:t xml:space="preserve">出报告：区块内展开一张「评估报告」卡片，位于原文上方：</w:t>
+      </w:r>
+    </w:p>
+    <w:p>
+      <w:pPr>
+        <w:numPr>
+          <w:ilvl w:val="1"/>
+          <w:numId w:val="1004"/>
+        </w:numPr>
+        <w:pStyle w:val="Compact"/>
+      </w:pPr>
+      <w:r>
+        <w:t xml:space="preserve">总分环 + 状态（✓ 良好 ≥75 / ! 一般 60–74 / ✕ 待加强 &lt;60，</w:t>
+      </w:r>
+      <w:r>
+        <w:rPr>
+          <w:bCs/>
+          <w:b/>
+        </w:rPr>
+        <w:t xml:space="preserve">状态一律“图标 + 文字”</w:t>
+      </w:r>
+      <w:r>
+        <w:t xml:space="preserve">）；</w:t>
+      </w:r>
+    </w:p>
+    <w:p>
+      <w:pPr>
+        <w:numPr>
+          <w:ilvl w:val="1"/>
+          <w:numId w:val="1004"/>
+        </w:numPr>
+        <w:pStyle w:val="Compact"/>
+      </w:pPr>
+      <w:r>
+        <w:t xml:space="preserve">分项条形（每个阶段 4 个维度，见 2.3）；</w:t>
+      </w:r>
+    </w:p>
+    <w:p>
+      <w:pPr>
+        <w:numPr>
+          <w:ilvl w:val="1"/>
+          <w:numId w:val="1004"/>
+        </w:numPr>
+        <w:pStyle w:val="Compact"/>
+      </w:pPr>
+      <w:r>
+        <w:t xml:space="preserve">修改意见列表，编号 1、2、3…（宽屏两列排布）；</w:t>
+      </w:r>
+    </w:p>
+    <w:p>
+      <w:pPr>
+        <w:numPr>
+          <w:ilvl w:val="0"/>
+          <w:numId w:val="1003"/>
+        </w:numPr>
+        <w:pStyle w:val="Compact"/>
+      </w:pPr>
+      <w:r>
+        <w:rPr>
+          <w:bCs/>
+          <w:b/>
+        </w:rPr>
+        <w:t xml:space="preserve">同步在报告下方的原文里标注</w:t>
+      </w:r>
+      <w:r>
+        <w:t xml:space="preserve">：有问题的原句加波浪下划线与底色（红 = 需修改、黄 = 建议），句尾带同编号的小圆标。</w:t>
+      </w:r>
+    </w:p>
+    <w:p>
+      <w:pPr>
+        <w:numPr>
+          <w:ilvl w:val="0"/>
+          <w:numId w:val="1003"/>
+        </w:numPr>
+        <w:pStyle w:val="Compact"/>
+      </w:pPr>
+      <w:r>
+        <w:t xml:space="preserve">点击报告里的某条意见 → 原文滚动到该句并高亮；反向，点原文里的圆标 → 报告中对应意见高亮。</w:t>
+      </w:r>
+    </w:p>
+    <w:p>
+      <w:pPr>
+        <w:numPr>
+          <w:ilvl w:val="0"/>
+          <w:numId w:val="1003"/>
+        </w:numPr>
+        <w:pStyle w:val="Compact"/>
+      </w:pPr>
+      <w:r>
+        <w:t xml:space="preserve">报告卡片右上角有</w:t>
+      </w:r>
+      <w:r>
+        <w:t xml:space="preserve"> </w:t>
+      </w:r>
+      <w:r>
+        <w:rPr>
+          <w:bCs/>
+          <w:b/>
+        </w:rPr>
+        <w:t xml:space="preserve">✕ 关闭</w:t>
+      </w:r>
+      <w:r>
+        <w:t xml:space="preserve">。关闭后报告卡片与原文标红一并收起，区块恢复干净原文。</w:t>
+      </w:r>
+    </w:p>
+    <w:p>
+      <w:pPr>
+        <w:numPr>
+          <w:ilvl w:val="0"/>
+          <w:numId w:val="1003"/>
+        </w:numPr>
+        <w:pStyle w:val="Compact"/>
+      </w:pPr>
+      <w:r>
+        <w:rPr>
+          <w:bCs/>
+          <w:b/>
+        </w:rPr>
+        <w:t xml:space="preserve">只生成一次</w:t>
+      </w:r>
+      <w:r>
+        <w:t xml:space="preserve">：关闭后，区块右上角按钮变为「</w:t>
+      </w:r>
+      <w:r>
+        <w:rPr>
+          <w:bCs/>
+          <w:b/>
+        </w:rPr>
+        <w:t xml:space="preserve">评估报告</w:t>
+      </w:r>
+      <w:r>
+        <w:t xml:space="preserve">」（带意见数角标）；再点一下直接展开已有报告，</w:t>
+      </w:r>
+      <w:r>
+        <w:rPr>
+          <w:bCs/>
+          <w:b/>
+        </w:rPr>
+        <w:t xml:space="preserve">不会重新评估</w:t>
+      </w:r>
+      <w:r>
+        <w:t xml:space="preserve">；再点一下可收起。</w:t>
+      </w:r>
+    </w:p>
+    <w:p>
+      <w:pPr>
+        <w:numPr>
+          <w:ilvl w:val="0"/>
+          <w:numId w:val="1003"/>
+        </w:numPr>
+        <w:pStyle w:val="Compact"/>
+      </w:pPr>
+      <w:r>
+        <w:t xml:space="preserve">左侧树对应节点同步显示意见总数。</w:t>
+      </w:r>
+    </w:p>
+    <w:p>
+      <w:pPr>
+        <w:numPr>
+          <w:ilvl w:val="0"/>
+          <w:numId w:val="1003"/>
+        </w:numPr>
+        <w:pStyle w:val="Compact"/>
+      </w:pPr>
+      <w:r>
+        <w:t xml:space="preserve">卡片底部固定提示：「评估只给意见，不改动、不重写原文。需要修改请点右上角的『重写』」。</w:t>
+      </w:r>
+      <w:r>
+        <w:rPr>
+          <w:bCs/>
+          <w:b/>
+        </w:rPr>
+        <w:t xml:space="preserve">报告里没有任何修改类按钮。</w:t>
       </w:r>
     </w:p>
     <w:p>
@@ -497,18 +1057,18 @@
           <wp:inline>
             <wp:extent cx="5334000" cy="3200400"/>
             <wp:effectExtent b="0" l="0" r="0" t="0"/>
-            <wp:docPr descr="悬停提示" title="" id="25" name="Picture"/>
+            <wp:docPr descr="扫描中（在区块内）" title="" id="29" name="Picture"/>
             <a:graphic>
               <a:graphicData uri="http://schemas.openxmlformats.org/drawingml/2006/picture">
                 <pic:pic>
                   <pic:nvPicPr>
-                    <pic:cNvPr descr="wd-img/w02-tip-eval.jpg" id="26" name="Picture"/>
+                    <pic:cNvPr descr="wd-img/w04-scan.jpg" id="30" name="Picture"/>
                     <pic:cNvPicPr>
                       <a:picLocks noChangeArrowheads="1" noChangeAspect="1"/>
                     </pic:cNvPicPr>
                   </pic:nvPicPr>
                   <pic:blipFill>
-                    <a:blip r:embed="rId24"/>
+                    <a:blip r:embed="rId28"/>
                     <a:stretch>
                       <a:fillRect/>
                     </a:stretch>
@@ -540,306 +1100,7 @@
         <w:pStyle w:val="ImageCaption"/>
       </w:pPr>
       <w:r>
-        <w:t xml:space="preserve">悬停提示</w:t>
-      </w:r>
-    </w:p>
-    <w:bookmarkEnd w:id="27"/>
-    <w:bookmarkStart w:id="28" w:name="各阶段的区块粒度"/>
-    <w:p>
-      <w:pPr>
-        <w:pStyle w:val="Heading2"/>
-      </w:pPr>
-      <w:r>
-        <w:t xml:space="preserve">1.2 各阶段的“区块”粒度</w:t>
-      </w:r>
-    </w:p>
-    <w:tbl>
-      <w:tblPr>
-        <w:tblStyle w:val="Table"/>
-        <w:tblW w:type="pct" w:w="5000"/>
-        <w:tblLook w:firstRow="1" w:lastRow="0" w:firstColumn="0" w:lastColumn="0" w:noHBand="0" w:noVBand="0" w:val="0020"/>
-        <w:jc w:val="start"/>
-      </w:tblPr>
-      <w:tblGrid>
-        <w:gridCol w:w="2640"/>
-        <w:gridCol w:w="2640"/>
-        <w:gridCol w:w="2640"/>
-      </w:tblGrid>
-      <w:tr>
-        <w:trPr>
-          <w:tblHeader w:val="true"/>
-        </w:trPr>
-        <w:tc>
-          <w:tcPr/>
-          <w:p>
-            <w:pPr>
-              <w:pStyle w:val="Compact"/>
-              <w:jc w:val="left"/>
-            </w:pPr>
-            <w:r>
-              <w:t xml:space="preserve">阶段</w:t>
-            </w:r>
-          </w:p>
-        </w:tc>
-        <w:tc>
-          <w:tcPr/>
-          <w:p>
-            <w:pPr>
-              <w:pStyle w:val="Compact"/>
-              <w:jc w:val="left"/>
-            </w:pPr>
-            <w:r>
-              <w:t xml:space="preserve">区块</w:t>
-            </w:r>
-          </w:p>
-        </w:tc>
-        <w:tc>
-          <w:tcPr/>
-          <w:p>
-            <w:pPr>
-              <w:pStyle w:val="Compact"/>
-              <w:jc w:val="left"/>
-            </w:pPr>
-            <w:r>
-              <w:t xml:space="preserve">评估 / 重写的对象</w:t>
-            </w:r>
-          </w:p>
-        </w:tc>
-      </w:tr>
-      <w:tr>
-        <w:tc>
-          <w:tcPr/>
-          <w:p>
-            <w:pPr>
-              <w:pStyle w:val="Compact"/>
-              <w:jc w:val="left"/>
-            </w:pPr>
-            <w:r>
-              <w:t xml:space="preserve">创意生成</w:t>
-            </w:r>
-          </w:p>
-        </w:tc>
-        <w:tc>
-          <w:tcPr/>
-          <w:p>
-            <w:pPr>
-              <w:pStyle w:val="Compact"/>
-              <w:jc w:val="left"/>
-            </w:pPr>
-            <w:r>
-              <w:t xml:space="preserve">「核心创意」一个区块</w:t>
-            </w:r>
-          </w:p>
-        </w:tc>
-        <w:tc>
-          <w:tcPr/>
-          <w:p>
-            <w:pPr>
-              <w:pStyle w:val="Compact"/>
-              <w:jc w:val="left"/>
-            </w:pPr>
-            <w:r>
-              <w:t xml:space="preserve">整个核心创意</w:t>
-            </w:r>
-          </w:p>
-        </w:tc>
-      </w:tr>
-      <w:tr>
-        <w:tc>
-          <w:tcPr/>
-          <w:p>
-            <w:pPr>
-              <w:pStyle w:val="Compact"/>
-              <w:jc w:val="left"/>
-            </w:pPr>
-            <w:r>
-              <w:t xml:space="preserve">策划案</w:t>
-            </w:r>
-          </w:p>
-        </w:tc>
-        <w:tc>
-          <w:tcPr/>
-          <w:p>
-            <w:pPr>
-              <w:pStyle w:val="Compact"/>
-              <w:jc w:val="left"/>
-            </w:pPr>
-            <w:r>
-              <w:rPr>
-                <w:bCs/>
-                <w:b/>
-              </w:rPr>
-              <w:t xml:space="preserve">「人物小传」「策划案」两个区块</w:t>
-            </w:r>
-            <w:r>
-              <w:t xml:space="preserve">（各自有图标）</w:t>
-            </w:r>
-          </w:p>
-        </w:tc>
-        <w:tc>
-          <w:tcPr/>
-          <w:p>
-            <w:pPr>
-              <w:pStyle w:val="Compact"/>
-              <w:jc w:val="left"/>
-            </w:pPr>
-            <w:r>
-              <w:t xml:space="preserve">对应区块</w:t>
-            </w:r>
-          </w:p>
-        </w:tc>
-      </w:tr>
-      <w:tr>
-        <w:tc>
-          <w:tcPr/>
-          <w:p>
-            <w:pPr>
-              <w:pStyle w:val="Compact"/>
-              <w:jc w:val="left"/>
-            </w:pPr>
-            <w:r>
-              <w:t xml:space="preserve">集纲</w:t>
-            </w:r>
-          </w:p>
-        </w:tc>
-        <w:tc>
-          <w:tcPr/>
-          <w:p>
-            <w:pPr>
-              <w:pStyle w:val="Compact"/>
-              <w:jc w:val="left"/>
-            </w:pPr>
-            <w:r>
-              <w:rPr>
-                <w:bCs/>
-                <w:b/>
-              </w:rPr>
-              <w:t xml:space="preserve">每一集一个区块</w:t>
-            </w:r>
-            <w:r>
-              <w:t xml:space="preserve">（标题行为「第 N 集 + 集名」）</w:t>
-            </w:r>
-          </w:p>
-        </w:tc>
-        <w:tc>
-          <w:tcPr/>
-          <w:p>
-            <w:pPr>
-              <w:pStyle w:val="Compact"/>
-              <w:jc w:val="left"/>
-            </w:pPr>
-            <w:r>
-              <w:t xml:space="preserve">仅当前这一集</w:t>
-            </w:r>
-          </w:p>
-        </w:tc>
-      </w:tr>
-      <w:tr>
-        <w:tc>
-          <w:tcPr/>
-          <w:p>
-            <w:pPr>
-              <w:pStyle w:val="Compact"/>
-              <w:jc w:val="left"/>
-            </w:pPr>
-            <w:r>
-              <w:t xml:space="preserve">剧本</w:t>
-            </w:r>
-          </w:p>
-        </w:tc>
-        <w:tc>
-          <w:tcPr/>
-          <w:p>
-            <w:pPr>
-              <w:pStyle w:val="Compact"/>
-              <w:jc w:val="left"/>
-            </w:pPr>
-            <w:r>
-              <w:rPr>
-                <w:bCs/>
-                <w:b/>
-              </w:rPr>
-              <w:t xml:space="preserve">每一集一个区块</w:t>
-            </w:r>
-            <w:r>
-              <w:t xml:space="preserve">（标题行为「EP0N + 集名」）</w:t>
-            </w:r>
-          </w:p>
-        </w:tc>
-        <w:tc>
-          <w:tcPr/>
-          <w:p>
-            <w:pPr>
-              <w:pStyle w:val="Compact"/>
-              <w:jc w:val="left"/>
-            </w:pPr>
-            <w:r>
-              <w:t xml:space="preserve">仅当前这一集</w:t>
-            </w:r>
-          </w:p>
-        </w:tc>
-      </w:tr>
-    </w:tbl>
-    <w:p>
-      <w:pPr>
-        <w:pStyle w:val="BodyText"/>
-      </w:pPr>
-      <w:r>
-        <w:t xml:space="preserve">集纲、剧本阶段的悬停文字带“本集”（评估本集 / 重写本集），避免用户误以为作用于整卡。</w:t>
-      </w:r>
-    </w:p>
-    <w:bookmarkEnd w:id="28"/>
-    <w:bookmarkStart w:id="32" w:name="与其它入口的关系"/>
-    <w:p>
-      <w:pPr>
-        <w:pStyle w:val="Heading2"/>
-      </w:pPr>
-      <w:r>
-        <w:t xml:space="preserve">1.3 与其它入口的关系</w:t>
-      </w:r>
-    </w:p>
-    <w:p>
-      <w:pPr>
-        <w:numPr>
-          <w:ilvl w:val="0"/>
-          <w:numId w:val="1002"/>
-        </w:numPr>
-        <w:pStyle w:val="Compact"/>
-      </w:pPr>
-      <w:r>
-        <w:t xml:space="preserve">原「页面右上角剧本医生」按钮：</w:t>
-      </w:r>
-      <w:r>
-        <w:rPr>
-          <w:bCs/>
-          <w:b/>
-        </w:rPr>
-        <w:t xml:space="preserve">取消</w:t>
-      </w:r>
-      <w:r>
-        <w:t xml:space="preserve">。</w:t>
-      </w:r>
-    </w:p>
-    <w:p>
-      <w:pPr>
-        <w:numPr>
-          <w:ilvl w:val="0"/>
-          <w:numId w:val="1002"/>
-        </w:numPr>
-        <w:pStyle w:val="Compact"/>
-      </w:pPr>
-      <w:r>
-        <w:t xml:space="preserve">AI 助手输入框里的「剧本医生」：</w:t>
-      </w:r>
-      <w:r>
-        <w:rPr>
-          <w:bCs/>
-          <w:b/>
-        </w:rPr>
-        <w:t xml:space="preserve">删除</w:t>
-      </w:r>
-      <w:r>
-        <w:t xml:space="preserve">。输入框只保留「作用于：当前阶段」与发送。</w:t>
+        <w:t xml:space="preserve">扫描中（在区块内）</w:t>
       </w:r>
     </w:p>
     <w:p>
@@ -851,18 +1112,18 @@
           <wp:inline>
             <wp:extent cx="5334000" cy="3200400"/>
             <wp:effectExtent b="0" l="0" r="0" t="0"/>
-            <wp:docPr descr="AI 助手中已无剧本医生" title="" id="30" name="Picture"/>
+            <wp:docPr descr="评估报告直接显示在区块内" title="" id="32" name="Picture"/>
             <a:graphic>
               <a:graphicData uri="http://schemas.openxmlformats.org/drawingml/2006/picture">
                 <pic:pic>
                   <pic:nvPicPr>
-                    <pic:cNvPr descr="wd-img/w12-assistant-no-doctor.jpg" id="31" name="Picture"/>
+                    <pic:cNvPr descr="wd-img/w05-report.jpg" id="33" name="Picture"/>
                     <pic:cNvPicPr>
                       <a:picLocks noChangeArrowheads="1" noChangeAspect="1"/>
                     </pic:cNvPicPr>
                   </pic:nvPicPr>
                   <pic:blipFill>
-                    <a:blip r:embed="rId29"/>
+                    <a:blip r:embed="rId31"/>
                     <a:stretch>
                       <a:fillRect/>
                     </a:stretch>
@@ -894,171 +1155,7 @@
         <w:pStyle w:val="ImageCaption"/>
       </w:pPr>
       <w:r>
-        <w:t xml:space="preserve">AI 助手中已无剧本医生</w:t>
-      </w:r>
-    </w:p>
-    <w:bookmarkEnd w:id="32"/>
-    <w:bookmarkEnd w:id="33"/>
-    <w:bookmarkStart w:id="53" w:name="评估只出报告不改原文"/>
-    <w:p>
-      <w:pPr>
-        <w:pStyle w:val="Heading1"/>
-      </w:pPr>
-      <w:r>
-        <w:t xml:space="preserve">2. 评估（只出报告，不改原文）</w:t>
-      </w:r>
-    </w:p>
-    <w:p>
-      <w:pPr>
-        <w:pStyle w:val="FirstParagraph"/>
-      </w:pPr>
-      <w:r>
-        <w:rPr>
-          <w:bCs/>
-          <w:b/>
-        </w:rPr>
-        <w:t xml:space="preserve">原则：评估只输出报告和意见，不帮写、不重写、不修改任何原文。</w:t>
-      </w:r>
-    </w:p>
-    <w:bookmarkStart w:id="43" w:name="流程"/>
-    <w:p>
-      <w:pPr>
-        <w:pStyle w:val="Heading2"/>
-      </w:pPr>
-      <w:r>
-        <w:t xml:space="preserve">2.1 流程</w:t>
-      </w:r>
-    </w:p>
-    <w:p>
-      <w:pPr>
-        <w:numPr>
-          <w:ilvl w:val="0"/>
-          <w:numId w:val="1003"/>
-        </w:numPr>
-        <w:pStyle w:val="Compact"/>
-      </w:pPr>
-      <w:r>
-        <w:t xml:space="preserve">点击区块的「评估」→ 右侧栏切到「评估报告」页签，显示扫描进度（约 2 秒）。</w:t>
-      </w:r>
-    </w:p>
-    <w:p>
-      <w:pPr>
-        <w:numPr>
-          <w:ilvl w:val="0"/>
-          <w:numId w:val="1003"/>
-        </w:numPr>
-        <w:pStyle w:val="Compact"/>
-      </w:pPr>
-      <w:r>
-        <w:t xml:space="preserve">出报告：</w:t>
-      </w:r>
-    </w:p>
-    <w:p>
-      <w:pPr>
-        <w:numPr>
-          <w:ilvl w:val="1"/>
-          <w:numId w:val="1004"/>
-        </w:numPr>
-        <w:pStyle w:val="Compact"/>
-      </w:pPr>
-      <w:r>
-        <w:t xml:space="preserve">总分环 + 状态（✓ 良好 ≥75 / ! 一般 60–74 / ✕ 待加强 &lt;60，</w:t>
-      </w:r>
-      <w:r>
-        <w:rPr>
-          <w:bCs/>
-          <w:b/>
-        </w:rPr>
-        <w:t xml:space="preserve">状态一律“图标 + 文字”，不只靠颜色</w:t>
-      </w:r>
-      <w:r>
-        <w:t xml:space="preserve">）；</w:t>
-      </w:r>
-    </w:p>
-    <w:p>
-      <w:pPr>
-        <w:numPr>
-          <w:ilvl w:val="1"/>
-          <w:numId w:val="1004"/>
-        </w:numPr>
-        <w:pStyle w:val="Compact"/>
-      </w:pPr>
-      <w:r>
-        <w:t xml:space="preserve">分项条形（每个阶段 4 个维度，见 2.3）；</w:t>
-      </w:r>
-    </w:p>
-    <w:p>
-      <w:pPr>
-        <w:numPr>
-          <w:ilvl w:val="1"/>
-          <w:numId w:val="1004"/>
-        </w:numPr>
-        <w:pStyle w:val="Compact"/>
-      </w:pPr>
-      <w:r>
-        <w:t xml:space="preserve">修改意见列表，编号 1、2、3……；</w:t>
-      </w:r>
-    </w:p>
-    <w:p>
-      <w:pPr>
-        <w:numPr>
-          <w:ilvl w:val="0"/>
-          <w:numId w:val="1003"/>
-        </w:numPr>
-        <w:pStyle w:val="Compact"/>
-      </w:pPr>
-      <w:r>
-        <w:rPr>
-          <w:bCs/>
-          <w:b/>
-        </w:rPr>
-        <w:t xml:space="preserve">同步在原文里标注</w:t>
-      </w:r>
-      <w:r>
-        <w:t xml:space="preserve">：有问题的原句加波浪下划线与底色（红 = 需修改、黄 = 建议），句尾带同编号的小圆标。</w:t>
-      </w:r>
-    </w:p>
-    <w:p>
-      <w:pPr>
-        <w:numPr>
-          <w:ilvl w:val="0"/>
-          <w:numId w:val="1003"/>
-        </w:numPr>
-        <w:pStyle w:val="Compact"/>
-      </w:pPr>
-      <w:r>
-        <w:t xml:space="preserve">点击报告里的某条意见 → 原文滚动到该句并高亮；反向，点原文里的圆标 → 右侧对应意见高亮。</w:t>
-      </w:r>
-    </w:p>
-    <w:p>
-      <w:pPr>
-        <w:numPr>
-          <w:ilvl w:val="0"/>
-          <w:numId w:val="1003"/>
-        </w:numPr>
-        <w:pStyle w:val="Compact"/>
-      </w:pPr>
-      <w:r>
-        <w:t xml:space="preserve">区块的「评估」图标右上角出现红色数字角标（意见数）；左侧树对应节点同步显示总数。</w:t>
-      </w:r>
-    </w:p>
-    <w:p>
-      <w:pPr>
-        <w:numPr>
-          <w:ilvl w:val="0"/>
-          <w:numId w:val="1003"/>
-        </w:numPr>
-        <w:pStyle w:val="Compact"/>
-      </w:pPr>
-      <w:r>
-        <w:t xml:space="preserve">报告底部固定提示：「评估只给意见，不改动、不重写原文。需要修改请点该区块右上角的『重写』」。</w:t>
-      </w:r>
-      <w:r>
-        <w:rPr>
-          <w:bCs/>
-          <w:b/>
-        </w:rPr>
-        <w:t xml:space="preserve">报告里没有任何修改类按钮。</w:t>
+        <w:t xml:space="preserve">评估报告直接显示在区块内</w:t>
       </w:r>
     </w:p>
     <w:p>
@@ -1070,12 +1167,12 @@
           <wp:inline>
             <wp:extent cx="5334000" cy="3200400"/>
             <wp:effectExtent b="0" l="0" r="0" t="0"/>
-            <wp:docPr descr="扫描中" title="" id="35" name="Picture"/>
+            <wp:docPr descr="点击意见 4，跳转并高亮原文" title="" id="35" name="Picture"/>
             <a:graphic>
               <a:graphicData uri="http://schemas.openxmlformats.org/drawingml/2006/picture">
                 <pic:pic>
                   <pic:nvPicPr>
-                    <pic:cNvPr descr="wd-img/w04-scan.jpg" id="36" name="Picture"/>
+                    <pic:cNvPr descr="wd-img/w06-jump.jpg" id="36" name="Picture"/>
                     <pic:cNvPicPr>
                       <a:picLocks noChangeArrowheads="1" noChangeAspect="1"/>
                     </pic:cNvPicPr>
@@ -1113,7 +1210,7 @@
         <w:pStyle w:val="ImageCaption"/>
       </w:pPr>
       <w:r>
-        <w:t xml:space="preserve">扫描中</w:t>
+        <w:t xml:space="preserve">点击意见 4，跳转并高亮原文</w:t>
       </w:r>
     </w:p>
     <w:p>
@@ -1125,12 +1222,12 @@
           <wp:inline>
             <wp:extent cx="5334000" cy="3200400"/>
             <wp:effectExtent b="0" l="0" r="0" t="0"/>
-            <wp:docPr descr="评估报告 + 原文标红编号" title="" id="38" name="Picture"/>
+            <wp:docPr descr="关闭报告后区块恢复原文，按钮变为「评估报告」" title="" id="38" name="Picture"/>
             <a:graphic>
               <a:graphicData uri="http://schemas.openxmlformats.org/drawingml/2006/picture">
                 <pic:pic>
                   <pic:nvPicPr>
-                    <pic:cNvPr descr="wd-img/w05-report.jpg" id="39" name="Picture"/>
+                    <pic:cNvPr descr="wd-img/w07-closed.jpg" id="39" name="Picture"/>
                     <pic:cNvPicPr>
                       <a:picLocks noChangeArrowheads="1" noChangeAspect="1"/>
                     </pic:cNvPicPr>
@@ -1168,7 +1265,7 @@
         <w:pStyle w:val="ImageCaption"/>
       </w:pPr>
       <w:r>
-        <w:t xml:space="preserve">评估报告 + 原文标红编号</w:t>
+        <w:t xml:space="preserve">关闭报告后区块恢复原文，按钮变为「评估报告」</w:t>
       </w:r>
     </w:p>
     <w:p>
@@ -1180,12 +1277,12 @@
           <wp:inline>
             <wp:extent cx="5334000" cy="3200400"/>
             <wp:effectExtent b="0" l="0" r="0" t="0"/>
-            <wp:docPr descr="点击意见 4，跳转并高亮原文" title="" id="41" name="Picture"/>
+            <wp:docPr descr="再次点「评估报告」直接展开，无需重新评估" title="" id="41" name="Picture"/>
             <a:graphic>
               <a:graphicData uri="http://schemas.openxmlformats.org/drawingml/2006/picture">
                 <pic:pic>
                   <pic:nvPicPr>
-                    <pic:cNvPr descr="wd-img/w06-jump.jpg" id="42" name="Picture"/>
+                    <pic:cNvPr descr="wd-img/w08-reopened.jpg" id="42" name="Picture"/>
                     <pic:cNvPicPr>
                       <a:picLocks noChangeArrowheads="1" noChangeAspect="1"/>
                     </pic:cNvPicPr>
@@ -1223,7 +1320,7 @@
         <w:pStyle w:val="ImageCaption"/>
       </w:pPr>
       <w:r>
-        <w:t xml:space="preserve">点击意见 4，跳转并高亮原文</w:t>
+        <w:t xml:space="preserve">再次点「评估报告」直接展开，无需重新评估</w:t>
       </w:r>
     </w:p>
     <w:bookmarkEnd w:id="43"/>
@@ -1735,7 +1832,7 @@
         <w:pStyle w:val="Compact"/>
       </w:pPr>
       <w:r>
-        <w:t xml:space="preserve">已有报告且原文未变：再次点「评估」直接打开已有报告；</w:t>
+        <w:t xml:space="preserve">已有报告且原文未变：点「评估报告」直接展开 / 收起已有报告，不重新评估；</w:t>
       </w:r>
     </w:p>
     <w:p>
@@ -1757,7 +1854,7 @@
         <w:t xml:space="preserve">全部清除</w:t>
       </w:r>
       <w:r>
-        <w:t xml:space="preserve">（报告已过期），需重新评估；</w:t>
+        <w:t xml:space="preserve">（报告已过期），按钮恢复为「评估」，需重新评估；</w:t>
       </w:r>
     </w:p>
     <w:p>
@@ -1786,7 +1883,7 @@
     </w:p>
     <w:bookmarkEnd w:id="52"/>
     <w:bookmarkEnd w:id="53"/>
-    <w:bookmarkStart w:id="73" w:name="重写"/>
+    <w:bookmarkStart w:id="67" w:name="重写"/>
     <w:p>
       <w:pPr>
         <w:pStyle w:val="Heading1"/>
@@ -1862,12 +1959,12 @@
           <wp:inline>
             <wp:extent cx="5334000" cy="3200400"/>
             <wp:effectExtent b="0" l="0" r="0" t="0"/>
-            <wp:docPr descr="重写弹窗" title="" id="55" name="Picture"/>
+            <wp:docPr descr="重写完成：红标与报告已清除" title="" id="55" name="Picture"/>
             <a:graphic>
               <a:graphicData uri="http://schemas.openxmlformats.org/drawingml/2006/picture">
                 <pic:pic>
                   <pic:nvPicPr>
-                    <pic:cNvPr descr="wd-img/w07-rewrite-dlg.jpg" id="56" name="Picture"/>
+                    <pic:cNvPr descr="wd-img/w09-rewritten.jpg" id="56" name="Picture"/>
                     <pic:cNvPicPr>
                       <a:picLocks noChangeArrowheads="1" noChangeAspect="1"/>
                     </pic:cNvPicPr>
@@ -1905,7 +2002,293 @@
         <w:pStyle w:val="ImageCaption"/>
       </w:pPr>
       <w:r>
-        <w:t xml:space="preserve">重写弹窗</w:t>
+        <w:t xml:space="preserve">重写完成：红标与报告已清除</w:t>
+      </w:r>
+    </w:p>
+    <w:p>
+      <w:pPr>
+        <w:pStyle w:val="BlockText"/>
+      </w:pPr>
+      <w:r>
+        <w:t xml:space="preserve">评估与重写</w:t>
+      </w:r>
+      <w:r>
+        <w:rPr>
+          <w:bCs/>
+          <w:b/>
+        </w:rPr>
+        <w:t xml:space="preserve">相互独立</w:t>
+      </w:r>
+      <w:r>
+        <w:t xml:space="preserve">：评估不会自动触发重写；重写也不依赖先评估。重写时若已存在评估意见，建议模型把意见作为参考（正式版实现）。</w:t>
+      </w:r>
+    </w:p>
+    <w:bookmarkStart w:id="66" w:name="上游重写的联动提醒新增"/>
+    <w:p>
+      <w:pPr>
+        <w:pStyle w:val="Heading2"/>
+      </w:pPr>
+      <w:r>
+        <w:t xml:space="preserve">3.1 上游重写的联动提醒（新增）</w:t>
+      </w:r>
+    </w:p>
+    <w:p>
+      <w:pPr>
+        <w:pStyle w:val="FirstParagraph"/>
+      </w:pPr>
+      <w:r>
+        <w:t xml:space="preserve">内容有上下游依赖：</w:t>
+      </w:r>
+    </w:p>
+    <w:tbl>
+      <w:tblPr>
+        <w:tblStyle w:val="Table"/>
+        <w:tblW w:type="auto" w:w="0"/>
+        <w:tblLook w:firstRow="1" w:lastRow="0" w:firstColumn="0" w:lastColumn="0" w:noHBand="0" w:noVBand="0" w:val="0020"/>
+        <w:jc w:val="start"/>
+      </w:tblPr>
+      <w:tblGrid>
+        <w:gridCol w:w="3960"/>
+        <w:gridCol w:w="3960"/>
+      </w:tblGrid>
+      <w:tr>
+        <w:trPr>
+          <w:tblHeader w:val="true"/>
+        </w:trPr>
+        <w:tc>
+          <w:tcPr/>
+          <w:p>
+            <w:pPr>
+              <w:pStyle w:val="Compact"/>
+              <w:jc w:val="left"/>
+            </w:pPr>
+            <w:r>
+              <w:t xml:space="preserve">重写的区块</w:t>
+            </w:r>
+          </w:p>
+        </w:tc>
+        <w:tc>
+          <w:tcPr/>
+          <w:p>
+            <w:pPr>
+              <w:pStyle w:val="Compact"/>
+              <w:jc w:val="left"/>
+            </w:pPr>
+            <w:r>
+              <w:t xml:space="preserve">可能受影响的下游</w:t>
+            </w:r>
+          </w:p>
+        </w:tc>
+      </w:tr>
+      <w:tr>
+        <w:tc>
+          <w:tcPr/>
+          <w:p>
+            <w:pPr>
+              <w:pStyle w:val="Compact"/>
+              <w:jc w:val="left"/>
+            </w:pPr>
+            <w:r>
+              <w:t xml:space="preserve">核心创意</w:t>
+            </w:r>
+          </w:p>
+        </w:tc>
+        <w:tc>
+          <w:tcPr/>
+          <w:p>
+            <w:pPr>
+              <w:pStyle w:val="Compact"/>
+              <w:jc w:val="left"/>
+            </w:pPr>
+            <w:r>
+              <w:t xml:space="preserve">人物小传、策划案、全部集纲、全部剧本</w:t>
+            </w:r>
+          </w:p>
+        </w:tc>
+      </w:tr>
+      <w:tr>
+        <w:tc>
+          <w:tcPr/>
+          <w:p>
+            <w:pPr>
+              <w:pStyle w:val="Compact"/>
+              <w:jc w:val="left"/>
+            </w:pPr>
+            <w:r>
+              <w:t xml:space="preserve">人物小传 / 策划案</w:t>
+            </w:r>
+          </w:p>
+        </w:tc>
+        <w:tc>
+          <w:tcPr/>
+          <w:p>
+            <w:pPr>
+              <w:pStyle w:val="Compact"/>
+              <w:jc w:val="left"/>
+            </w:pPr>
+            <w:r>
+              <w:t xml:space="preserve">全部集纲、全部剧本</w:t>
+            </w:r>
+          </w:p>
+        </w:tc>
+      </w:tr>
+      <w:tr>
+        <w:tc>
+          <w:tcPr/>
+          <w:p>
+            <w:pPr>
+              <w:pStyle w:val="Compact"/>
+              <w:jc w:val="left"/>
+            </w:pPr>
+            <w:r>
+              <w:t xml:space="preserve">集纲第 N 集</w:t>
+            </w:r>
+          </w:p>
+        </w:tc>
+        <w:tc>
+          <w:tcPr/>
+          <w:p>
+            <w:pPr>
+              <w:pStyle w:val="Compact"/>
+              <w:jc w:val="left"/>
+            </w:pPr>
+            <w:r>
+              <w:t xml:space="preserve">对应的剧本第 N 集</w:t>
+            </w:r>
+          </w:p>
+        </w:tc>
+      </w:tr>
+      <w:tr>
+        <w:tc>
+          <w:tcPr/>
+          <w:p>
+            <w:pPr>
+              <w:pStyle w:val="Compact"/>
+              <w:jc w:val="left"/>
+            </w:pPr>
+            <w:r>
+              <w:t xml:space="preserve">剧本第 N 集</w:t>
+            </w:r>
+          </w:p>
+        </w:tc>
+        <w:tc>
+          <w:tcPr/>
+          <w:p>
+            <w:pPr>
+              <w:pStyle w:val="Compact"/>
+              <w:jc w:val="left"/>
+            </w:pPr>
+            <w:r>
+              <w:t xml:space="preserve">无，直接重写</w:t>
+            </w:r>
+          </w:p>
+        </w:tc>
+      </w:tr>
+    </w:tbl>
+    <w:p>
+      <w:pPr>
+        <w:pStyle w:val="BodyText"/>
+      </w:pPr>
+      <w:r>
+        <w:rPr>
+          <w:bCs/>
+          <w:b/>
+        </w:rPr>
+        <w:t xml:space="preserve">规则</w:t>
+      </w:r>
+      <w:r>
+        <w:t xml:space="preserve">：点击有下游的区块的「重写」，弹窗顶部出现黄色提示</w:t>
+      </w:r>
+      <w:r>
+        <w:t xml:space="preserve"> </w:t>
+      </w:r>
+      <w:r>
+        <w:rPr>
+          <w:bCs/>
+          <w:b/>
+        </w:rPr>
+        <w:t xml:space="preserve">「⚠ 可能会影响其他部分」</w:t>
+      </w:r>
+      <w:r>
+        <w:t xml:space="preserve">，列出受影响的下游区块（标签）与数量，并询问是否连同下游一起重写。三个按钮：</w:t>
+      </w:r>
+    </w:p>
+    <w:p>
+      <w:pPr>
+        <w:numPr>
+          <w:ilvl w:val="0"/>
+          <w:numId w:val="1007"/>
+        </w:numPr>
+        <w:pStyle w:val="Compact"/>
+      </w:pPr>
+      <w:r>
+        <w:rPr>
+          <w:bCs/>
+          <w:b/>
+        </w:rPr>
+        <w:t xml:space="preserve">取消</w:t>
+      </w:r>
+      <w:r>
+        <w:t xml:space="preserve">：不做任何事；</w:t>
+      </w:r>
+    </w:p>
+    <w:p>
+      <w:pPr>
+        <w:numPr>
+          <w:ilvl w:val="0"/>
+          <w:numId w:val="1007"/>
+        </w:numPr>
+        <w:pStyle w:val="Compact"/>
+      </w:pPr>
+      <w:r>
+        <w:rPr>
+          <w:bCs/>
+          <w:b/>
+        </w:rPr>
+        <w:t xml:space="preserve">只重写本区块</w:t>
+      </w:r>
+      <w:r>
+        <w:t xml:space="preserve">：仅重写当前区块；受影响的下游区块标题下出现黄色提示</w:t>
+      </w:r>
+      <w:r>
+        <w:t xml:space="preserve"> </w:t>
+      </w:r>
+      <w:r>
+        <w:rPr>
+          <w:bCs/>
+          <w:b/>
+        </w:rPr>
+        <w:t xml:space="preserve">「⚠ 上游内容已改动，本区块可能需要同步　[去重写]」</w:t>
+      </w:r>
+      <w:r>
+        <w:t xml:space="preserve">，左侧不强制处理；</w:t>
+      </w:r>
+    </w:p>
+    <w:p>
+      <w:pPr>
+        <w:numPr>
+          <w:ilvl w:val="0"/>
+          <w:numId w:val="1007"/>
+        </w:numPr>
+        <w:pStyle w:val="Compact"/>
+      </w:pPr>
+      <w:r>
+        <w:rPr>
+          <w:bCs/>
+          <w:b/>
+        </w:rPr>
+        <w:t xml:space="preserve">全部重写（共 N 处）</w:t>
+      </w:r>
+      <w:r>
+        <w:t xml:space="preserve">：依次重写当前区块 + 全部下游（进度 toast「正在同步重写 k/N…」），完成后 toast「已全部重写，共 N 处」；下游旧报告与标红一并清除。</w:t>
+      </w:r>
+    </w:p>
+    <w:p>
+      <w:pPr>
+        <w:pStyle w:val="FirstParagraph"/>
+      </w:pPr>
+      <w:r>
+        <w:t xml:space="preserve">没有下游的区块（如剧本单集）弹窗里不出现提示，按钮为「取消 / 开始重写」。「补充要求」输入框对所有被重写的区块生效。</w:t>
       </w:r>
     </w:p>
     <w:p>
@@ -1917,12 +2300,12 @@
           <wp:inline>
             <wp:extent cx="5334000" cy="3200400"/>
             <wp:effectExtent b="0" l="0" r="0" t="0"/>
-            <wp:docPr descr="重写完成，红标清除" title="" id="58" name="Picture"/>
+            <wp:docPr descr="人物小传重写：提示会影响下游" title="" id="58" name="Picture"/>
             <a:graphic>
               <a:graphicData uri="http://schemas.openxmlformats.org/drawingml/2006/picture">
                 <pic:pic>
                   <pic:nvPicPr>
-                    <pic:cNvPr descr="wd-img/w08-rewritten.jpg" id="59" name="Picture"/>
+                    <pic:cNvPr descr="wd-img/x03-cascade-dlg.jpg" id="59" name="Picture"/>
                     <pic:cNvPicPr>
                       <a:picLocks noChangeArrowheads="1" noChangeAspect="1"/>
                     </pic:cNvPicPr>
@@ -1960,7 +2343,7 @@
         <w:pStyle w:val="ImageCaption"/>
       </w:pPr>
       <w:r>
-        <w:t xml:space="preserve">重写完成，红标清除</w:t>
+        <w:t xml:space="preserve">人物小传重写：提示会影响下游</w:t>
       </w:r>
     </w:p>
     <w:p>
@@ -1972,12 +2355,12 @@
           <wp:inline>
             <wp:extent cx="5334000" cy="3200400"/>
             <wp:effectExtent b="0" l="0" r="0" t="0"/>
-            <wp:docPr descr="复评：分数提升" title="" id="61" name="Picture"/>
+            <wp:docPr descr="只重写本区块后，集纲各集出现「上游已改动」提示" title="" id="61" name="Picture"/>
             <a:graphic>
               <a:graphicData uri="http://schemas.openxmlformats.org/drawingml/2006/picture">
                 <pic:pic>
                   <pic:nvPicPr>
-                    <pic:cNvPr descr="wd-img/w09-reeval.jpg" id="62" name="Picture"/>
+                    <pic:cNvPr descr="wd-img/x05-stale-outline.jpg" id="62" name="Picture"/>
                     <pic:cNvPicPr>
                       <a:picLocks noChangeArrowheads="1" noChangeAspect="1"/>
                     </pic:cNvPicPr>
@@ -2015,293 +2398,7 @@
         <w:pStyle w:val="ImageCaption"/>
       </w:pPr>
       <w:r>
-        <w:t xml:space="preserve">复评：分数提升</w:t>
-      </w:r>
-    </w:p>
-    <w:p>
-      <w:pPr>
-        <w:pStyle w:val="BlockText"/>
-      </w:pPr>
-      <w:r>
-        <w:t xml:space="preserve">评估与重写</w:t>
-      </w:r>
-      <w:r>
-        <w:rPr>
-          <w:bCs/>
-          <w:b/>
-        </w:rPr>
-        <w:t xml:space="preserve">相互独立</w:t>
-      </w:r>
-      <w:r>
-        <w:t xml:space="preserve">：评估不会自动触发重写；重写也不依赖先评估。重写时若已存在评估意见，建议模型把意见作为参考（正式版实现）。</w:t>
-      </w:r>
-    </w:p>
-    <w:bookmarkStart w:id="72" w:name="上游重写的联动提醒新增"/>
-    <w:p>
-      <w:pPr>
-        <w:pStyle w:val="Heading2"/>
-      </w:pPr>
-      <w:r>
-        <w:t xml:space="preserve">3.1 上游重写的联动提醒（新增）</w:t>
-      </w:r>
-    </w:p>
-    <w:p>
-      <w:pPr>
-        <w:pStyle w:val="FirstParagraph"/>
-      </w:pPr>
-      <w:r>
-        <w:t xml:space="preserve">内容有上下游依赖：</w:t>
-      </w:r>
-    </w:p>
-    <w:tbl>
-      <w:tblPr>
-        <w:tblStyle w:val="Table"/>
-        <w:tblW w:type="auto" w:w="0"/>
-        <w:tblLook w:firstRow="1" w:lastRow="0" w:firstColumn="0" w:lastColumn="0" w:noHBand="0" w:noVBand="0" w:val="0020"/>
-        <w:jc w:val="start"/>
-      </w:tblPr>
-      <w:tblGrid>
-        <w:gridCol w:w="3960"/>
-        <w:gridCol w:w="3960"/>
-      </w:tblGrid>
-      <w:tr>
-        <w:trPr>
-          <w:tblHeader w:val="true"/>
-        </w:trPr>
-        <w:tc>
-          <w:tcPr/>
-          <w:p>
-            <w:pPr>
-              <w:pStyle w:val="Compact"/>
-              <w:jc w:val="left"/>
-            </w:pPr>
-            <w:r>
-              <w:t xml:space="preserve">重写的区块</w:t>
-            </w:r>
-          </w:p>
-        </w:tc>
-        <w:tc>
-          <w:tcPr/>
-          <w:p>
-            <w:pPr>
-              <w:pStyle w:val="Compact"/>
-              <w:jc w:val="left"/>
-            </w:pPr>
-            <w:r>
-              <w:t xml:space="preserve">可能受影响的下游</w:t>
-            </w:r>
-          </w:p>
-        </w:tc>
-      </w:tr>
-      <w:tr>
-        <w:tc>
-          <w:tcPr/>
-          <w:p>
-            <w:pPr>
-              <w:pStyle w:val="Compact"/>
-              <w:jc w:val="left"/>
-            </w:pPr>
-            <w:r>
-              <w:t xml:space="preserve">核心创意</w:t>
-            </w:r>
-          </w:p>
-        </w:tc>
-        <w:tc>
-          <w:tcPr/>
-          <w:p>
-            <w:pPr>
-              <w:pStyle w:val="Compact"/>
-              <w:jc w:val="left"/>
-            </w:pPr>
-            <w:r>
-              <w:t xml:space="preserve">人物小传、策划案、全部集纲、全部剧本</w:t>
-            </w:r>
-          </w:p>
-        </w:tc>
-      </w:tr>
-      <w:tr>
-        <w:tc>
-          <w:tcPr/>
-          <w:p>
-            <w:pPr>
-              <w:pStyle w:val="Compact"/>
-              <w:jc w:val="left"/>
-            </w:pPr>
-            <w:r>
-              <w:t xml:space="preserve">人物小传 / 策划案</w:t>
-            </w:r>
-          </w:p>
-        </w:tc>
-        <w:tc>
-          <w:tcPr/>
-          <w:p>
-            <w:pPr>
-              <w:pStyle w:val="Compact"/>
-              <w:jc w:val="left"/>
-            </w:pPr>
-            <w:r>
-              <w:t xml:space="preserve">全部集纲、全部剧本</w:t>
-            </w:r>
-          </w:p>
-        </w:tc>
-      </w:tr>
-      <w:tr>
-        <w:tc>
-          <w:tcPr/>
-          <w:p>
-            <w:pPr>
-              <w:pStyle w:val="Compact"/>
-              <w:jc w:val="left"/>
-            </w:pPr>
-            <w:r>
-              <w:t xml:space="preserve">集纲第 N 集</w:t>
-            </w:r>
-          </w:p>
-        </w:tc>
-        <w:tc>
-          <w:tcPr/>
-          <w:p>
-            <w:pPr>
-              <w:pStyle w:val="Compact"/>
-              <w:jc w:val="left"/>
-            </w:pPr>
-            <w:r>
-              <w:t xml:space="preserve">对应的剧本第 N 集</w:t>
-            </w:r>
-          </w:p>
-        </w:tc>
-      </w:tr>
-      <w:tr>
-        <w:tc>
-          <w:tcPr/>
-          <w:p>
-            <w:pPr>
-              <w:pStyle w:val="Compact"/>
-              <w:jc w:val="left"/>
-            </w:pPr>
-            <w:r>
-              <w:t xml:space="preserve">剧本第 N 集</w:t>
-            </w:r>
-          </w:p>
-        </w:tc>
-        <w:tc>
-          <w:tcPr/>
-          <w:p>
-            <w:pPr>
-              <w:pStyle w:val="Compact"/>
-              <w:jc w:val="left"/>
-            </w:pPr>
-            <w:r>
-              <w:t xml:space="preserve">无，直接重写</w:t>
-            </w:r>
-          </w:p>
-        </w:tc>
-      </w:tr>
-    </w:tbl>
-    <w:p>
-      <w:pPr>
-        <w:pStyle w:val="BodyText"/>
-      </w:pPr>
-      <w:r>
-        <w:rPr>
-          <w:bCs/>
-          <w:b/>
-        </w:rPr>
-        <w:t xml:space="preserve">规则</w:t>
-      </w:r>
-      <w:r>
-        <w:t xml:space="preserve">：点击有下游的区块的「重写」，弹窗顶部出现黄色提示</w:t>
-      </w:r>
-      <w:r>
-        <w:t xml:space="preserve"> </w:t>
-      </w:r>
-      <w:r>
-        <w:rPr>
-          <w:bCs/>
-          <w:b/>
-        </w:rPr>
-        <w:t xml:space="preserve">「⚠ 可能会影响其他部分」</w:t>
-      </w:r>
-      <w:r>
-        <w:t xml:space="preserve">，列出受影响的下游区块（标签）与数量，并询问是否连同下游一起重写。三个按钮：</w:t>
-      </w:r>
-    </w:p>
-    <w:p>
-      <w:pPr>
-        <w:numPr>
-          <w:ilvl w:val="0"/>
-          <w:numId w:val="1007"/>
-        </w:numPr>
-        <w:pStyle w:val="Compact"/>
-      </w:pPr>
-      <w:r>
-        <w:rPr>
-          <w:bCs/>
-          <w:b/>
-        </w:rPr>
-        <w:t xml:space="preserve">取消</w:t>
-      </w:r>
-      <w:r>
-        <w:t xml:space="preserve">：不做任何事；</w:t>
-      </w:r>
-    </w:p>
-    <w:p>
-      <w:pPr>
-        <w:numPr>
-          <w:ilvl w:val="0"/>
-          <w:numId w:val="1007"/>
-        </w:numPr>
-        <w:pStyle w:val="Compact"/>
-      </w:pPr>
-      <w:r>
-        <w:rPr>
-          <w:bCs/>
-          <w:b/>
-        </w:rPr>
-        <w:t xml:space="preserve">只重写本区块</w:t>
-      </w:r>
-      <w:r>
-        <w:t xml:space="preserve">：仅重写当前区块；受影响的下游区块标题下出现黄色提示</w:t>
-      </w:r>
-      <w:r>
-        <w:t xml:space="preserve"> </w:t>
-      </w:r>
-      <w:r>
-        <w:rPr>
-          <w:bCs/>
-          <w:b/>
-        </w:rPr>
-        <w:t xml:space="preserve">「⚠ 上游内容已改动，本区块可能需要同步　[去重写]」</w:t>
-      </w:r>
-      <w:r>
-        <w:t xml:space="preserve">，左侧不强制处理；</w:t>
-      </w:r>
-    </w:p>
-    <w:p>
-      <w:pPr>
-        <w:numPr>
-          <w:ilvl w:val="0"/>
-          <w:numId w:val="1007"/>
-        </w:numPr>
-        <w:pStyle w:val="Compact"/>
-      </w:pPr>
-      <w:r>
-        <w:rPr>
-          <w:bCs/>
-          <w:b/>
-        </w:rPr>
-        <w:t xml:space="preserve">全部重写（共 N 处）</w:t>
-      </w:r>
-      <w:r>
-        <w:t xml:space="preserve">：依次重写当前区块 + 全部下游（进度 toast「正在同步重写 k/N…」），完成后 toast「已全部重写，共 N 处」；下游旧报告与标红一并清除。</w:t>
-      </w:r>
-    </w:p>
-    <w:p>
-      <w:pPr>
-        <w:pStyle w:val="FirstParagraph"/>
-      </w:pPr>
-      <w:r>
-        <w:t xml:space="preserve">没有下游的区块（如剧本单集）弹窗里不出现提示，按钮为「取消 / 开始重写」。「补充要求」输入框对所有被重写的区块生效。</w:t>
+        <w:t xml:space="preserve">只重写本区块后，集纲各集出现「上游已改动」提示</w:t>
       </w:r>
     </w:p>
     <w:p>
@@ -2313,12 +2410,12 @@
           <wp:inline>
             <wp:extent cx="5334000" cy="3200400"/>
             <wp:effectExtent b="0" l="0" r="0" t="0"/>
-            <wp:docPr descr="人物小传重写：提示会影响下游" title="" id="64" name="Picture"/>
+            <wp:docPr descr="集纲单集重写：影响对应剧本 EP01" title="" id="64" name="Picture"/>
             <a:graphic>
               <a:graphicData uri="http://schemas.openxmlformats.org/drawingml/2006/picture">
                 <pic:pic>
                   <pic:nvPicPr>
-                    <pic:cNvPr descr="wd-img/x03-cascade-dlg.jpg" id="65" name="Picture"/>
+                    <pic:cNvPr descr="wd-img/x06-ol-dlg.jpg" id="65" name="Picture"/>
                     <pic:cNvPicPr>
                       <a:picLocks noChangeArrowheads="1" noChangeAspect="1"/>
                     </pic:cNvPicPr>
@@ -2356,7 +2453,164 @@
         <w:pStyle w:val="ImageCaption"/>
       </w:pPr>
       <w:r>
-        <w:t xml:space="preserve">人物小传重写：提示会影响下游</w:t>
+        <w:t xml:space="preserve">集纲单集重写：影响对应剧本 EP01</w:t>
+      </w:r>
+    </w:p>
+    <w:bookmarkEnd w:id="66"/>
+    <w:bookmarkEnd w:id="67"/>
+    <w:bookmarkStart w:id="84" w:name="ai-助手非全屏自动收起-机器人图标"/>
+    <w:p>
+      <w:pPr>
+        <w:pStyle w:val="Heading1"/>
+      </w:pPr>
+      <w:r>
+        <w:t xml:space="preserve">4. AI 助手：非全屏自动收起 + 机器人图标</w:t>
+      </w:r>
+    </w:p>
+    <w:bookmarkStart w:id="71" w:name="响应规则"/>
+    <w:p>
+      <w:pPr>
+        <w:pStyle w:val="Heading2"/>
+      </w:pPr>
+      <w:r>
+        <w:t xml:space="preserve">4.1 响应规则</w:t>
+      </w:r>
+    </w:p>
+    <w:tbl>
+      <w:tblPr>
+        <w:tblStyle w:val="Table"/>
+        <w:tblW w:type="pct" w:w="5000"/>
+        <w:tblLook w:firstRow="1" w:lastRow="0" w:firstColumn="0" w:lastColumn="0" w:noHBand="0" w:noVBand="0" w:val="0020"/>
+        <w:jc w:val="start"/>
+      </w:tblPr>
+      <w:tblGrid>
+        <w:gridCol w:w="3960"/>
+        <w:gridCol w:w="3960"/>
+      </w:tblGrid>
+      <w:tr>
+        <w:trPr>
+          <w:tblHeader w:val="true"/>
+        </w:trPr>
+        <w:tc>
+          <w:tcPr/>
+          <w:p>
+            <w:pPr>
+              <w:pStyle w:val="Compact"/>
+              <w:jc w:val="left"/>
+            </w:pPr>
+            <w:r>
+              <w:t xml:space="preserve">条件</w:t>
+            </w:r>
+          </w:p>
+        </w:tc>
+        <w:tc>
+          <w:tcPr/>
+          <w:p>
+            <w:pPr>
+              <w:pStyle w:val="Compact"/>
+              <w:jc w:val="left"/>
+            </w:pPr>
+            <w:r>
+              <w:t xml:space="preserve">行为</w:t>
+            </w:r>
+          </w:p>
+        </w:tc>
+      </w:tr>
+      <w:tr>
+        <w:tc>
+          <w:tcPr/>
+          <w:p>
+            <w:pPr>
+              <w:pStyle w:val="Compact"/>
+              <w:jc w:val="left"/>
+            </w:pPr>
+            <w:r>
+              <w:t xml:space="preserve">窗口宽度 ≥ 1280px（全屏 / 宽屏）</w:t>
+            </w:r>
+          </w:p>
+        </w:tc>
+        <w:tc>
+          <w:tcPr/>
+          <w:p>
+            <w:pPr>
+              <w:pStyle w:val="Compact"/>
+              <w:jc w:val="left"/>
+            </w:pPr>
+            <w:r>
+              <w:t xml:space="preserve">AI 助手停靠在右侧，默认展开</w:t>
+            </w:r>
+          </w:p>
+        </w:tc>
+      </w:tr>
+      <w:tr>
+        <w:tc>
+          <w:tcPr/>
+          <w:p>
+            <w:pPr>
+              <w:pStyle w:val="Compact"/>
+              <w:jc w:val="left"/>
+            </w:pPr>
+            <w:r>
+              <w:t xml:space="preserve">窗口宽度 &lt; 1280px（非全屏）</w:t>
+            </w:r>
+          </w:p>
+        </w:tc>
+        <w:tc>
+          <w:tcPr/>
+          <w:p>
+            <w:pPr>
+              <w:pStyle w:val="Compact"/>
+              <w:jc w:val="left"/>
+            </w:pPr>
+            <w:r>
+              <w:t xml:space="preserve">AI 助手</w:t>
+            </w:r>
+            <w:r>
+              <w:rPr>
+                <w:bCs/>
+                <w:b/>
+              </w:rPr>
+              <w:t xml:space="preserve">自动隐藏</w:t>
+            </w:r>
+            <w:r>
+              <w:t xml:space="preserve">；点机器人图标，从右侧以浮层形式滑出（盖在正文上，不挤压正文），再点图标或关闭按钮收起</w:t>
+            </w:r>
+          </w:p>
+        </w:tc>
+      </w:tr>
+      <w:tr>
+        <w:tc>
+          <w:tcPr/>
+          <w:p>
+            <w:pPr>
+              <w:pStyle w:val="Compact"/>
+              <w:jc w:val="left"/>
+            </w:pPr>
+            <w:r>
+              <w:t xml:space="preserve">窗口跨越 1280px 断点</w:t>
+            </w:r>
+          </w:p>
+        </w:tc>
+        <w:tc>
+          <w:tcPr/>
+          <w:p>
+            <w:pPr>
+              <w:pStyle w:val="Compact"/>
+              <w:jc w:val="left"/>
+            </w:pPr>
+            <w:r>
+              <w:t xml:space="preserve">按新宽度重置默认状态（宽屏展开、窄屏收起）</w:t>
+            </w:r>
+          </w:p>
+        </w:tc>
+      </w:tr>
+    </w:tbl>
+    <w:p>
+      <w:pPr>
+        <w:pStyle w:val="BodyText"/>
+      </w:pPr>
+      <w:r>
+        <w:t xml:space="preserve">窄屏浮层顶部对齐在顶栏下方，保证顶栏的机器人图标始终可点。</w:t>
       </w:r>
     </w:p>
     <w:p>
@@ -2366,20 +2620,378 @@
       <w:r>
         <w:drawing>
           <wp:inline>
-            <wp:extent cx="5334000" cy="3200400"/>
+            <wp:extent cx="5334000" cy="3879272"/>
             <wp:effectExtent b="0" l="0" r="0" t="0"/>
-            <wp:docPr descr="只重写本区块后，集纲各集出现「上游已改动」提示" title="" id="67" name="Picture"/>
+            <wp:docPr descr="窄屏：AI 助手自动隐藏，右下角浮动机器人" title="" id="69" name="Picture"/>
             <a:graphic>
               <a:graphicData uri="http://schemas.openxmlformats.org/drawingml/2006/picture">
                 <pic:pic>
                   <pic:nvPicPr>
-                    <pic:cNvPr descr="wd-img/x05-stale-outline.jpg" id="68" name="Picture"/>
+                    <pic:cNvPr descr="wd-img/w13-narrow-hidden.jpg" id="70" name="Picture"/>
                     <pic:cNvPicPr>
                       <a:picLocks noChangeArrowheads="1" noChangeAspect="1"/>
                     </pic:cNvPicPr>
                   </pic:nvPicPr>
                   <pic:blipFill>
-                    <a:blip r:embed="rId66"/>
+                    <a:blip r:embed="rId68"/>
+                    <a:stretch>
+                      <a:fillRect/>
+                    </a:stretch>
+                  </pic:blipFill>
+                  <pic:spPr bwMode="auto">
+                    <a:xfrm>
+                      <a:off x="0" y="0"/>
+                      <a:ext cx="5334000" cy="3879272"/>
+                    </a:xfrm>
+                    <a:prstGeom prst="rect">
+                      <a:avLst/>
+                    </a:prstGeom>
+                    <a:noFill/>
+                    <a:ln w="9525">
+                      <a:noFill/>
+                      <a:headEnd/>
+                      <a:tailEnd/>
+                    </a:ln>
+                  </pic:spPr>
+                </pic:pic>
+              </a:graphicData>
+            </a:graphic>
+          </wp:inline>
+        </w:drawing>
+      </w:r>
+    </w:p>
+    <w:p>
+      <w:pPr>
+        <w:pStyle w:val="ImageCaption"/>
+      </w:pPr>
+      <w:r>
+        <w:t xml:space="preserve">窄屏：AI 助手自动隐藏，右下角浮动机器人</w:t>
+      </w:r>
+    </w:p>
+    <w:bookmarkEnd w:id="71"/>
+    <w:bookmarkStart w:id="78" w:name="机器人图标"/>
+    <w:p>
+      <w:pPr>
+        <w:pStyle w:val="Heading2"/>
+      </w:pPr>
+      <w:r>
+        <w:t xml:space="preserve">4.2 机器人图标</w:t>
+      </w:r>
+    </w:p>
+    <w:p>
+      <w:pPr>
+        <w:numPr>
+          <w:ilvl w:val="0"/>
+          <w:numId w:val="1008"/>
+        </w:numPr>
+        <w:pStyle w:val="Compact"/>
+      </w:pPr>
+      <w:r>
+        <w:t xml:space="preserve">顶栏最右侧，</w:t>
+      </w:r>
+      <w:r>
+        <w:rPr>
+          <w:bCs/>
+          <w:b/>
+        </w:rPr>
+        <w:t xml:space="preserve">用小机器人图标替换原来的小评论图标</w:t>
+      </w:r>
+      <w:r>
+        <w:t xml:space="preserve">；青绿底色，比评论图标更醒目。</w:t>
+      </w:r>
+    </w:p>
+    <w:p>
+      <w:pPr>
+        <w:numPr>
+          <w:ilvl w:val="0"/>
+          <w:numId w:val="1008"/>
+        </w:numPr>
+        <w:pStyle w:val="Compact"/>
+      </w:pPr>
+      <w:r>
+        <w:t xml:space="preserve">窄屏下右下角另有一个圆形浮动机器人按钮（与顶栏图标同功能）。</w:t>
+      </w:r>
+    </w:p>
+    <w:p>
+      <w:pPr>
+        <w:numPr>
+          <w:ilvl w:val="0"/>
+          <w:numId w:val="1008"/>
+        </w:numPr>
+        <w:pStyle w:val="Compact"/>
+      </w:pPr>
+      <w:r>
+        <w:rPr>
+          <w:bCs/>
+          <w:b/>
+        </w:rPr>
+        <w:t xml:space="preserve">悬停提示（tooltip）：「AI助手」</w:t>
+      </w:r>
+      <w:r>
+        <w:t xml:space="preserve">；顶栏图标提示在下方，浮动按钮提示在上方。</w:t>
+      </w:r>
+    </w:p>
+    <w:p>
+      <w:pPr>
+        <w:numPr>
+          <w:ilvl w:val="0"/>
+          <w:numId w:val="1008"/>
+        </w:numPr>
+        <w:pStyle w:val="Compact"/>
+      </w:pPr>
+      <w:r>
+        <w:t xml:space="preserve">点击：展开 / 收起 AI 助手；展开时顶栏图标呈实心高亮态。</w:t>
+      </w:r>
+    </w:p>
+    <w:p>
+      <w:pPr>
+        <w:pStyle w:val="CaptionedFigure"/>
+      </w:pPr>
+      <w:r>
+        <w:drawing>
+          <wp:inline>
+            <wp:extent cx="5334000" cy="3879272"/>
+            <wp:effectExtent b="0" l="0" r="0" t="0"/>
+            <wp:docPr descr="悬停显示「AI助手」" title="" id="73" name="Picture"/>
+            <a:graphic>
+              <a:graphicData uri="http://schemas.openxmlformats.org/drawingml/2006/picture">
+                <pic:pic>
+                  <pic:nvPicPr>
+                    <pic:cNvPr descr="wd-img/w14-robot-tip.jpg" id="74" name="Picture"/>
+                    <pic:cNvPicPr>
+                      <a:picLocks noChangeArrowheads="1" noChangeAspect="1"/>
+                    </pic:cNvPicPr>
+                  </pic:nvPicPr>
+                  <pic:blipFill>
+                    <a:blip r:embed="rId72"/>
+                    <a:stretch>
+                      <a:fillRect/>
+                    </a:stretch>
+                  </pic:blipFill>
+                  <pic:spPr bwMode="auto">
+                    <a:xfrm>
+                      <a:off x="0" y="0"/>
+                      <a:ext cx="5334000" cy="3879272"/>
+                    </a:xfrm>
+                    <a:prstGeom prst="rect">
+                      <a:avLst/>
+                    </a:prstGeom>
+                    <a:noFill/>
+                    <a:ln w="9525">
+                      <a:noFill/>
+                      <a:headEnd/>
+                      <a:tailEnd/>
+                    </a:ln>
+                  </pic:spPr>
+                </pic:pic>
+              </a:graphicData>
+            </a:graphic>
+          </wp:inline>
+        </w:drawing>
+      </w:r>
+    </w:p>
+    <w:p>
+      <w:pPr>
+        <w:pStyle w:val="ImageCaption"/>
+      </w:pPr>
+      <w:r>
+        <w:t xml:space="preserve">悬停显示「AI助手」</w:t>
+      </w:r>
+    </w:p>
+    <w:p>
+      <w:pPr>
+        <w:pStyle w:val="CaptionedFigure"/>
+      </w:pPr>
+      <w:r>
+        <w:drawing>
+          <wp:inline>
+            <wp:extent cx="5334000" cy="3879272"/>
+            <wp:effectExtent b="0" l="0" r="0" t="0"/>
+            <wp:docPr descr="点击后右侧滑出 AI 助手" title="" id="76" name="Picture"/>
+            <a:graphic>
+              <a:graphicData uri="http://schemas.openxmlformats.org/drawingml/2006/picture">
+                <pic:pic>
+                  <pic:nvPicPr>
+                    <pic:cNvPr descr="wd-img/w15-narrow-open.jpg" id="77" name="Picture"/>
+                    <pic:cNvPicPr>
+                      <a:picLocks noChangeArrowheads="1" noChangeAspect="1"/>
+                    </pic:cNvPicPr>
+                  </pic:nvPicPr>
+                  <pic:blipFill>
+                    <a:blip r:embed="rId75"/>
+                    <a:stretch>
+                      <a:fillRect/>
+                    </a:stretch>
+                  </pic:blipFill>
+                  <pic:spPr bwMode="auto">
+                    <a:xfrm>
+                      <a:off x="0" y="0"/>
+                      <a:ext cx="5334000" cy="3879272"/>
+                    </a:xfrm>
+                    <a:prstGeom prst="rect">
+                      <a:avLst/>
+                    </a:prstGeom>
+                    <a:noFill/>
+                    <a:ln w="9525">
+                      <a:noFill/>
+                      <a:headEnd/>
+                      <a:tailEnd/>
+                    </a:ln>
+                  </pic:spPr>
+                </pic:pic>
+              </a:graphicData>
+            </a:graphic>
+          </wp:inline>
+        </w:drawing>
+      </w:r>
+    </w:p>
+    <w:p>
+      <w:pPr>
+        <w:pStyle w:val="ImageCaption"/>
+      </w:pPr>
+      <w:r>
+        <w:t xml:space="preserve">点击后右侧滑出 AI 助手</w:t>
+      </w:r>
+    </w:p>
+    <w:bookmarkEnd w:id="78"/>
+    <w:bookmarkStart w:id="79" w:name="ai-助手与评估报告互不相干"/>
+    <w:p>
+      <w:pPr>
+        <w:pStyle w:val="Heading2"/>
+      </w:pPr>
+      <w:r>
+        <w:t xml:space="preserve">4.3 AI 助手与评估报告互不相干</w:t>
+      </w:r>
+    </w:p>
+    <w:p>
+      <w:pPr>
+        <w:pStyle w:val="FirstParagraph"/>
+      </w:pPr>
+      <w:r>
+        <w:t xml:space="preserve">评估报告完全显示在区块内，</w:t>
+      </w:r>
+      <w:r>
+        <w:rPr>
+          <w:bCs/>
+          <w:b/>
+        </w:rPr>
+        <w:t xml:space="preserve">不占用、不唤起 AI 助手侧栏</w:t>
+      </w:r>
+      <w:r>
+        <w:t xml:space="preserve">；侧栏只承载对话（页签仅「AI 助手」），输入框下方「作用于：当前阶段」。</w:t>
+      </w:r>
+    </w:p>
+    <w:bookmarkEnd w:id="79"/>
+    <w:bookmarkStart w:id="83" w:name="侧栏宽度可调整新增"/>
+    <w:p>
+      <w:pPr>
+        <w:pStyle w:val="Heading2"/>
+      </w:pPr>
+      <w:r>
+        <w:t xml:space="preserve">4.4 侧栏宽度可调整（新增）</w:t>
+      </w:r>
+    </w:p>
+    <w:p>
+      <w:pPr>
+        <w:numPr>
+          <w:ilvl w:val="0"/>
+          <w:numId w:val="1009"/>
+        </w:numPr>
+        <w:pStyle w:val="Compact"/>
+      </w:pPr>
+      <w:r>
+        <w:t xml:space="preserve">侧栏左边缘有一条竖向拖动条（悬停变青色，光标为左右箭头）；</w:t>
+      </w:r>
+    </w:p>
+    <w:p>
+      <w:pPr>
+        <w:numPr>
+          <w:ilvl w:val="0"/>
+          <w:numId w:val="1009"/>
+        </w:numPr>
+        <w:pStyle w:val="Compact"/>
+      </w:pPr>
+      <w:r>
+        <w:t xml:space="preserve">向左拖变宽、向右拖变窄，范围</w:t>
+      </w:r>
+      <w:r>
+        <w:t xml:space="preserve"> </w:t>
+      </w:r>
+      <w:r>
+        <w:rPr>
+          <w:bCs/>
+          <w:b/>
+        </w:rPr>
+        <w:t xml:space="preserve">300–680px</w:t>
+      </w:r>
+      <w:r>
+        <w:t xml:space="preserve">，默认 380px；</w:t>
+      </w:r>
+    </w:p>
+    <w:p>
+      <w:pPr>
+        <w:numPr>
+          <w:ilvl w:val="0"/>
+          <w:numId w:val="1009"/>
+        </w:numPr>
+        <w:pStyle w:val="Compact"/>
+      </w:pPr>
+      <w:r>
+        <w:rPr>
+          <w:bCs/>
+          <w:b/>
+        </w:rPr>
+        <w:t xml:space="preserve">双击拖动条恢复默认宽度</w:t>
+      </w:r>
+      <w:r>
+        <w:t xml:space="preserve">；</w:t>
+      </w:r>
+    </w:p>
+    <w:p>
+      <w:pPr>
+        <w:numPr>
+          <w:ilvl w:val="0"/>
+          <w:numId w:val="1009"/>
+        </w:numPr>
+        <w:pStyle w:val="Compact"/>
+      </w:pPr>
+      <w:r>
+        <w:t xml:space="preserve">宽度会被记住（浏览器本地），下次打开沿用；窄屏浮层同样可拖，最宽不超过屏幕 92%；</w:t>
+      </w:r>
+    </w:p>
+    <w:p>
+      <w:pPr>
+        <w:numPr>
+          <w:ilvl w:val="0"/>
+          <w:numId w:val="1009"/>
+        </w:numPr>
+        <w:pStyle w:val="Compact"/>
+      </w:pPr>
+      <w:r>
+        <w:t xml:space="preserve">拖动过程中正文区域实时让位（宽屏停靠模式）。</w:t>
+      </w:r>
+    </w:p>
+    <w:p>
+      <w:pPr>
+        <w:pStyle w:val="CaptionedFigure"/>
+      </w:pPr>
+      <w:r>
+        <w:drawing>
+          <wp:inline>
+            <wp:extent cx="5334000" cy="3200400"/>
+            <wp:effectExtent b="0" l="0" r="0" t="0"/>
+            <wp:docPr descr="拖宽后的 AI 助手侧栏" title="" id="81" name="Picture"/>
+            <a:graphic>
+              <a:graphicData uri="http://schemas.openxmlformats.org/drawingml/2006/picture">
+                <pic:pic>
+                  <pic:nvPicPr>
+                    <pic:cNvPr descr="wd-img/x07-resized.jpg" id="82" name="Picture"/>
+                    <pic:cNvPicPr>
+                      <a:picLocks noChangeArrowheads="1" noChangeAspect="1"/>
+                    </pic:cNvPicPr>
+                  </pic:nvPicPr>
+                  <pic:blipFill>
+                    <a:blip r:embed="rId80"/>
                     <a:stretch>
                       <a:fillRect/>
                     </a:stretch>
@@ -2411,570 +3023,18 @@
         <w:pStyle w:val="ImageCaption"/>
       </w:pPr>
       <w:r>
-        <w:t xml:space="preserve">只重写本区块后，集纲各集出现「上游已改动」提示</w:t>
-      </w:r>
-    </w:p>
-    <w:p>
-      <w:pPr>
-        <w:pStyle w:val="CaptionedFigure"/>
-      </w:pPr>
-      <w:r>
-        <w:drawing>
-          <wp:inline>
-            <wp:extent cx="5334000" cy="3200400"/>
-            <wp:effectExtent b="0" l="0" r="0" t="0"/>
-            <wp:docPr descr="集纲单集重写：影响对应剧本 EP01" title="" id="70" name="Picture"/>
-            <a:graphic>
-              <a:graphicData uri="http://schemas.openxmlformats.org/drawingml/2006/picture">
-                <pic:pic>
-                  <pic:nvPicPr>
-                    <pic:cNvPr descr="wd-img/x06-ol-dlg.jpg" id="71" name="Picture"/>
-                    <pic:cNvPicPr>
-                      <a:picLocks noChangeArrowheads="1" noChangeAspect="1"/>
-                    </pic:cNvPicPr>
-                  </pic:nvPicPr>
-                  <pic:blipFill>
-                    <a:blip r:embed="rId69"/>
-                    <a:stretch>
-                      <a:fillRect/>
-                    </a:stretch>
-                  </pic:blipFill>
-                  <pic:spPr bwMode="auto">
-                    <a:xfrm>
-                      <a:off x="0" y="0"/>
-                      <a:ext cx="5334000" cy="3200400"/>
-                    </a:xfrm>
-                    <a:prstGeom prst="rect">
-                      <a:avLst/>
-                    </a:prstGeom>
-                    <a:noFill/>
-                    <a:ln w="9525">
-                      <a:noFill/>
-                      <a:headEnd/>
-                      <a:tailEnd/>
-                    </a:ln>
-                  </pic:spPr>
-                </pic:pic>
-              </a:graphicData>
-            </a:graphic>
-          </wp:inline>
-        </w:drawing>
-      </w:r>
-    </w:p>
-    <w:p>
-      <w:pPr>
-        <w:pStyle w:val="ImageCaption"/>
-      </w:pPr>
-      <w:r>
-        <w:t xml:space="preserve">集纲单集重写：影响对应剧本 EP01</w:t>
-      </w:r>
-    </w:p>
-    <w:bookmarkEnd w:id="72"/>
-    <w:bookmarkEnd w:id="73"/>
-    <w:bookmarkStart w:id="93" w:name="ai-助手非全屏自动收起-机器人图标"/>
+        <w:t xml:space="preserve">拖宽后的 AI 助手侧栏</w:t>
+      </w:r>
+    </w:p>
+    <w:bookmarkEnd w:id="83"/>
+    <w:bookmarkEnd w:id="84"/>
+    <w:bookmarkStart w:id="85" w:name="验收要点"/>
     <w:p>
       <w:pPr>
         <w:pStyle w:val="Heading1"/>
       </w:pPr>
       <w:r>
-        <w:t xml:space="preserve">4. AI 助手：非全屏自动收起 + 机器人图标</w:t>
-      </w:r>
-    </w:p>
-    <w:bookmarkStart w:id="77" w:name="响应规则"/>
-    <w:p>
-      <w:pPr>
-        <w:pStyle w:val="Heading2"/>
-      </w:pPr>
-      <w:r>
-        <w:t xml:space="preserve">4.1 响应规则</w:t>
-      </w:r>
-    </w:p>
-    <w:tbl>
-      <w:tblPr>
-        <w:tblStyle w:val="Table"/>
-        <w:tblW w:type="pct" w:w="5000"/>
-        <w:tblLook w:firstRow="1" w:lastRow="0" w:firstColumn="0" w:lastColumn="0" w:noHBand="0" w:noVBand="0" w:val="0020"/>
-        <w:jc w:val="start"/>
-      </w:tblPr>
-      <w:tblGrid>
-        <w:gridCol w:w="3960"/>
-        <w:gridCol w:w="3960"/>
-      </w:tblGrid>
-      <w:tr>
-        <w:trPr>
-          <w:tblHeader w:val="true"/>
-        </w:trPr>
-        <w:tc>
-          <w:tcPr/>
-          <w:p>
-            <w:pPr>
-              <w:pStyle w:val="Compact"/>
-              <w:jc w:val="left"/>
-            </w:pPr>
-            <w:r>
-              <w:t xml:space="preserve">条件</w:t>
-            </w:r>
-          </w:p>
-        </w:tc>
-        <w:tc>
-          <w:tcPr/>
-          <w:p>
-            <w:pPr>
-              <w:pStyle w:val="Compact"/>
-              <w:jc w:val="left"/>
-            </w:pPr>
-            <w:r>
-              <w:t xml:space="preserve">行为</w:t>
-            </w:r>
-          </w:p>
-        </w:tc>
-      </w:tr>
-      <w:tr>
-        <w:tc>
-          <w:tcPr/>
-          <w:p>
-            <w:pPr>
-              <w:pStyle w:val="Compact"/>
-              <w:jc w:val="left"/>
-            </w:pPr>
-            <w:r>
-              <w:t xml:space="preserve">窗口宽度 ≥ 1280px（全屏 / 宽屏）</w:t>
-            </w:r>
-          </w:p>
-        </w:tc>
-        <w:tc>
-          <w:tcPr/>
-          <w:p>
-            <w:pPr>
-              <w:pStyle w:val="Compact"/>
-              <w:jc w:val="left"/>
-            </w:pPr>
-            <w:r>
-              <w:t xml:space="preserve">AI 助手停靠在右侧，默认展开</w:t>
-            </w:r>
-          </w:p>
-        </w:tc>
-      </w:tr>
-      <w:tr>
-        <w:tc>
-          <w:tcPr/>
-          <w:p>
-            <w:pPr>
-              <w:pStyle w:val="Compact"/>
-              <w:jc w:val="left"/>
-            </w:pPr>
-            <w:r>
-              <w:t xml:space="preserve">窗口宽度 &lt; 1280px（非全屏）</w:t>
-            </w:r>
-          </w:p>
-        </w:tc>
-        <w:tc>
-          <w:tcPr/>
-          <w:p>
-            <w:pPr>
-              <w:pStyle w:val="Compact"/>
-              <w:jc w:val="left"/>
-            </w:pPr>
-            <w:r>
-              <w:t xml:space="preserve">AI 助手</w:t>
-            </w:r>
-            <w:r>
-              <w:rPr>
-                <w:bCs/>
-                <w:b/>
-              </w:rPr>
-              <w:t xml:space="preserve">自动隐藏</w:t>
-            </w:r>
-            <w:r>
-              <w:t xml:space="preserve">；点机器人图标，从右侧以浮层形式滑出（盖在正文上，不挤压正文），再点图标或关闭按钮收起</w:t>
-            </w:r>
-          </w:p>
-        </w:tc>
-      </w:tr>
-      <w:tr>
-        <w:tc>
-          <w:tcPr/>
-          <w:p>
-            <w:pPr>
-              <w:pStyle w:val="Compact"/>
-              <w:jc w:val="left"/>
-            </w:pPr>
-            <w:r>
-              <w:t xml:space="preserve">窗口跨越 1280px 断点</w:t>
-            </w:r>
-          </w:p>
-        </w:tc>
-        <w:tc>
-          <w:tcPr/>
-          <w:p>
-            <w:pPr>
-              <w:pStyle w:val="Compact"/>
-              <w:jc w:val="left"/>
-            </w:pPr>
-            <w:r>
-              <w:t xml:space="preserve">按新宽度重置默认状态（宽屏展开、窄屏收起）</w:t>
-            </w:r>
-          </w:p>
-        </w:tc>
-      </w:tr>
-    </w:tbl>
-    <w:p>
-      <w:pPr>
-        <w:pStyle w:val="BodyText"/>
-      </w:pPr>
-      <w:r>
-        <w:t xml:space="preserve">窄屏浮层顶部对齐在顶栏下方，保证顶栏的机器人图标始终可点。</w:t>
-      </w:r>
-    </w:p>
-    <w:p>
-      <w:pPr>
-        <w:pStyle w:val="CaptionedFigure"/>
-      </w:pPr>
-      <w:r>
-        <w:drawing>
-          <wp:inline>
-            <wp:extent cx="5334000" cy="3879272"/>
-            <wp:effectExtent b="0" l="0" r="0" t="0"/>
-            <wp:docPr descr="窄屏：AI 助手自动隐藏，右下角浮动机器人" title="" id="75" name="Picture"/>
-            <a:graphic>
-              <a:graphicData uri="http://schemas.openxmlformats.org/drawingml/2006/picture">
-                <pic:pic>
-                  <pic:nvPicPr>
-                    <pic:cNvPr descr="wd-img/w13-narrow-hidden.jpg" id="76" name="Picture"/>
-                    <pic:cNvPicPr>
-                      <a:picLocks noChangeArrowheads="1" noChangeAspect="1"/>
-                    </pic:cNvPicPr>
-                  </pic:nvPicPr>
-                  <pic:blipFill>
-                    <a:blip r:embed="rId74"/>
-                    <a:stretch>
-                      <a:fillRect/>
-                    </a:stretch>
-                  </pic:blipFill>
-                  <pic:spPr bwMode="auto">
-                    <a:xfrm>
-                      <a:off x="0" y="0"/>
-                      <a:ext cx="5334000" cy="3879272"/>
-                    </a:xfrm>
-                    <a:prstGeom prst="rect">
-                      <a:avLst/>
-                    </a:prstGeom>
-                    <a:noFill/>
-                    <a:ln w="9525">
-                      <a:noFill/>
-                      <a:headEnd/>
-                      <a:tailEnd/>
-                    </a:ln>
-                  </pic:spPr>
-                </pic:pic>
-              </a:graphicData>
-            </a:graphic>
-          </wp:inline>
-        </w:drawing>
-      </w:r>
-    </w:p>
-    <w:p>
-      <w:pPr>
-        <w:pStyle w:val="ImageCaption"/>
-      </w:pPr>
-      <w:r>
-        <w:t xml:space="preserve">窄屏：AI 助手自动隐藏，右下角浮动机器人</w:t>
-      </w:r>
-    </w:p>
-    <w:bookmarkEnd w:id="77"/>
-    <w:bookmarkStart w:id="84" w:name="机器人图标"/>
-    <w:p>
-      <w:pPr>
-        <w:pStyle w:val="Heading2"/>
-      </w:pPr>
-      <w:r>
-        <w:t xml:space="preserve">4.2 机器人图标</w:t>
-      </w:r>
-    </w:p>
-    <w:p>
-      <w:pPr>
-        <w:numPr>
-          <w:ilvl w:val="0"/>
-          <w:numId w:val="1008"/>
-        </w:numPr>
-        <w:pStyle w:val="Compact"/>
-      </w:pPr>
-      <w:r>
-        <w:t xml:space="preserve">顶栏最右侧，</w:t>
-      </w:r>
-      <w:r>
-        <w:rPr>
-          <w:bCs/>
-          <w:b/>
-        </w:rPr>
-        <w:t xml:space="preserve">用小机器人图标替换原来的小评论图标</w:t>
-      </w:r>
-      <w:r>
-        <w:t xml:space="preserve">；青绿底色，比评论图标更醒目。</w:t>
-      </w:r>
-    </w:p>
-    <w:p>
-      <w:pPr>
-        <w:numPr>
-          <w:ilvl w:val="0"/>
-          <w:numId w:val="1008"/>
-        </w:numPr>
-        <w:pStyle w:val="Compact"/>
-      </w:pPr>
-      <w:r>
-        <w:t xml:space="preserve">窄屏下右下角另有一个圆形浮动机器人按钮（与顶栏图标同功能）。</w:t>
-      </w:r>
-    </w:p>
-    <w:p>
-      <w:pPr>
-        <w:numPr>
-          <w:ilvl w:val="0"/>
-          <w:numId w:val="1008"/>
-        </w:numPr>
-        <w:pStyle w:val="Compact"/>
-      </w:pPr>
-      <w:r>
-        <w:rPr>
-          <w:bCs/>
-          <w:b/>
-        </w:rPr>
-        <w:t xml:space="preserve">悬停提示（tooltip）：「AI助手」</w:t>
-      </w:r>
-      <w:r>
-        <w:t xml:space="preserve">；顶栏图标提示在下方，浮动按钮提示在上方。</w:t>
-      </w:r>
-    </w:p>
-    <w:p>
-      <w:pPr>
-        <w:numPr>
-          <w:ilvl w:val="0"/>
-          <w:numId w:val="1008"/>
-        </w:numPr>
-        <w:pStyle w:val="Compact"/>
-      </w:pPr>
-      <w:r>
-        <w:t xml:space="preserve">点击：展开 / 收起 AI 助手；展开时顶栏图标呈实心高亮态。</w:t>
-      </w:r>
-    </w:p>
-    <w:p>
-      <w:pPr>
-        <w:pStyle w:val="CaptionedFigure"/>
-      </w:pPr>
-      <w:r>
-        <w:drawing>
-          <wp:inline>
-            <wp:extent cx="5334000" cy="3879272"/>
-            <wp:effectExtent b="0" l="0" r="0" t="0"/>
-            <wp:docPr descr="悬停显示「AI助手」" title="" id="79" name="Picture"/>
-            <a:graphic>
-              <a:graphicData uri="http://schemas.openxmlformats.org/drawingml/2006/picture">
-                <pic:pic>
-                  <pic:nvPicPr>
-                    <pic:cNvPr descr="wd-img/w14-robot-tip.jpg" id="80" name="Picture"/>
-                    <pic:cNvPicPr>
-                      <a:picLocks noChangeArrowheads="1" noChangeAspect="1"/>
-                    </pic:cNvPicPr>
-                  </pic:nvPicPr>
-                  <pic:blipFill>
-                    <a:blip r:embed="rId78"/>
-                    <a:stretch>
-                      <a:fillRect/>
-                    </a:stretch>
-                  </pic:blipFill>
-                  <pic:spPr bwMode="auto">
-                    <a:xfrm>
-                      <a:off x="0" y="0"/>
-                      <a:ext cx="5334000" cy="3879272"/>
-                    </a:xfrm>
-                    <a:prstGeom prst="rect">
-                      <a:avLst/>
-                    </a:prstGeom>
-                    <a:noFill/>
-                    <a:ln w="9525">
-                      <a:noFill/>
-                      <a:headEnd/>
-                      <a:tailEnd/>
-                    </a:ln>
-                  </pic:spPr>
-                </pic:pic>
-              </a:graphicData>
-            </a:graphic>
-          </wp:inline>
-        </w:drawing>
-      </w:r>
-    </w:p>
-    <w:p>
-      <w:pPr>
-        <w:pStyle w:val="ImageCaption"/>
-      </w:pPr>
-      <w:r>
-        <w:t xml:space="preserve">悬停显示「AI助手」</w:t>
-      </w:r>
-    </w:p>
-    <w:p>
-      <w:pPr>
-        <w:pStyle w:val="CaptionedFigure"/>
-      </w:pPr>
-      <w:r>
-        <w:drawing>
-          <wp:inline>
-            <wp:extent cx="5334000" cy="3879272"/>
-            <wp:effectExtent b="0" l="0" r="0" t="0"/>
-            <wp:docPr descr="点击后右侧滑出 AI 助手" title="" id="82" name="Picture"/>
-            <a:graphic>
-              <a:graphicData uri="http://schemas.openxmlformats.org/drawingml/2006/picture">
-                <pic:pic>
-                  <pic:nvPicPr>
-                    <pic:cNvPr descr="wd-img/w15-narrow-open.jpg" id="83" name="Picture"/>
-                    <pic:cNvPicPr>
-                      <a:picLocks noChangeArrowheads="1" noChangeAspect="1"/>
-                    </pic:cNvPicPr>
-                  </pic:nvPicPr>
-                  <pic:blipFill>
-                    <a:blip r:embed="rId81"/>
-                    <a:stretch>
-                      <a:fillRect/>
-                    </a:stretch>
-                  </pic:blipFill>
-                  <pic:spPr bwMode="auto">
-                    <a:xfrm>
-                      <a:off x="0" y="0"/>
-                      <a:ext cx="5334000" cy="3879272"/>
-                    </a:xfrm>
-                    <a:prstGeom prst="rect">
-                      <a:avLst/>
-                    </a:prstGeom>
-                    <a:noFill/>
-                    <a:ln w="9525">
-                      <a:noFill/>
-                      <a:headEnd/>
-                      <a:tailEnd/>
-                    </a:ln>
-                  </pic:spPr>
-                </pic:pic>
-              </a:graphicData>
-            </a:graphic>
-          </wp:inline>
-        </w:drawing>
-      </w:r>
-    </w:p>
-    <w:p>
-      <w:pPr>
-        <w:pStyle w:val="ImageCaption"/>
-      </w:pPr>
-      <w:r>
-        <w:t xml:space="preserve">点击后右侧滑出 AI 助手</w:t>
-      </w:r>
-    </w:p>
-    <w:bookmarkEnd w:id="84"/>
-    <w:bookmarkStart w:id="88" w:name="评估报告与-ai-助手共用右侧栏"/>
-    <w:p>
-      <w:pPr>
-        <w:pStyle w:val="Heading2"/>
-      </w:pPr>
-      <w:r>
-        <w:t xml:space="preserve">4.3 评估报告与 AI 助手共用右侧栏</w:t>
-      </w:r>
-    </w:p>
-    <w:p>
-      <w:pPr>
-        <w:numPr>
-          <w:ilvl w:val="0"/>
-          <w:numId w:val="1009"/>
-        </w:numPr>
-        <w:pStyle w:val="Compact"/>
-      </w:pPr>
-      <w:r>
-        <w:t xml:space="preserve">右侧栏有两个页签：「AI 助手 | 评估报告」，报告页签仅在评估过后出现；</w:t>
-      </w:r>
-    </w:p>
-    <w:p>
-      <w:pPr>
-        <w:numPr>
-          <w:ilvl w:val="0"/>
-          <w:numId w:val="1009"/>
-        </w:numPr>
-        <w:pStyle w:val="Compact"/>
-      </w:pPr>
-      <w:r>
-        <w:t xml:space="preserve">点「评估」时，即使 AI 助手处于收起状态，也会自动展开右侧栏并切到报告页签（窄屏为浮层）；</w:t>
-      </w:r>
-    </w:p>
-    <w:p>
-      <w:pPr>
-        <w:numPr>
-          <w:ilvl w:val="0"/>
-          <w:numId w:val="1009"/>
-        </w:numPr>
-        <w:pStyle w:val="Compact"/>
-      </w:pPr>
-      <w:r>
-        <w:t xml:space="preserve">报告与对话互不覆盖，可随时切换。</w:t>
-      </w:r>
-    </w:p>
-    <w:p>
-      <w:pPr>
-        <w:pStyle w:val="CaptionedFigure"/>
-      </w:pPr>
-      <w:r>
-        <w:drawing>
-          <wp:inline>
-            <wp:extent cx="5334000" cy="3879272"/>
-            <wp:effectExtent b="0" l="0" r="0" t="0"/>
-            <wp:docPr descr="窄屏下评估报告浮层" title="" id="86" name="Picture"/>
-            <a:graphic>
-              <a:graphicData uri="http://schemas.openxmlformats.org/drawingml/2006/picture">
-                <pic:pic>
-                  <pic:nvPicPr>
-                    <pic:cNvPr descr="wd-img/w16-narrow-report.jpg" id="87" name="Picture"/>
-                    <pic:cNvPicPr>
-                      <a:picLocks noChangeArrowheads="1" noChangeAspect="1"/>
-                    </pic:cNvPicPr>
-                  </pic:nvPicPr>
-                  <pic:blipFill>
-                    <a:blip r:embed="rId85"/>
-                    <a:stretch>
-                      <a:fillRect/>
-                    </a:stretch>
-                  </pic:blipFill>
-                  <pic:spPr bwMode="auto">
-                    <a:xfrm>
-                      <a:off x="0" y="0"/>
-                      <a:ext cx="5334000" cy="3879272"/>
-                    </a:xfrm>
-                    <a:prstGeom prst="rect">
-                      <a:avLst/>
-                    </a:prstGeom>
-                    <a:noFill/>
-                    <a:ln w="9525">
-                      <a:noFill/>
-                      <a:headEnd/>
-                      <a:tailEnd/>
-                    </a:ln>
-                  </pic:spPr>
-                </pic:pic>
-              </a:graphicData>
-            </a:graphic>
-          </wp:inline>
-        </w:drawing>
-      </w:r>
-    </w:p>
-    <w:p>
-      <w:pPr>
-        <w:pStyle w:val="ImageCaption"/>
-      </w:pPr>
-      <w:r>
-        <w:t xml:space="preserve">窄屏下评估报告浮层</w:t>
-      </w:r>
-    </w:p>
-    <w:bookmarkEnd w:id="88"/>
-    <w:bookmarkStart w:id="92" w:name="侧栏宽度可调整新增"/>
-    <w:p>
-      <w:pPr>
-        <w:pStyle w:val="Heading2"/>
-      </w:pPr>
-      <w:r>
-        <w:t xml:space="preserve">4.4 侧栏宽度可调整（新增）</w:t>
+        <w:t xml:space="preserve">5. 验收要点</w:t>
       </w:r>
     </w:p>
     <w:p>
@@ -2986,7 +3046,7 @@
         <w:pStyle w:val="Compact"/>
       </w:pPr>
       <w:r>
-        <w:t xml:space="preserve">侧栏左边缘有一条竖向拖动条（悬停变青色，光标为左右箭头）；</w:t>
+        <w:t xml:space="preserve">创意 1 组、策划案 2 组（人物小传 / 策划案）、集纲每集、剧本每集各 1 组两图标；集纲每集、剧本每集各 1 组。</w:t>
       </w:r>
     </w:p>
     <w:p>
@@ -2998,20 +3058,7 @@
         <w:pStyle w:val="Compact"/>
       </w:pPr>
       <w:r>
-        <w:t xml:space="preserve">向左拖变宽、向右拖变窄，范围</w:t>
-      </w:r>
-      <w:r>
-        <w:t xml:space="preserve"> </w:t>
-      </w:r>
-      <w:r>
-        <w:rPr>
-          <w:bCs/>
-          <w:b/>
-        </w:rPr>
-        <w:t xml:space="preserve">300–680px</w:t>
-      </w:r>
-      <w:r>
-        <w:t xml:space="preserve">，默认 380px；</w:t>
+        <w:t xml:space="preserve">「评估」「重写」为图标 + 文字按钮；评估报告显示在区块内，可关闭，关闭后点「评估报告」直接重看且不重复评估；报告里无任何「修改」类按钮；原文被标红并带编号，双向跳转可用。</w:t>
       </w:r>
     </w:p>
     <w:p>
@@ -3023,14 +3070,7 @@
         <w:pStyle w:val="Compact"/>
       </w:pPr>
       <w:r>
-        <w:rPr>
-          <w:bCs/>
-          <w:b/>
-        </w:rPr>
-        <w:t xml:space="preserve">双击拖动条恢复默认宽度</w:t>
-      </w:r>
-      <w:r>
-        <w:t xml:space="preserve">；</w:t>
+        <w:t xml:space="preserve">重写默认只影响当前区块，可撤销，重写后旧报告清除；有下游的区块重写前弹出「可能会影响其他部分」，可选只重写本区块或全部重写。</w:t>
       </w:r>
     </w:p>
     <w:p>
@@ -3042,7 +3082,7 @@
         <w:pStyle w:val="Compact"/>
       </w:pPr>
       <w:r>
-        <w:t xml:space="preserve">宽度会被记住（浏览器本地），下次打开沿用；窄屏浮层同样可拖，最宽不超过屏幕 92%；</w:t>
+        <w:t xml:space="preserve">AI 助手输入框内无「剧本医生」；侧栏可拖动调宽（300–680px），双击恢复。</w:t>
       </w:r>
     </w:p>
     <w:p>
@@ -3054,73 +3094,29 @@
         <w:pStyle w:val="Compact"/>
       </w:pPr>
       <w:r>
-        <w:t xml:space="preserve">拖动过程中正文区域实时让位（宽屏停靠模式）。</w:t>
-      </w:r>
-    </w:p>
-    <w:p>
-      <w:pPr>
-        <w:pStyle w:val="CaptionedFigure"/>
-      </w:pPr>
-      <w:r>
-        <w:drawing>
-          <wp:inline>
-            <wp:extent cx="5334000" cy="3200400"/>
-            <wp:effectExtent b="0" l="0" r="0" t="0"/>
-            <wp:docPr descr="拖宽后的 AI 助手侧栏" title="" id="90" name="Picture"/>
-            <a:graphic>
-              <a:graphicData uri="http://schemas.openxmlformats.org/drawingml/2006/picture">
-                <pic:pic>
-                  <pic:nvPicPr>
-                    <pic:cNvPr descr="wd-img/x07-resized.jpg" id="91" name="Picture"/>
-                    <pic:cNvPicPr>
-                      <a:picLocks noChangeArrowheads="1" noChangeAspect="1"/>
-                    </pic:cNvPicPr>
-                  </pic:nvPicPr>
-                  <pic:blipFill>
-                    <a:blip r:embed="rId89"/>
-                    <a:stretch>
-                      <a:fillRect/>
-                    </a:stretch>
-                  </pic:blipFill>
-                  <pic:spPr bwMode="auto">
-                    <a:xfrm>
-                      <a:off x="0" y="0"/>
-                      <a:ext cx="5334000" cy="3200400"/>
-                    </a:xfrm>
-                    <a:prstGeom prst="rect">
-                      <a:avLst/>
-                    </a:prstGeom>
-                    <a:noFill/>
-                    <a:ln w="9525">
-                      <a:noFill/>
-                      <a:headEnd/>
-                      <a:tailEnd/>
-                    </a:ln>
-                  </pic:spPr>
-                </pic:pic>
-              </a:graphicData>
-            </a:graphic>
-          </wp:inline>
-        </w:drawing>
-      </w:r>
-    </w:p>
-    <w:p>
-      <w:pPr>
-        <w:pStyle w:val="ImageCaption"/>
-      </w:pPr>
-      <w:r>
-        <w:t xml:space="preserve">拖宽后的 AI 助手侧栏</w:t>
-      </w:r>
-    </w:p>
-    <w:bookmarkEnd w:id="92"/>
-    <w:bookmarkEnd w:id="93"/>
-    <w:bookmarkStart w:id="94" w:name="验收要点"/>
+        <w:t xml:space="preserve">宽 &lt; 1280px 时 AI 助手默认隐藏；机器人图标可呼出；悬停显示「AI助手」。</w:t>
+      </w:r>
+    </w:p>
+    <w:p>
+      <w:pPr>
+        <w:numPr>
+          <w:ilvl w:val="0"/>
+          <w:numId w:val="1010"/>
+        </w:numPr>
+        <w:pStyle w:val="Compact"/>
+      </w:pPr>
+      <w:r>
+        <w:t xml:space="preserve">状态表达不只靠颜色（有 ✓ ! ✕ 与文字）。</w:t>
+      </w:r>
+    </w:p>
+    <w:bookmarkEnd w:id="85"/>
+    <w:bookmarkStart w:id="86" w:name="附录demo-使用"/>
     <w:p>
       <w:pPr>
         <w:pStyle w:val="Heading1"/>
       </w:pPr>
       <w:r>
-        <w:t xml:space="preserve">5. 验收要点</w:t>
+        <w:t xml:space="preserve">附录：Demo 使用</w:t>
       </w:r>
     </w:p>
     <w:p>
@@ -3132,7 +3128,19 @@
         <w:pStyle w:val="Compact"/>
       </w:pPr>
       <w:r>
-        <w:t xml:space="preserve">创意 1 组、策划案 2 组（人物小传 / 策划案）、集纲每集、剧本每集各 1 组两图标；集纲每集、剧本每集各 1 组。</w:t>
+        <w:t xml:space="preserve">打开</w:t>
+      </w:r>
+      <w:r>
+        <w:t xml:space="preserve"> </w:t>
+      </w:r>
+      <w:r>
+        <w:rPr>
+          <w:rStyle w:val="VerbatimChar"/>
+        </w:rPr>
+        <w:t xml:space="preserve">demo/workspace-doctor.html</w:t>
+      </w:r>
+      <w:r>
+        <w:t xml:space="preserve">，左侧可切换 创意 / 策划案 / 集纲 / 剧本。</w:t>
       </w:r>
     </w:p>
     <w:p>
@@ -3144,7 +3152,7 @@
         <w:pStyle w:val="Compact"/>
       </w:pPr>
       <w:r>
-        <w:t xml:space="preserve">评估只出报告，报告里无任何「修改」类按钮；原文被标红并带编号，双向跳转可用。</w:t>
+        <w:t xml:space="preserve">在任一区块右上角点第 1 枚图标评估；点意见或原文圆标互相跳转。</w:t>
       </w:r>
     </w:p>
     <w:p>
@@ -3156,7 +3164,7 @@
         <w:pStyle w:val="Compact"/>
       </w:pPr>
       <w:r>
-        <w:t xml:space="preserve">重写默认只影响当前区块，可撤销，重写后旧报告清除；有下游的区块重写前弹出「可能会影响其他部分」，可选只重写本区块或全部重写。</w:t>
+        <w:t xml:space="preserve">点第 2 枚图标重写，再评估对比。</w:t>
       </w:r>
     </w:p>
     <w:p>
@@ -3168,104 +3176,10 @@
         <w:pStyle w:val="Compact"/>
       </w:pPr>
       <w:r>
-        <w:t xml:space="preserve">AI 助手输入框内无「剧本医生」；侧栏可拖动调宽（300–680px），双击恢复。</w:t>
-      </w:r>
-    </w:p>
-    <w:p>
-      <w:pPr>
-        <w:numPr>
-          <w:ilvl w:val="0"/>
-          <w:numId w:val="1011"/>
-        </w:numPr>
-        <w:pStyle w:val="Compact"/>
-      </w:pPr>
-      <w:r>
-        <w:t xml:space="preserve">宽 &lt; 1280px 时 AI 助手默认隐藏；机器人图标可呼出；悬停显示「AI助手」。</w:t>
-      </w:r>
-    </w:p>
-    <w:p>
-      <w:pPr>
-        <w:numPr>
-          <w:ilvl w:val="0"/>
-          <w:numId w:val="1011"/>
-        </w:numPr>
-        <w:pStyle w:val="Compact"/>
-      </w:pPr>
-      <w:r>
-        <w:t xml:space="preserve">状态表达不只靠颜色（有 ✓ ! ✕ 与文字）。</w:t>
-      </w:r>
-    </w:p>
-    <w:bookmarkEnd w:id="94"/>
-    <w:bookmarkStart w:id="95" w:name="附录demo-使用"/>
-    <w:p>
-      <w:pPr>
-        <w:pStyle w:val="Heading1"/>
-      </w:pPr>
-      <w:r>
-        <w:t xml:space="preserve">附录：Demo 使用</w:t>
-      </w:r>
-    </w:p>
-    <w:p>
-      <w:pPr>
-        <w:numPr>
-          <w:ilvl w:val="0"/>
-          <w:numId w:val="1012"/>
-        </w:numPr>
-        <w:pStyle w:val="Compact"/>
-      </w:pPr>
-      <w:r>
-        <w:t xml:space="preserve">打开</w:t>
-      </w:r>
-      <w:r>
-        <w:t xml:space="preserve"> </w:t>
-      </w:r>
-      <w:r>
-        <w:rPr>
-          <w:rStyle w:val="VerbatimChar"/>
-        </w:rPr>
-        <w:t xml:space="preserve">demo/workspace-doctor.html</w:t>
-      </w:r>
-      <w:r>
-        <w:t xml:space="preserve">，左侧可切换 创意 / 策划案 / 集纲 / 剧本。</w:t>
-      </w:r>
-    </w:p>
-    <w:p>
-      <w:pPr>
-        <w:numPr>
-          <w:ilvl w:val="0"/>
-          <w:numId w:val="1012"/>
-        </w:numPr>
-        <w:pStyle w:val="Compact"/>
-      </w:pPr>
-      <w:r>
-        <w:t xml:space="preserve">在任一区块右上角点第 1 枚图标评估；点意见或原文圆标互相跳转。</w:t>
-      </w:r>
-    </w:p>
-    <w:p>
-      <w:pPr>
-        <w:numPr>
-          <w:ilvl w:val="0"/>
-          <w:numId w:val="1012"/>
-        </w:numPr>
-        <w:pStyle w:val="Compact"/>
-      </w:pPr>
-      <w:r>
-        <w:t xml:space="preserve">点第 2 枚图标重写，再评估对比。</w:t>
-      </w:r>
-    </w:p>
-    <w:p>
-      <w:pPr>
-        <w:numPr>
-          <w:ilvl w:val="0"/>
-          <w:numId w:val="1012"/>
-        </w:numPr>
-        <w:pStyle w:val="Compact"/>
-      </w:pPr>
-      <w:r>
         <w:t xml:space="preserve">把浏览器窗口缩到 1280px 以下，观察 AI 助手自动收起，点机器人图标呼出。</w:t>
       </w:r>
     </w:p>
-    <w:bookmarkEnd w:id="95"/>
+    <w:bookmarkEnd w:id="86"/>
     <w:sectPr/>
   </w:body>
 </w:document>
@@ -3645,9 +3559,6 @@
     <w:abstractNumId w:val="991"/>
   </w:num>
   <w:num w:numId="1010">
-    <w:abstractNumId w:val="991"/>
-  </w:num>
-  <w:num w:numId="1011">
     <w:abstractNumId w:val="99411"/>
     <w:lvlOverride w:ilvl="0">
       <w:startOverride w:val="1"/>
@@ -3677,7 +3588,7 @@
       <w:startOverride w:val="1"/>
     </w:lvlOverride>
   </w:num>
-  <w:num w:numId="1012">
+  <w:num w:numId="1011">
     <w:abstractNumId w:val="99411"/>
     <w:lvlOverride w:ilvl="0">
       <w:startOverride w:val="1"/>

</xml_diff>

<commit_message>
Rewrite produces new version with before/after diff and rollback
Co-Authored-By: Claude Sonnet 5.5 <noreply@anthropic.com>
Claude-Session: https://claude.ai/code/session_01BwGpqARRukchuVN39hPaRP
</commit_message>
<xml_diff>
--- a/docs/PRD-workspace-doctor.docx
+++ b/docs/PRD-workspace-doctor.docx
@@ -63,7 +63,7 @@
         <w:pStyle w:val="Subtitle"/>
       </w:pPr>
       <w:r>
-        <w:t xml:space="preserve">v1.2</w:t>
+        <w:t xml:space="preserve">v1.3</w:t>
       </w:r>
       <w:r>
         <w:t xml:space="preserve"> </w:t>
@@ -1883,13 +1883,22 @@
     </w:p>
     <w:bookmarkEnd w:id="52"/>
     <w:bookmarkEnd w:id="53"/>
-    <w:bookmarkStart w:id="67" w:name="重写"/>
+    <w:bookmarkStart w:id="80" w:name="重写"/>
     <w:p>
       <w:pPr>
         <w:pStyle w:val="Heading1"/>
       </w:pPr>
       <w:r>
         <w:t xml:space="preserve">3. 重写</w:t>
+      </w:r>
+    </w:p>
+    <w:bookmarkStart w:id="69" w:name="重写流程与前后版本对比"/>
+    <w:p>
+      <w:pPr>
+        <w:pStyle w:val="Heading2"/>
+      </w:pPr>
+      <w:r>
+        <w:t xml:space="preserve">3.0 重写流程与「前后版本对比」</w:t>
       </w:r>
     </w:p>
     <w:p>
@@ -1901,7 +1910,7 @@
         <w:pStyle w:val="Compact"/>
       </w:pPr>
       <w:r>
-        <w:t xml:space="preserve">点「重写」→（有下游时先见 3.1 的提示）居中弹窗：标题「重写 · 区块名」，可选补充要求（输入框 + 快捷词：台词更口语 / 结尾钩子更狠 / 冲突再强一点），按钮「取消 / 开始重写」。</w:t>
+        <w:t xml:space="preserve">点「重写」→（有下游时先见 3.1 的提示）居中弹窗，可填补充要求（输入框 + 快捷词：台词更口语 / 结尾钩子更狠 / 冲突再强一点），按钮「取消 / 开始重写」。</w:t>
       </w:r>
     </w:p>
     <w:p>
@@ -1913,17 +1922,27 @@
         <w:pStyle w:val="Compact"/>
       </w:pPr>
       <w:r>
-        <w:t xml:space="preserve">点「开始重写」→ toast「正在重写…」→ 区块文字被替换，并在区块标题下出现绿色提示条：</w:t>
+        <w:t xml:space="preserve">点「开始重写」→ toast「正在重写…」→ 区块正文</w:t>
       </w:r>
       <w:r>
         <w:rPr>
           <w:bCs/>
           <w:b/>
         </w:rPr>
-        <w:t xml:space="preserve">「✓ 已重写 · 红标已清除，可再点『评估』复查　[撤销重写]」</w:t>
-      </w:r>
-      <w:r>
-        <w:t xml:space="preserve">。</w:t>
+        <w:t xml:space="preserve">替换为重写版 v2</w:t>
+      </w:r>
+      <w:r>
+        <w:t xml:space="preserve">，同时区块内</w:t>
+      </w:r>
+      <w:r>
+        <w:rPr>
+          <w:bCs/>
+          <w:b/>
+        </w:rPr>
+        <w:t xml:space="preserve">自动展开「重写前后对比」</w:t>
+      </w:r>
+      <w:r>
+        <w:t xml:space="preserve">，让用户立刻看见改了什么。</w:t>
       </w:r>
     </w:p>
     <w:p>
@@ -1935,19 +1954,175 @@
         <w:pStyle w:val="Compact"/>
       </w:pPr>
       <w:r>
-        <w:t xml:space="preserve">「撤销重写」恢复重写前的原文。</w:t>
+        <w:t xml:space="preserve">区块标题下出现</w:t>
+      </w:r>
+      <w:r>
+        <w:rPr>
+          <w:bCs/>
+          <w:b/>
+        </w:rPr>
+        <w:t xml:space="preserve">版本条</w:t>
+      </w:r>
+      <w:r>
+        <w:t xml:space="preserve">：「✓ 已重写 · v2　改动 N 处 · 要求：…　[查看对比 / 收起对比] [回退到原版本]」。</w:t>
+      </w:r>
+    </w:p>
+    <w:p>
+      <w:pPr>
+        <w:pStyle w:val="FirstParagraph"/>
+      </w:pPr>
+      <w:r>
+        <w:rPr>
+          <w:bCs/>
+          <w:b/>
+        </w:rPr>
+        <w:t xml:space="preserve">对比面板（区块内）</w:t>
       </w:r>
     </w:p>
     <w:p>
       <w:pPr>
         <w:numPr>
           <w:ilvl w:val="0"/>
-          <w:numId w:val="1006"/>
-        </w:numPr>
-        <w:pStyle w:val="Compact"/>
-      </w:pPr>
-      <w:r>
-        <w:t xml:space="preserve">重写后再评估，可看到分数提升、意见减少，形成「评估 → 重写 → 复评」的闭环。</w:t>
+          <w:numId w:val="1007"/>
+        </w:numPr>
+        <w:pStyle w:val="Compact"/>
+      </w:pPr>
+      <w:r>
+        <w:t xml:space="preserve">左右两栏：</w:t>
+      </w:r>
+      <w:r>
+        <w:rPr>
+          <w:bCs/>
+          <w:b/>
+        </w:rPr>
+        <w:t xml:space="preserve">原版本 | 重写版 v2</w:t>
+      </w:r>
+      <w:r>
+        <w:t xml:space="preserve">，只列出有改动的段落，未改动的合并为「另有 N 处未改动」；</w:t>
+      </w:r>
+    </w:p>
+    <w:p>
+      <w:pPr>
+        <w:numPr>
+          <w:ilvl w:val="0"/>
+          <w:numId w:val="1007"/>
+        </w:numPr>
+        <w:pStyle w:val="Compact"/>
+      </w:pPr>
+      <w:r>
+        <w:t xml:space="preserve">字符级差异高亮：</w:t>
+      </w:r>
+      <w:r>
+        <w:rPr>
+          <w:bCs/>
+          <w:b/>
+        </w:rPr>
+        <w:t xml:space="preserve">红色删除线 = 被删除/被替换</w:t>
+      </w:r>
+      <w:r>
+        <w:t xml:space="preserve">，</w:t>
+      </w:r>
+      <w:r>
+        <w:rPr>
+          <w:bCs/>
+          <w:b/>
+        </w:rPr>
+        <w:t xml:space="preserve">绿色底色 = 新增/替换为</w:t>
+      </w:r>
+      <w:r>
+        <w:t xml:space="preserve">（图例在面板顶部，且有文字说明，不只靠颜色）；</w:t>
+      </w:r>
+    </w:p>
+    <w:p>
+      <w:pPr>
+        <w:numPr>
+          <w:ilvl w:val="0"/>
+          <w:numId w:val="1007"/>
+        </w:numPr>
+        <w:pStyle w:val="Compact"/>
+      </w:pPr>
+      <w:r>
+        <w:t xml:space="preserve">面板右上角 ✕ 可收起；底部按钮：「回退到原版本」「保留重写版，收起」。</w:t>
+      </w:r>
+    </w:p>
+    <w:p>
+      <w:pPr>
+        <w:pStyle w:val="FirstParagraph"/>
+      </w:pPr>
+      <w:r>
+        <w:rPr>
+          <w:bCs/>
+          <w:b/>
+        </w:rPr>
+        <w:t xml:space="preserve">回退与恢复</w:t>
+      </w:r>
+    </w:p>
+    <w:p>
+      <w:pPr>
+        <w:numPr>
+          <w:ilvl w:val="0"/>
+          <w:numId w:val="1008"/>
+        </w:numPr>
+        <w:pStyle w:val="Compact"/>
+      </w:pPr>
+      <w:r>
+        <w:t xml:space="preserve">点「回退到原版本」→ 正文立即恢复为重写前的原文；版本条变为黄色「↩ 已回退到原版本 · 重写版仍保留　[查看对比] [恢复重写版]」；</w:t>
+      </w:r>
+    </w:p>
+    <w:p>
+      <w:pPr>
+        <w:numPr>
+          <w:ilvl w:val="0"/>
+          <w:numId w:val="1008"/>
+        </w:numPr>
+        <w:pStyle w:val="Compact"/>
+      </w:pPr>
+      <w:r>
+        <w:t xml:space="preserve">点「恢复重写版」→ 重新采用重写版；回退 / 恢复可来回切换，</w:t>
+      </w:r>
+      <w:r>
+        <w:rPr>
+          <w:bCs/>
+          <w:b/>
+        </w:rPr>
+        <w:t xml:space="preserve">两个版本都不会丢</w:t>
+      </w:r>
+      <w:r>
+        <w:t xml:space="preserve">；</w:t>
+      </w:r>
+    </w:p>
+    <w:p>
+      <w:pPr>
+        <w:numPr>
+          <w:ilvl w:val="0"/>
+          <w:numId w:val="1008"/>
+        </w:numPr>
+        <w:pStyle w:val="Compact"/>
+      </w:pPr>
+      <w:r>
+        <w:t xml:space="preserve">回退或恢复后，该区块的评估报告与标红清除（文字已变，报告过期），需重新评估；</w:t>
+      </w:r>
+    </w:p>
+    <w:p>
+      <w:pPr>
+        <w:numPr>
+          <w:ilvl w:val="0"/>
+          <w:numId w:val="1008"/>
+        </w:numPr>
+        <w:pStyle w:val="Compact"/>
+      </w:pPr>
+      <w:r>
+        <w:t xml:space="preserve">再次「重写」时以</w:t>
+      </w:r>
+      <w:r>
+        <w:rPr>
+          <w:bCs/>
+          <w:b/>
+        </w:rPr>
+        <w:t xml:space="preserve">原版本</w:t>
+      </w:r>
+      <w:r>
+        <w:t xml:space="preserve">为基础生成新版本（版本号递增），对比始终是「原版本 vs 最新重写版」。</w:t>
       </w:r>
     </w:p>
     <w:p>
@@ -1959,12 +2134,12 @@
           <wp:inline>
             <wp:extent cx="5334000" cy="3200400"/>
             <wp:effectExtent b="0" l="0" r="0" t="0"/>
-            <wp:docPr descr="重写完成：红标与报告已清除" title="" id="55" name="Picture"/>
+            <wp:docPr descr="重写弹窗（补充要求）" title="" id="55" name="Picture"/>
             <a:graphic>
               <a:graphicData uri="http://schemas.openxmlformats.org/drawingml/2006/picture">
                 <pic:pic>
                   <pic:nvPicPr>
-                    <pic:cNvPr descr="wd-img/w09-rewritten.jpg" id="56" name="Picture"/>
+                    <pic:cNvPr descr="wd-img/w17-rw-dlg.jpg" id="56" name="Picture"/>
                     <pic:cNvPicPr>
                       <a:picLocks noChangeArrowheads="1" noChangeAspect="1"/>
                     </pic:cNvPicPr>
@@ -2002,293 +2177,7 @@
         <w:pStyle w:val="ImageCaption"/>
       </w:pPr>
       <w:r>
-        <w:t xml:space="preserve">重写完成：红标与报告已清除</w:t>
-      </w:r>
-    </w:p>
-    <w:p>
-      <w:pPr>
-        <w:pStyle w:val="BlockText"/>
-      </w:pPr>
-      <w:r>
-        <w:t xml:space="preserve">评估与重写</w:t>
-      </w:r>
-      <w:r>
-        <w:rPr>
-          <w:bCs/>
-          <w:b/>
-        </w:rPr>
-        <w:t xml:space="preserve">相互独立</w:t>
-      </w:r>
-      <w:r>
-        <w:t xml:space="preserve">：评估不会自动触发重写；重写也不依赖先评估。重写时若已存在评估意见，建议模型把意见作为参考（正式版实现）。</w:t>
-      </w:r>
-    </w:p>
-    <w:bookmarkStart w:id="66" w:name="上游重写的联动提醒新增"/>
-    <w:p>
-      <w:pPr>
-        <w:pStyle w:val="Heading2"/>
-      </w:pPr>
-      <w:r>
-        <w:t xml:space="preserve">3.1 上游重写的联动提醒（新增）</w:t>
-      </w:r>
-    </w:p>
-    <w:p>
-      <w:pPr>
-        <w:pStyle w:val="FirstParagraph"/>
-      </w:pPr>
-      <w:r>
-        <w:t xml:space="preserve">内容有上下游依赖：</w:t>
-      </w:r>
-    </w:p>
-    <w:tbl>
-      <w:tblPr>
-        <w:tblStyle w:val="Table"/>
-        <w:tblW w:type="auto" w:w="0"/>
-        <w:tblLook w:firstRow="1" w:lastRow="0" w:firstColumn="0" w:lastColumn="0" w:noHBand="0" w:noVBand="0" w:val="0020"/>
-        <w:jc w:val="start"/>
-      </w:tblPr>
-      <w:tblGrid>
-        <w:gridCol w:w="3960"/>
-        <w:gridCol w:w="3960"/>
-      </w:tblGrid>
-      <w:tr>
-        <w:trPr>
-          <w:tblHeader w:val="true"/>
-        </w:trPr>
-        <w:tc>
-          <w:tcPr/>
-          <w:p>
-            <w:pPr>
-              <w:pStyle w:val="Compact"/>
-              <w:jc w:val="left"/>
-            </w:pPr>
-            <w:r>
-              <w:t xml:space="preserve">重写的区块</w:t>
-            </w:r>
-          </w:p>
-        </w:tc>
-        <w:tc>
-          <w:tcPr/>
-          <w:p>
-            <w:pPr>
-              <w:pStyle w:val="Compact"/>
-              <w:jc w:val="left"/>
-            </w:pPr>
-            <w:r>
-              <w:t xml:space="preserve">可能受影响的下游</w:t>
-            </w:r>
-          </w:p>
-        </w:tc>
-      </w:tr>
-      <w:tr>
-        <w:tc>
-          <w:tcPr/>
-          <w:p>
-            <w:pPr>
-              <w:pStyle w:val="Compact"/>
-              <w:jc w:val="left"/>
-            </w:pPr>
-            <w:r>
-              <w:t xml:space="preserve">核心创意</w:t>
-            </w:r>
-          </w:p>
-        </w:tc>
-        <w:tc>
-          <w:tcPr/>
-          <w:p>
-            <w:pPr>
-              <w:pStyle w:val="Compact"/>
-              <w:jc w:val="left"/>
-            </w:pPr>
-            <w:r>
-              <w:t xml:space="preserve">人物小传、策划案、全部集纲、全部剧本</w:t>
-            </w:r>
-          </w:p>
-        </w:tc>
-      </w:tr>
-      <w:tr>
-        <w:tc>
-          <w:tcPr/>
-          <w:p>
-            <w:pPr>
-              <w:pStyle w:val="Compact"/>
-              <w:jc w:val="left"/>
-            </w:pPr>
-            <w:r>
-              <w:t xml:space="preserve">人物小传 / 策划案</w:t>
-            </w:r>
-          </w:p>
-        </w:tc>
-        <w:tc>
-          <w:tcPr/>
-          <w:p>
-            <w:pPr>
-              <w:pStyle w:val="Compact"/>
-              <w:jc w:val="left"/>
-            </w:pPr>
-            <w:r>
-              <w:t xml:space="preserve">全部集纲、全部剧本</w:t>
-            </w:r>
-          </w:p>
-        </w:tc>
-      </w:tr>
-      <w:tr>
-        <w:tc>
-          <w:tcPr/>
-          <w:p>
-            <w:pPr>
-              <w:pStyle w:val="Compact"/>
-              <w:jc w:val="left"/>
-            </w:pPr>
-            <w:r>
-              <w:t xml:space="preserve">集纲第 N 集</w:t>
-            </w:r>
-          </w:p>
-        </w:tc>
-        <w:tc>
-          <w:tcPr/>
-          <w:p>
-            <w:pPr>
-              <w:pStyle w:val="Compact"/>
-              <w:jc w:val="left"/>
-            </w:pPr>
-            <w:r>
-              <w:t xml:space="preserve">对应的剧本第 N 集</w:t>
-            </w:r>
-          </w:p>
-        </w:tc>
-      </w:tr>
-      <w:tr>
-        <w:tc>
-          <w:tcPr/>
-          <w:p>
-            <w:pPr>
-              <w:pStyle w:val="Compact"/>
-              <w:jc w:val="left"/>
-            </w:pPr>
-            <w:r>
-              <w:t xml:space="preserve">剧本第 N 集</w:t>
-            </w:r>
-          </w:p>
-        </w:tc>
-        <w:tc>
-          <w:tcPr/>
-          <w:p>
-            <w:pPr>
-              <w:pStyle w:val="Compact"/>
-              <w:jc w:val="left"/>
-            </w:pPr>
-            <w:r>
-              <w:t xml:space="preserve">无，直接重写</w:t>
-            </w:r>
-          </w:p>
-        </w:tc>
-      </w:tr>
-    </w:tbl>
-    <w:p>
-      <w:pPr>
-        <w:pStyle w:val="BodyText"/>
-      </w:pPr>
-      <w:r>
-        <w:rPr>
-          <w:bCs/>
-          <w:b/>
-        </w:rPr>
-        <w:t xml:space="preserve">规则</w:t>
-      </w:r>
-      <w:r>
-        <w:t xml:space="preserve">：点击有下游的区块的「重写」，弹窗顶部出现黄色提示</w:t>
-      </w:r>
-      <w:r>
-        <w:t xml:space="preserve"> </w:t>
-      </w:r>
-      <w:r>
-        <w:rPr>
-          <w:bCs/>
-          <w:b/>
-        </w:rPr>
-        <w:t xml:space="preserve">「⚠ 可能会影响其他部分」</w:t>
-      </w:r>
-      <w:r>
-        <w:t xml:space="preserve">，列出受影响的下游区块（标签）与数量，并询问是否连同下游一起重写。三个按钮：</w:t>
-      </w:r>
-    </w:p>
-    <w:p>
-      <w:pPr>
-        <w:numPr>
-          <w:ilvl w:val="0"/>
-          <w:numId w:val="1007"/>
-        </w:numPr>
-        <w:pStyle w:val="Compact"/>
-      </w:pPr>
-      <w:r>
-        <w:rPr>
-          <w:bCs/>
-          <w:b/>
-        </w:rPr>
-        <w:t xml:space="preserve">取消</w:t>
-      </w:r>
-      <w:r>
-        <w:t xml:space="preserve">：不做任何事；</w:t>
-      </w:r>
-    </w:p>
-    <w:p>
-      <w:pPr>
-        <w:numPr>
-          <w:ilvl w:val="0"/>
-          <w:numId w:val="1007"/>
-        </w:numPr>
-        <w:pStyle w:val="Compact"/>
-      </w:pPr>
-      <w:r>
-        <w:rPr>
-          <w:bCs/>
-          <w:b/>
-        </w:rPr>
-        <w:t xml:space="preserve">只重写本区块</w:t>
-      </w:r>
-      <w:r>
-        <w:t xml:space="preserve">：仅重写当前区块；受影响的下游区块标题下出现黄色提示</w:t>
-      </w:r>
-      <w:r>
-        <w:t xml:space="preserve"> </w:t>
-      </w:r>
-      <w:r>
-        <w:rPr>
-          <w:bCs/>
-          <w:b/>
-        </w:rPr>
-        <w:t xml:space="preserve">「⚠ 上游内容已改动，本区块可能需要同步　[去重写]」</w:t>
-      </w:r>
-      <w:r>
-        <w:t xml:space="preserve">，左侧不强制处理；</w:t>
-      </w:r>
-    </w:p>
-    <w:p>
-      <w:pPr>
-        <w:numPr>
-          <w:ilvl w:val="0"/>
-          <w:numId w:val="1007"/>
-        </w:numPr>
-        <w:pStyle w:val="Compact"/>
-      </w:pPr>
-      <w:r>
-        <w:rPr>
-          <w:bCs/>
-          <w:b/>
-        </w:rPr>
-        <w:t xml:space="preserve">全部重写（共 N 处）</w:t>
-      </w:r>
-      <w:r>
-        <w:t xml:space="preserve">：依次重写当前区块 + 全部下游（进度 toast「正在同步重写 k/N…」），完成后 toast「已全部重写，共 N 处」；下游旧报告与标红一并清除。</w:t>
-      </w:r>
-    </w:p>
-    <w:p>
-      <w:pPr>
-        <w:pStyle w:val="FirstParagraph"/>
-      </w:pPr>
-      <w:r>
-        <w:t xml:space="preserve">没有下游的区块（如剧本单集）弹窗里不出现提示，按钮为「取消 / 开始重写」。「补充要求」输入框对所有被重写的区块生效。</w:t>
+        <w:t xml:space="preserve">重写弹窗（补充要求）</w:t>
       </w:r>
     </w:p>
     <w:p>
@@ -2300,12 +2189,12 @@
           <wp:inline>
             <wp:extent cx="5334000" cy="3200400"/>
             <wp:effectExtent b="0" l="0" r="0" t="0"/>
-            <wp:docPr descr="人物小传重写：提示会影响下游" title="" id="58" name="Picture"/>
+            <wp:docPr descr="重写后自动展开前后对比" title="" id="58" name="Picture"/>
             <a:graphic>
               <a:graphicData uri="http://schemas.openxmlformats.org/drawingml/2006/picture">
                 <pic:pic>
                   <pic:nvPicPr>
-                    <pic:cNvPr descr="wd-img/x03-cascade-dlg.jpg" id="59" name="Picture"/>
+                    <pic:cNvPr descr="wd-img/w18-compare.jpg" id="59" name="Picture"/>
                     <pic:cNvPicPr>
                       <a:picLocks noChangeArrowheads="1" noChangeAspect="1"/>
                     </pic:cNvPicPr>
@@ -2343,7 +2232,7 @@
         <w:pStyle w:val="ImageCaption"/>
       </w:pPr>
       <w:r>
-        <w:t xml:space="preserve">人物小传重写：提示会影响下游</w:t>
+        <w:t xml:space="preserve">重写后自动展开前后对比</w:t>
       </w:r>
     </w:p>
     <w:p>
@@ -2355,12 +2244,12 @@
           <wp:inline>
             <wp:extent cx="5334000" cy="3200400"/>
             <wp:effectExtent b="0" l="0" r="0" t="0"/>
-            <wp:docPr descr="只重写本区块后，集纲各集出现「上游已改动」提示" title="" id="61" name="Picture"/>
+            <wp:docPr descr="收起对比：正文为重写版，版本条可再看对比 / 回退" title="" id="61" name="Picture"/>
             <a:graphic>
               <a:graphicData uri="http://schemas.openxmlformats.org/drawingml/2006/picture">
                 <pic:pic>
                   <pic:nvPicPr>
-                    <pic:cNvPr descr="wd-img/x05-stale-outline.jpg" id="62" name="Picture"/>
+                    <pic:cNvPr descr="wd-img/w19-rewritten-clean.jpg" id="62" name="Picture"/>
                     <pic:cNvPicPr>
                       <a:picLocks noChangeArrowheads="1" noChangeAspect="1"/>
                     </pic:cNvPicPr>
@@ -2398,7 +2287,7 @@
         <w:pStyle w:val="ImageCaption"/>
       </w:pPr>
       <w:r>
-        <w:t xml:space="preserve">只重写本区块后，集纲各集出现「上游已改动」提示</w:t>
+        <w:t xml:space="preserve">收起对比：正文为重写版，版本条可再看对比 / 回退</w:t>
       </w:r>
     </w:p>
     <w:p>
@@ -2410,12 +2299,12 @@
           <wp:inline>
             <wp:extent cx="5334000" cy="3200400"/>
             <wp:effectExtent b="0" l="0" r="0" t="0"/>
-            <wp:docPr descr="集纲单集重写：影响对应剧本 EP01" title="" id="64" name="Picture"/>
+            <wp:docPr descr="回退到原版本：正文恢复，重写版仍保留" title="" id="64" name="Picture"/>
             <a:graphic>
               <a:graphicData uri="http://schemas.openxmlformats.org/drawingml/2006/picture">
                 <pic:pic>
                   <pic:nvPicPr>
-                    <pic:cNvPr descr="wd-img/x06-ol-dlg.jpg" id="65" name="Picture"/>
+                    <pic:cNvPr descr="wd-img/w20-rolled-back.jpg" id="65" name="Picture"/>
                     <pic:cNvPicPr>
                       <a:picLocks noChangeArrowheads="1" noChangeAspect="1"/>
                     </pic:cNvPicPr>
@@ -2453,12 +2342,509 @@
         <w:pStyle w:val="ImageCaption"/>
       </w:pPr>
       <w:r>
+        <w:t xml:space="preserve">回退到原版本：正文恢复，重写版仍保留</w:t>
+      </w:r>
+    </w:p>
+    <w:p>
+      <w:pPr>
+        <w:pStyle w:val="CaptionedFigure"/>
+      </w:pPr>
+      <w:r>
+        <w:drawing>
+          <wp:inline>
+            <wp:extent cx="5334000" cy="3200400"/>
+            <wp:effectExtent b="0" l="0" r="0" t="0"/>
+            <wp:docPr descr="剧本单集重写对比" title="" id="67" name="Picture"/>
+            <a:graphic>
+              <a:graphicData uri="http://schemas.openxmlformats.org/drawingml/2006/picture">
+                <pic:pic>
+                  <pic:nvPicPr>
+                    <pic:cNvPr descr="wd-img/w21-script-compare.jpg" id="68" name="Picture"/>
+                    <pic:cNvPicPr>
+                      <a:picLocks noChangeArrowheads="1" noChangeAspect="1"/>
+                    </pic:cNvPicPr>
+                  </pic:nvPicPr>
+                  <pic:blipFill>
+                    <a:blip r:embed="rId66"/>
+                    <a:stretch>
+                      <a:fillRect/>
+                    </a:stretch>
+                  </pic:blipFill>
+                  <pic:spPr bwMode="auto">
+                    <a:xfrm>
+                      <a:off x="0" y="0"/>
+                      <a:ext cx="5334000" cy="3200400"/>
+                    </a:xfrm>
+                    <a:prstGeom prst="rect">
+                      <a:avLst/>
+                    </a:prstGeom>
+                    <a:noFill/>
+                    <a:ln w="9525">
+                      <a:noFill/>
+                      <a:headEnd/>
+                      <a:tailEnd/>
+                    </a:ln>
+                  </pic:spPr>
+                </pic:pic>
+              </a:graphicData>
+            </a:graphic>
+          </wp:inline>
+        </w:drawing>
+      </w:r>
+    </w:p>
+    <w:p>
+      <w:pPr>
+        <w:pStyle w:val="ImageCaption"/>
+      </w:pPr>
+      <w:r>
+        <w:t xml:space="preserve">剧本单集重写对比</w:t>
+      </w:r>
+    </w:p>
+    <w:p>
+      <w:pPr>
+        <w:pStyle w:val="BlockText"/>
+      </w:pPr>
+      <w:r>
+        <w:t xml:space="preserve">Demo 说明：重写内容为预置的示例改写（含按评估意见的修改）；正式版由模型按补充要求与评估意见生成，对比与回退逻辑一致。「全部重写」时每个下游区块各自生成版本，均可单独对比 / 回退。</w:t>
+      </w:r>
+    </w:p>
+    <w:bookmarkEnd w:id="69"/>
+    <w:bookmarkStart w:id="79" w:name="上游重写的联动提醒新增"/>
+    <w:p>
+      <w:pPr>
+        <w:pStyle w:val="Heading2"/>
+      </w:pPr>
+      <w:r>
+        <w:t xml:space="preserve">3.1 上游重写的联动提醒（新增）</w:t>
+      </w:r>
+    </w:p>
+    <w:p>
+      <w:pPr>
+        <w:pStyle w:val="FirstParagraph"/>
+      </w:pPr>
+      <w:r>
+        <w:t xml:space="preserve">内容有上下游依赖：</w:t>
+      </w:r>
+    </w:p>
+    <w:tbl>
+      <w:tblPr>
+        <w:tblStyle w:val="Table"/>
+        <w:tblW w:type="auto" w:w="0"/>
+        <w:tblLook w:firstRow="1" w:lastRow="0" w:firstColumn="0" w:lastColumn="0" w:noHBand="0" w:noVBand="0" w:val="0020"/>
+        <w:jc w:val="start"/>
+      </w:tblPr>
+      <w:tblGrid>
+        <w:gridCol w:w="3960"/>
+        <w:gridCol w:w="3960"/>
+      </w:tblGrid>
+      <w:tr>
+        <w:trPr>
+          <w:tblHeader w:val="true"/>
+        </w:trPr>
+        <w:tc>
+          <w:tcPr/>
+          <w:p>
+            <w:pPr>
+              <w:pStyle w:val="Compact"/>
+              <w:jc w:val="left"/>
+            </w:pPr>
+            <w:r>
+              <w:t xml:space="preserve">重写的区块</w:t>
+            </w:r>
+          </w:p>
+        </w:tc>
+        <w:tc>
+          <w:tcPr/>
+          <w:p>
+            <w:pPr>
+              <w:pStyle w:val="Compact"/>
+              <w:jc w:val="left"/>
+            </w:pPr>
+            <w:r>
+              <w:t xml:space="preserve">可能受影响的下游</w:t>
+            </w:r>
+          </w:p>
+        </w:tc>
+      </w:tr>
+      <w:tr>
+        <w:tc>
+          <w:tcPr/>
+          <w:p>
+            <w:pPr>
+              <w:pStyle w:val="Compact"/>
+              <w:jc w:val="left"/>
+            </w:pPr>
+            <w:r>
+              <w:t xml:space="preserve">核心创意</w:t>
+            </w:r>
+          </w:p>
+        </w:tc>
+        <w:tc>
+          <w:tcPr/>
+          <w:p>
+            <w:pPr>
+              <w:pStyle w:val="Compact"/>
+              <w:jc w:val="left"/>
+            </w:pPr>
+            <w:r>
+              <w:t xml:space="preserve">人物小传、策划案、全部集纲、全部剧本</w:t>
+            </w:r>
+          </w:p>
+        </w:tc>
+      </w:tr>
+      <w:tr>
+        <w:tc>
+          <w:tcPr/>
+          <w:p>
+            <w:pPr>
+              <w:pStyle w:val="Compact"/>
+              <w:jc w:val="left"/>
+            </w:pPr>
+            <w:r>
+              <w:t xml:space="preserve">人物小传 / 策划案</w:t>
+            </w:r>
+          </w:p>
+        </w:tc>
+        <w:tc>
+          <w:tcPr/>
+          <w:p>
+            <w:pPr>
+              <w:pStyle w:val="Compact"/>
+              <w:jc w:val="left"/>
+            </w:pPr>
+            <w:r>
+              <w:t xml:space="preserve">全部集纲、全部剧本</w:t>
+            </w:r>
+          </w:p>
+        </w:tc>
+      </w:tr>
+      <w:tr>
+        <w:tc>
+          <w:tcPr/>
+          <w:p>
+            <w:pPr>
+              <w:pStyle w:val="Compact"/>
+              <w:jc w:val="left"/>
+            </w:pPr>
+            <w:r>
+              <w:t xml:space="preserve">集纲第 N 集</w:t>
+            </w:r>
+          </w:p>
+        </w:tc>
+        <w:tc>
+          <w:tcPr/>
+          <w:p>
+            <w:pPr>
+              <w:pStyle w:val="Compact"/>
+              <w:jc w:val="left"/>
+            </w:pPr>
+            <w:r>
+              <w:t xml:space="preserve">对应的剧本第 N 集</w:t>
+            </w:r>
+          </w:p>
+        </w:tc>
+      </w:tr>
+      <w:tr>
+        <w:tc>
+          <w:tcPr/>
+          <w:p>
+            <w:pPr>
+              <w:pStyle w:val="Compact"/>
+              <w:jc w:val="left"/>
+            </w:pPr>
+            <w:r>
+              <w:t xml:space="preserve">剧本第 N 集</w:t>
+            </w:r>
+          </w:p>
+        </w:tc>
+        <w:tc>
+          <w:tcPr/>
+          <w:p>
+            <w:pPr>
+              <w:pStyle w:val="Compact"/>
+              <w:jc w:val="left"/>
+            </w:pPr>
+            <w:r>
+              <w:t xml:space="preserve">无，直接重写</w:t>
+            </w:r>
+          </w:p>
+        </w:tc>
+      </w:tr>
+    </w:tbl>
+    <w:p>
+      <w:pPr>
+        <w:pStyle w:val="BodyText"/>
+      </w:pPr>
+      <w:r>
+        <w:rPr>
+          <w:bCs/>
+          <w:b/>
+        </w:rPr>
+        <w:t xml:space="preserve">规则</w:t>
+      </w:r>
+      <w:r>
+        <w:t xml:space="preserve">：点击有下游的区块的「重写」，弹窗顶部出现黄色提示</w:t>
+      </w:r>
+      <w:r>
+        <w:t xml:space="preserve"> </w:t>
+      </w:r>
+      <w:r>
+        <w:rPr>
+          <w:bCs/>
+          <w:b/>
+        </w:rPr>
+        <w:t xml:space="preserve">「⚠ 可能会影响其他部分」</w:t>
+      </w:r>
+      <w:r>
+        <w:t xml:space="preserve">，列出受影响的下游区块（标签）与数量，并询问是否连同下游一起重写。三个按钮：</w:t>
+      </w:r>
+    </w:p>
+    <w:p>
+      <w:pPr>
+        <w:numPr>
+          <w:ilvl w:val="0"/>
+          <w:numId w:val="1009"/>
+        </w:numPr>
+        <w:pStyle w:val="Compact"/>
+      </w:pPr>
+      <w:r>
+        <w:rPr>
+          <w:bCs/>
+          <w:b/>
+        </w:rPr>
+        <w:t xml:space="preserve">取消</w:t>
+      </w:r>
+      <w:r>
+        <w:t xml:space="preserve">：不做任何事；</w:t>
+      </w:r>
+    </w:p>
+    <w:p>
+      <w:pPr>
+        <w:numPr>
+          <w:ilvl w:val="0"/>
+          <w:numId w:val="1009"/>
+        </w:numPr>
+        <w:pStyle w:val="Compact"/>
+      </w:pPr>
+      <w:r>
+        <w:rPr>
+          <w:bCs/>
+          <w:b/>
+        </w:rPr>
+        <w:t xml:space="preserve">只重写本区块</w:t>
+      </w:r>
+      <w:r>
+        <w:t xml:space="preserve">：仅重写当前区块；受影响的下游区块标题下出现黄色提示</w:t>
+      </w:r>
+      <w:r>
+        <w:t xml:space="preserve"> </w:t>
+      </w:r>
+      <w:r>
+        <w:rPr>
+          <w:bCs/>
+          <w:b/>
+        </w:rPr>
+        <w:t xml:space="preserve">「⚠ 上游内容已改动，本区块可能需要同步　[去重写]」</w:t>
+      </w:r>
+      <w:r>
+        <w:t xml:space="preserve">，左侧不强制处理；</w:t>
+      </w:r>
+    </w:p>
+    <w:p>
+      <w:pPr>
+        <w:numPr>
+          <w:ilvl w:val="0"/>
+          <w:numId w:val="1009"/>
+        </w:numPr>
+        <w:pStyle w:val="Compact"/>
+      </w:pPr>
+      <w:r>
+        <w:rPr>
+          <w:bCs/>
+          <w:b/>
+        </w:rPr>
+        <w:t xml:space="preserve">全部重写（共 N 处）</w:t>
+      </w:r>
+      <w:r>
+        <w:t xml:space="preserve">：依次重写当前区块 + 全部下游（进度 toast「正在同步重写 k/N…」），完成后 toast「已全部重写，共 N 处」；下游旧报告与标红一并清除。</w:t>
+      </w:r>
+    </w:p>
+    <w:p>
+      <w:pPr>
+        <w:pStyle w:val="FirstParagraph"/>
+      </w:pPr>
+      <w:r>
+        <w:t xml:space="preserve">没有下游的区块（如剧本单集）弹窗里不出现提示，按钮为「取消 / 开始重写」。「补充要求」输入框对所有被重写的区块生效。</w:t>
+      </w:r>
+    </w:p>
+    <w:p>
+      <w:pPr>
+        <w:pStyle w:val="CaptionedFigure"/>
+      </w:pPr>
+      <w:r>
+        <w:drawing>
+          <wp:inline>
+            <wp:extent cx="5334000" cy="3200400"/>
+            <wp:effectExtent b="0" l="0" r="0" t="0"/>
+            <wp:docPr descr="人物小传重写：提示会影响下游" title="" id="71" name="Picture"/>
+            <a:graphic>
+              <a:graphicData uri="http://schemas.openxmlformats.org/drawingml/2006/picture">
+                <pic:pic>
+                  <pic:nvPicPr>
+                    <pic:cNvPr descr="wd-img/x03-cascade-dlg.jpg" id="72" name="Picture"/>
+                    <pic:cNvPicPr>
+                      <a:picLocks noChangeArrowheads="1" noChangeAspect="1"/>
+                    </pic:cNvPicPr>
+                  </pic:nvPicPr>
+                  <pic:blipFill>
+                    <a:blip r:embed="rId70"/>
+                    <a:stretch>
+                      <a:fillRect/>
+                    </a:stretch>
+                  </pic:blipFill>
+                  <pic:spPr bwMode="auto">
+                    <a:xfrm>
+                      <a:off x="0" y="0"/>
+                      <a:ext cx="5334000" cy="3200400"/>
+                    </a:xfrm>
+                    <a:prstGeom prst="rect">
+                      <a:avLst/>
+                    </a:prstGeom>
+                    <a:noFill/>
+                    <a:ln w="9525">
+                      <a:noFill/>
+                      <a:headEnd/>
+                      <a:tailEnd/>
+                    </a:ln>
+                  </pic:spPr>
+                </pic:pic>
+              </a:graphicData>
+            </a:graphic>
+          </wp:inline>
+        </w:drawing>
+      </w:r>
+    </w:p>
+    <w:p>
+      <w:pPr>
+        <w:pStyle w:val="ImageCaption"/>
+      </w:pPr>
+      <w:r>
+        <w:t xml:space="preserve">人物小传重写：提示会影响下游</w:t>
+      </w:r>
+    </w:p>
+    <w:p>
+      <w:pPr>
+        <w:pStyle w:val="CaptionedFigure"/>
+      </w:pPr>
+      <w:r>
+        <w:drawing>
+          <wp:inline>
+            <wp:extent cx="5334000" cy="3200400"/>
+            <wp:effectExtent b="0" l="0" r="0" t="0"/>
+            <wp:docPr descr="只重写本区块后，集纲各集出现「上游已改动」提示" title="" id="74" name="Picture"/>
+            <a:graphic>
+              <a:graphicData uri="http://schemas.openxmlformats.org/drawingml/2006/picture">
+                <pic:pic>
+                  <pic:nvPicPr>
+                    <pic:cNvPr descr="wd-img/x05-stale-outline.jpg" id="75" name="Picture"/>
+                    <pic:cNvPicPr>
+                      <a:picLocks noChangeArrowheads="1" noChangeAspect="1"/>
+                    </pic:cNvPicPr>
+                  </pic:nvPicPr>
+                  <pic:blipFill>
+                    <a:blip r:embed="rId73"/>
+                    <a:stretch>
+                      <a:fillRect/>
+                    </a:stretch>
+                  </pic:blipFill>
+                  <pic:spPr bwMode="auto">
+                    <a:xfrm>
+                      <a:off x="0" y="0"/>
+                      <a:ext cx="5334000" cy="3200400"/>
+                    </a:xfrm>
+                    <a:prstGeom prst="rect">
+                      <a:avLst/>
+                    </a:prstGeom>
+                    <a:noFill/>
+                    <a:ln w="9525">
+                      <a:noFill/>
+                      <a:headEnd/>
+                      <a:tailEnd/>
+                    </a:ln>
+                  </pic:spPr>
+                </pic:pic>
+              </a:graphicData>
+            </a:graphic>
+          </wp:inline>
+        </w:drawing>
+      </w:r>
+    </w:p>
+    <w:p>
+      <w:pPr>
+        <w:pStyle w:val="ImageCaption"/>
+      </w:pPr>
+      <w:r>
+        <w:t xml:space="preserve">只重写本区块后，集纲各集出现「上游已改动」提示</w:t>
+      </w:r>
+    </w:p>
+    <w:p>
+      <w:pPr>
+        <w:pStyle w:val="CaptionedFigure"/>
+      </w:pPr>
+      <w:r>
+        <w:drawing>
+          <wp:inline>
+            <wp:extent cx="5334000" cy="3200400"/>
+            <wp:effectExtent b="0" l="0" r="0" t="0"/>
+            <wp:docPr descr="集纲单集重写：影响对应剧本 EP01" title="" id="77" name="Picture"/>
+            <a:graphic>
+              <a:graphicData uri="http://schemas.openxmlformats.org/drawingml/2006/picture">
+                <pic:pic>
+                  <pic:nvPicPr>
+                    <pic:cNvPr descr="wd-img/x06-ol-dlg.jpg" id="78" name="Picture"/>
+                    <pic:cNvPicPr>
+                      <a:picLocks noChangeArrowheads="1" noChangeAspect="1"/>
+                    </pic:cNvPicPr>
+                  </pic:nvPicPr>
+                  <pic:blipFill>
+                    <a:blip r:embed="rId76"/>
+                    <a:stretch>
+                      <a:fillRect/>
+                    </a:stretch>
+                  </pic:blipFill>
+                  <pic:spPr bwMode="auto">
+                    <a:xfrm>
+                      <a:off x="0" y="0"/>
+                      <a:ext cx="5334000" cy="3200400"/>
+                    </a:xfrm>
+                    <a:prstGeom prst="rect">
+                      <a:avLst/>
+                    </a:prstGeom>
+                    <a:noFill/>
+                    <a:ln w="9525">
+                      <a:noFill/>
+                      <a:headEnd/>
+                      <a:tailEnd/>
+                    </a:ln>
+                  </pic:spPr>
+                </pic:pic>
+              </a:graphicData>
+            </a:graphic>
+          </wp:inline>
+        </w:drawing>
+      </w:r>
+    </w:p>
+    <w:p>
+      <w:pPr>
+        <w:pStyle w:val="ImageCaption"/>
+      </w:pPr>
+      <w:r>
         <w:t xml:space="preserve">集纲单集重写：影响对应剧本 EP01</w:t>
       </w:r>
     </w:p>
-    <w:bookmarkEnd w:id="66"/>
-    <w:bookmarkEnd w:id="67"/>
-    <w:bookmarkStart w:id="84" w:name="ai-助手非全屏自动收起-机器人图标"/>
+    <w:bookmarkEnd w:id="79"/>
+    <w:bookmarkEnd w:id="80"/>
+    <w:bookmarkStart w:id="97" w:name="ai-助手非全屏自动收起-机器人图标"/>
     <w:p>
       <w:pPr>
         <w:pStyle w:val="Heading1"/>
@@ -2467,7 +2853,7 @@
         <w:t xml:space="preserve">4. AI 助手：非全屏自动收起 + 机器人图标</w:t>
       </w:r>
     </w:p>
-    <w:bookmarkStart w:id="71" w:name="响应规则"/>
+    <w:bookmarkStart w:id="84" w:name="响应规则"/>
     <w:p>
       <w:pPr>
         <w:pStyle w:val="Heading2"/>
@@ -2622,18 +3008,18 @@
           <wp:inline>
             <wp:extent cx="5334000" cy="3879272"/>
             <wp:effectExtent b="0" l="0" r="0" t="0"/>
-            <wp:docPr descr="窄屏：AI 助手自动隐藏，右下角浮动机器人" title="" id="69" name="Picture"/>
+            <wp:docPr descr="窄屏：AI 助手自动隐藏，右下角浮动机器人" title="" id="82" name="Picture"/>
             <a:graphic>
               <a:graphicData uri="http://schemas.openxmlformats.org/drawingml/2006/picture">
                 <pic:pic>
                   <pic:nvPicPr>
-                    <pic:cNvPr descr="wd-img/w13-narrow-hidden.jpg" id="70" name="Picture"/>
+                    <pic:cNvPr descr="wd-img/w13-narrow-hidden.jpg" id="83" name="Picture"/>
                     <pic:cNvPicPr>
                       <a:picLocks noChangeArrowheads="1" noChangeAspect="1"/>
                     </pic:cNvPicPr>
                   </pic:nvPicPr>
                   <pic:blipFill>
-                    <a:blip r:embed="rId68"/>
+                    <a:blip r:embed="rId81"/>
                     <a:stretch>
                       <a:fillRect/>
                     </a:stretch>
@@ -2668,8 +3054,8 @@
         <w:t xml:space="preserve">窄屏：AI 助手自动隐藏，右下角浮动机器人</w:t>
       </w:r>
     </w:p>
-    <w:bookmarkEnd w:id="71"/>
-    <w:bookmarkStart w:id="78" w:name="机器人图标"/>
+    <w:bookmarkEnd w:id="84"/>
+    <w:bookmarkStart w:id="91" w:name="机器人图标"/>
     <w:p>
       <w:pPr>
         <w:pStyle w:val="Heading2"/>
@@ -2682,7 +3068,7 @@
       <w:pPr>
         <w:numPr>
           <w:ilvl w:val="0"/>
-          <w:numId w:val="1008"/>
+          <w:numId w:val="1010"/>
         </w:numPr>
         <w:pStyle w:val="Compact"/>
       </w:pPr>
@@ -2704,7 +3090,7 @@
       <w:pPr>
         <w:numPr>
           <w:ilvl w:val="0"/>
-          <w:numId w:val="1008"/>
+          <w:numId w:val="1010"/>
         </w:numPr>
         <w:pStyle w:val="Compact"/>
       </w:pPr>
@@ -2716,7 +3102,7 @@
       <w:pPr>
         <w:numPr>
           <w:ilvl w:val="0"/>
-          <w:numId w:val="1008"/>
+          <w:numId w:val="1010"/>
         </w:numPr>
         <w:pStyle w:val="Compact"/>
       </w:pPr>
@@ -2735,7 +3121,7 @@
       <w:pPr>
         <w:numPr>
           <w:ilvl w:val="0"/>
-          <w:numId w:val="1008"/>
+          <w:numId w:val="1010"/>
         </w:numPr>
         <w:pStyle w:val="Compact"/>
       </w:pPr>
@@ -2752,18 +3138,18 @@
           <wp:inline>
             <wp:extent cx="5334000" cy="3879272"/>
             <wp:effectExtent b="0" l="0" r="0" t="0"/>
-            <wp:docPr descr="悬停显示「AI助手」" title="" id="73" name="Picture"/>
+            <wp:docPr descr="悬停显示「AI助手」" title="" id="86" name="Picture"/>
             <a:graphic>
               <a:graphicData uri="http://schemas.openxmlformats.org/drawingml/2006/picture">
                 <pic:pic>
                   <pic:nvPicPr>
-                    <pic:cNvPr descr="wd-img/w14-robot-tip.jpg" id="74" name="Picture"/>
+                    <pic:cNvPr descr="wd-img/w14-robot-tip.jpg" id="87" name="Picture"/>
                     <pic:cNvPicPr>
                       <a:picLocks noChangeArrowheads="1" noChangeAspect="1"/>
                     </pic:cNvPicPr>
                   </pic:nvPicPr>
                   <pic:blipFill>
-                    <a:blip r:embed="rId72"/>
+                    <a:blip r:embed="rId85"/>
                     <a:stretch>
                       <a:fillRect/>
                     </a:stretch>
@@ -2807,18 +3193,18 @@
           <wp:inline>
             <wp:extent cx="5334000" cy="3879272"/>
             <wp:effectExtent b="0" l="0" r="0" t="0"/>
-            <wp:docPr descr="点击后右侧滑出 AI 助手" title="" id="76" name="Picture"/>
+            <wp:docPr descr="点击后右侧滑出 AI 助手" title="" id="89" name="Picture"/>
             <a:graphic>
               <a:graphicData uri="http://schemas.openxmlformats.org/drawingml/2006/picture">
                 <pic:pic>
                   <pic:nvPicPr>
-                    <pic:cNvPr descr="wd-img/w15-narrow-open.jpg" id="77" name="Picture"/>
+                    <pic:cNvPr descr="wd-img/w15-narrow-open.jpg" id="90" name="Picture"/>
                     <pic:cNvPicPr>
                       <a:picLocks noChangeArrowheads="1" noChangeAspect="1"/>
                     </pic:cNvPicPr>
                   </pic:nvPicPr>
                   <pic:blipFill>
-                    <a:blip r:embed="rId75"/>
+                    <a:blip r:embed="rId88"/>
                     <a:stretch>
                       <a:fillRect/>
                     </a:stretch>
@@ -2853,8 +3239,8 @@
         <w:t xml:space="preserve">点击后右侧滑出 AI 助手</w:t>
       </w:r>
     </w:p>
-    <w:bookmarkEnd w:id="78"/>
-    <w:bookmarkStart w:id="79" w:name="ai-助手与评估报告互不相干"/>
+    <w:bookmarkEnd w:id="91"/>
+    <w:bookmarkStart w:id="92" w:name="ai-助手与评估报告互不相干"/>
     <w:p>
       <w:pPr>
         <w:pStyle w:val="Heading2"/>
@@ -2881,8 +3267,8 @@
         <w:t xml:space="preserve">；侧栏只承载对话（页签仅「AI 助手」），输入框下方「作用于：当前阶段」。</w:t>
       </w:r>
     </w:p>
-    <w:bookmarkEnd w:id="79"/>
-    <w:bookmarkStart w:id="83" w:name="侧栏宽度可调整新增"/>
+    <w:bookmarkEnd w:id="92"/>
+    <w:bookmarkStart w:id="96" w:name="侧栏宽度可调整新增"/>
     <w:p>
       <w:pPr>
         <w:pStyle w:val="Heading2"/>
@@ -2895,7 +3281,7 @@
       <w:pPr>
         <w:numPr>
           <w:ilvl w:val="0"/>
-          <w:numId w:val="1009"/>
+          <w:numId w:val="1011"/>
         </w:numPr>
         <w:pStyle w:val="Compact"/>
       </w:pPr>
@@ -2907,7 +3293,7 @@
       <w:pPr>
         <w:numPr>
           <w:ilvl w:val="0"/>
-          <w:numId w:val="1009"/>
+          <w:numId w:val="1011"/>
         </w:numPr>
         <w:pStyle w:val="Compact"/>
       </w:pPr>
@@ -2932,7 +3318,7 @@
       <w:pPr>
         <w:numPr>
           <w:ilvl w:val="0"/>
-          <w:numId w:val="1009"/>
+          <w:numId w:val="1011"/>
         </w:numPr>
         <w:pStyle w:val="Compact"/>
       </w:pPr>
@@ -2951,7 +3337,7 @@
       <w:pPr>
         <w:numPr>
           <w:ilvl w:val="0"/>
-          <w:numId w:val="1009"/>
+          <w:numId w:val="1011"/>
         </w:numPr>
         <w:pStyle w:val="Compact"/>
       </w:pPr>
@@ -2963,7 +3349,7 @@
       <w:pPr>
         <w:numPr>
           <w:ilvl w:val="0"/>
-          <w:numId w:val="1009"/>
+          <w:numId w:val="1011"/>
         </w:numPr>
         <w:pStyle w:val="Compact"/>
       </w:pPr>
@@ -2980,18 +3366,18 @@
           <wp:inline>
             <wp:extent cx="5334000" cy="3200400"/>
             <wp:effectExtent b="0" l="0" r="0" t="0"/>
-            <wp:docPr descr="拖宽后的 AI 助手侧栏" title="" id="81" name="Picture"/>
+            <wp:docPr descr="拖宽后的 AI 助手侧栏" title="" id="94" name="Picture"/>
             <a:graphic>
               <a:graphicData uri="http://schemas.openxmlformats.org/drawingml/2006/picture">
                 <pic:pic>
                   <pic:nvPicPr>
-                    <pic:cNvPr descr="wd-img/x07-resized.jpg" id="82" name="Picture"/>
+                    <pic:cNvPr descr="wd-img/x07-resized.jpg" id="95" name="Picture"/>
                     <pic:cNvPicPr>
                       <a:picLocks noChangeArrowheads="1" noChangeAspect="1"/>
                     </pic:cNvPicPr>
                   </pic:nvPicPr>
                   <pic:blipFill>
-                    <a:blip r:embed="rId80"/>
+                    <a:blip r:embed="rId93"/>
                     <a:stretch>
                       <a:fillRect/>
                     </a:stretch>
@@ -3026,9 +3412,9 @@
         <w:t xml:space="preserve">拖宽后的 AI 助手侧栏</w:t>
       </w:r>
     </w:p>
-    <w:bookmarkEnd w:id="83"/>
-    <w:bookmarkEnd w:id="84"/>
-    <w:bookmarkStart w:id="85" w:name="验收要点"/>
+    <w:bookmarkEnd w:id="96"/>
+    <w:bookmarkEnd w:id="97"/>
+    <w:bookmarkStart w:id="98" w:name="验收要点"/>
     <w:p>
       <w:pPr>
         <w:pStyle w:val="Heading1"/>
@@ -3041,7 +3427,7 @@
       <w:pPr>
         <w:numPr>
           <w:ilvl w:val="0"/>
-          <w:numId w:val="1010"/>
+          <w:numId w:val="1012"/>
         </w:numPr>
         <w:pStyle w:val="Compact"/>
       </w:pPr>
@@ -3053,7 +3439,7 @@
       <w:pPr>
         <w:numPr>
           <w:ilvl w:val="0"/>
-          <w:numId w:val="1010"/>
+          <w:numId w:val="1012"/>
         </w:numPr>
         <w:pStyle w:val="Compact"/>
       </w:pPr>
@@ -3065,19 +3451,19 @@
       <w:pPr>
         <w:numPr>
           <w:ilvl w:val="0"/>
-          <w:numId w:val="1010"/>
-        </w:numPr>
-        <w:pStyle w:val="Compact"/>
-      </w:pPr>
-      <w:r>
-        <w:t xml:space="preserve">重写默认只影响当前区块，可撤销，重写后旧报告清除；有下游的区块重写前弹出「可能会影响其他部分」，可选只重写本区块或全部重写。</w:t>
+          <w:numId w:val="1012"/>
+        </w:numPr>
+        <w:pStyle w:val="Compact"/>
+      </w:pPr>
+      <w:r>
+        <w:t xml:space="preserve">重写默认只影响当前区块；重写后自动展示前后对比，可随时「回退到原版本」/「恢复重写版」，重写后旧报告清除；有下游的区块重写前弹出「可能会影响其他部分」，可选只重写本区块或全部重写。</w:t>
       </w:r>
     </w:p>
     <w:p>
       <w:pPr>
         <w:numPr>
           <w:ilvl w:val="0"/>
-          <w:numId w:val="1010"/>
+          <w:numId w:val="1012"/>
         </w:numPr>
         <w:pStyle w:val="Compact"/>
       </w:pPr>
@@ -3089,7 +3475,7 @@
       <w:pPr>
         <w:numPr>
           <w:ilvl w:val="0"/>
-          <w:numId w:val="1010"/>
+          <w:numId w:val="1012"/>
         </w:numPr>
         <w:pStyle w:val="Compact"/>
       </w:pPr>
@@ -3101,7 +3487,7 @@
       <w:pPr>
         <w:numPr>
           <w:ilvl w:val="0"/>
-          <w:numId w:val="1010"/>
+          <w:numId w:val="1012"/>
         </w:numPr>
         <w:pStyle w:val="Compact"/>
       </w:pPr>
@@ -3109,8 +3495,8 @@
         <w:t xml:space="preserve">状态表达不只靠颜色（有 ✓ ! ✕ 与文字）。</w:t>
       </w:r>
     </w:p>
-    <w:bookmarkEnd w:id="85"/>
-    <w:bookmarkStart w:id="86" w:name="附录demo-使用"/>
+    <w:bookmarkEnd w:id="98"/>
+    <w:bookmarkStart w:id="99" w:name="附录demo-使用"/>
     <w:p>
       <w:pPr>
         <w:pStyle w:val="Heading1"/>
@@ -3123,7 +3509,7 @@
       <w:pPr>
         <w:numPr>
           <w:ilvl w:val="0"/>
-          <w:numId w:val="1011"/>
+          <w:numId w:val="1013"/>
         </w:numPr>
         <w:pStyle w:val="Compact"/>
       </w:pPr>
@@ -3147,7 +3533,7 @@
       <w:pPr>
         <w:numPr>
           <w:ilvl w:val="0"/>
-          <w:numId w:val="1011"/>
+          <w:numId w:val="1013"/>
         </w:numPr>
         <w:pStyle w:val="Compact"/>
       </w:pPr>
@@ -3159,7 +3545,7 @@
       <w:pPr>
         <w:numPr>
           <w:ilvl w:val="0"/>
-          <w:numId w:val="1011"/>
+          <w:numId w:val="1013"/>
         </w:numPr>
         <w:pStyle w:val="Compact"/>
       </w:pPr>
@@ -3171,7 +3557,7 @@
       <w:pPr>
         <w:numPr>
           <w:ilvl w:val="0"/>
-          <w:numId w:val="1011"/>
+          <w:numId w:val="1013"/>
         </w:numPr>
         <w:pStyle w:val="Compact"/>
       </w:pPr>
@@ -3179,7 +3565,7 @@
         <w:t xml:space="preserve">把浏览器窗口缩到 1280px 以下，观察 AI 助手自动收起，点机器人图标呼出。</w:t>
       </w:r>
     </w:p>
-    <w:bookmarkEnd w:id="86"/>
+    <w:bookmarkEnd w:id="99"/>
     <w:sectPr/>
   </w:body>
 </w:document>
@@ -3559,6 +3945,12 @@
     <w:abstractNumId w:val="991"/>
   </w:num>
   <w:num w:numId="1010">
+    <w:abstractNumId w:val="991"/>
+  </w:num>
+  <w:num w:numId="1011">
+    <w:abstractNumId w:val="991"/>
+  </w:num>
+  <w:num w:numId="1012">
     <w:abstractNumId w:val="99411"/>
     <w:lvlOverride w:ilvl="0">
       <w:startOverride w:val="1"/>
@@ -3588,7 +3980,7 @@
       <w:startOverride w:val="1"/>
     </w:lvlOverride>
   </w:num>
-  <w:num w:numId="1011">
+  <w:num w:numId="1013">
     <w:abstractNumId w:val="99411"/>
     <w:lvlOverride w:ilvl="0">
       <w:startOverride w:val="1"/>

</xml_diff>